<commit_message>
update references FRIA v2.0
</commit_message>
<xml_diff>
--- a/AI & AI Act/FRIA assessment template V2.0.docx
+++ b/AI & AI Act/FRIA assessment template V2.0.docx
@@ -1,6 +1,6 @@
 
 <file path=word/document.xml><?xml version="1.0" encoding="utf-8"?>
-<w:document xmlns:wpc="http://schemas.microsoft.com/office/word/2010/wordprocessingCanvas" xmlns:cx="http://schemas.microsoft.com/office/drawing/2014/chartex" xmlns:cx1="http://schemas.microsoft.com/office/drawing/2015/9/8/chartex" xmlns:cx2="http://schemas.microsoft.com/office/drawing/2015/10/21/chartex" xmlns:cx3="http://schemas.microsoft.com/office/drawing/2016/5/9/chartex" xmlns:cx4="http://schemas.microsoft.com/office/drawing/2016/5/10/chartex" xmlns:cx5="http://schemas.microsoft.com/office/drawing/2016/5/11/chartex" xmlns:cx6="http://schemas.microsoft.com/office/drawing/2016/5/12/chartex" xmlns:cx7="http://schemas.microsoft.com/office/drawing/2016/5/13/chartex" xmlns:cx8="http://schemas.microsoft.com/office/drawing/2016/5/14/chartex" xmlns:mc="http://schemas.openxmlformats.org/markup-compatibility/2006" xmlns:aink="http://schemas.microsoft.com/office/drawing/2016/ink" xmlns:am3d="http://schemas.microsoft.com/office/drawing/2017/model3d" xmlns:o="urn:schemas-microsoft-com:office:office" xmlns:oel="http://schemas.microsoft.com/office/2019/extlst" xmlns:r="http://schemas.openxmlformats.org/officeDocument/2006/relationships" xmlns:m="http://schemas.openxmlformats.org/officeDocument/2006/math" xmlns:v="urn:schemas-microsoft-com:vml" xmlns:wp14="http://schemas.microsoft.com/office/word/2010/wordprocessingDrawing" xmlns:wp="http://schemas.openxmlformats.org/drawingml/2006/wordprocessingDrawing" xmlns:w10="urn:schemas-microsoft-com:office:word" xmlns:w="http://schemas.openxmlformats.org/wordprocessingml/2006/main" xmlns:w14="http://schemas.microsoft.com/office/word/2010/wordml" xmlns:w15="http://schemas.microsoft.com/office/word/2012/wordml" xmlns:w16cex="http://schemas.microsoft.com/office/word/2018/wordml/cex" xmlns:w16cid="http://schemas.microsoft.com/office/word/2016/wordml/cid" xmlns:w16="http://schemas.microsoft.com/office/word/2018/wordml" xmlns:w16sdtdh="http://schemas.microsoft.com/office/word/2020/wordml/sdtdatahash" xmlns:w16se="http://schemas.microsoft.com/office/word/2015/wordml/symex" xmlns:wpg="http://schemas.microsoft.com/office/word/2010/wordprocessingGroup" xmlns:wpi="http://schemas.microsoft.com/office/word/2010/wordprocessingInk" xmlns:wne="http://schemas.microsoft.com/office/word/2006/wordml" xmlns:wps="http://schemas.microsoft.com/office/word/2010/wordprocessingShape" mc:Ignorable="w14 w15 w16se w16cid w16 w16cex w16sdtdh wp14">
+<w:document xmlns:wpc="http://schemas.microsoft.com/office/word/2010/wordprocessingCanvas" xmlns:cx="http://schemas.microsoft.com/office/drawing/2014/chartex" xmlns:cx1="http://schemas.microsoft.com/office/drawing/2015/9/8/chartex" xmlns:cx2="http://schemas.microsoft.com/office/drawing/2015/10/21/chartex" xmlns:cx3="http://schemas.microsoft.com/office/drawing/2016/5/9/chartex" xmlns:cx4="http://schemas.microsoft.com/office/drawing/2016/5/10/chartex" xmlns:cx5="http://schemas.microsoft.com/office/drawing/2016/5/11/chartex" xmlns:cx6="http://schemas.microsoft.com/office/drawing/2016/5/12/chartex" xmlns:cx7="http://schemas.microsoft.com/office/drawing/2016/5/13/chartex" xmlns:cx8="http://schemas.microsoft.com/office/drawing/2016/5/14/chartex" xmlns:mc="http://schemas.openxmlformats.org/markup-compatibility/2006" xmlns:aink="http://schemas.microsoft.com/office/drawing/2016/ink" xmlns:am3d="http://schemas.microsoft.com/office/drawing/2017/model3d" xmlns:o="urn:schemas-microsoft-com:office:office" xmlns:oel="http://schemas.microsoft.com/office/2019/extlst" xmlns:r="http://schemas.openxmlformats.org/officeDocument/2006/relationships" xmlns:m="http://schemas.openxmlformats.org/officeDocument/2006/math" xmlns:v="urn:schemas-microsoft-com:vml" xmlns:wp14="http://schemas.microsoft.com/office/word/2010/wordprocessingDrawing" xmlns:wp="http://schemas.openxmlformats.org/drawingml/2006/wordprocessingDrawing" xmlns:w10="urn:schemas-microsoft-com:office:word" xmlns:w="http://schemas.openxmlformats.org/wordprocessingml/2006/main" xmlns:w14="http://schemas.microsoft.com/office/word/2010/wordml" xmlns:w15="http://schemas.microsoft.com/office/word/2012/wordml" xmlns:w16cex="http://schemas.microsoft.com/office/word/2018/wordml/cex" xmlns:w16cid="http://schemas.microsoft.com/office/word/2016/wordml/cid" xmlns:w16="http://schemas.microsoft.com/office/word/2018/wordml" xmlns:w16du="http://schemas.microsoft.com/office/word/2023/wordml/word16du" xmlns:w16sdtdh="http://schemas.microsoft.com/office/word/2020/wordml/sdtdatahash" xmlns:w16sdtfl="http://schemas.microsoft.com/office/word/2024/wordml/sdtformatlock" xmlns:w16se="http://schemas.microsoft.com/office/word/2015/wordml/symex" xmlns:wpg="http://schemas.microsoft.com/office/word/2010/wordprocessingGroup" xmlns:wpi="http://schemas.microsoft.com/office/word/2010/wordprocessingInk" xmlns:wne="http://schemas.microsoft.com/office/word/2006/wordml" xmlns:wps="http://schemas.microsoft.com/office/word/2010/wordprocessingShape" mc:Ignorable="w14 w15 w16se w16cid w16 w16cex w16sdtdh w16sdtfl w16du wp14">
   <w:body>
     <w:p>
       <w:pPr>
@@ -48,28 +48,13 @@
     <w:p/>
     <w:p>
       <w:r>
-        <w:t xml:space="preserve">Sieuwert van </w:t>
-      </w:r>
-      <w:proofErr w:type="spellStart"/>
-      <w:r>
-        <w:t>Otterlo</w:t>
-      </w:r>
-      <w:proofErr w:type="spellEnd"/>
-    </w:p>
-    <w:p>
-      <w:proofErr w:type="spellStart"/>
-      <w:r>
-        <w:t>Pavlo</w:t>
-      </w:r>
-      <w:proofErr w:type="spellEnd"/>
-      <w:r>
-        <w:t xml:space="preserve"> </w:t>
-      </w:r>
-      <w:proofErr w:type="spellStart"/>
-      <w:r>
-        <w:t>Burda</w:t>
-      </w:r>
-      <w:proofErr w:type="spellEnd"/>
+        <w:t>Sieuwert van Otterlo</w:t>
+      </w:r>
+    </w:p>
+    <w:p>
+      <w:r>
+        <w:t>Pavlo Burda</w:t>
+      </w:r>
     </w:p>
     <w:p>
       <w:pPr>
@@ -376,7 +361,21 @@
             <w:rStyle w:val="Hyperlink"/>
             <w:rFonts w:ascii="Calibri" w:hAnsi="Calibri"/>
           </w:rPr>
-          <w:t>https://www.government.nl/documents/reports/2021/07/31/impact-assessment-fundamental-rights-and-algorithms</w:t>
+          <w:t>https://www.government.nl/documents/reports/2021/07/31/impact-assessment-fundamental-rights-</w:t>
+        </w:r>
+        <w:r>
+          <w:rPr>
+            <w:rStyle w:val="Hyperlink"/>
+            <w:rFonts w:ascii="Calibri" w:hAnsi="Calibri"/>
+          </w:rPr>
+          <w:t>a</w:t>
+        </w:r>
+        <w:r>
+          <w:rPr>
+            <w:rStyle w:val="Hyperlink"/>
+            <w:rFonts w:ascii="Calibri" w:hAnsi="Calibri"/>
+          </w:rPr>
+          <w:t>nd-algorithms</w:t>
         </w:r>
       </w:hyperlink>
     </w:p>
@@ -395,6 +394,33 @@
         <w:rPr>
           <w:rFonts w:ascii="Calibri" w:hAnsi="Calibri"/>
         </w:rPr>
+        <w:t xml:space="preserve">IAMA v2 2026 - </w:t>
+      </w:r>
+      <w:hyperlink r:id="rId11" w:history="1">
+        <w:r>
+          <w:rPr>
+            <w:rStyle w:val="Hyperlink"/>
+            <w:rFonts w:ascii="Calibri" w:hAnsi="Calibri"/>
+          </w:rPr>
+          <w:t>https://www.rijksoverheid.nl/documenten/rapporten/2026/02/16/impact-assessment-mensenrechten-en-algoritmes</w:t>
+        </w:r>
+      </w:hyperlink>
+    </w:p>
+    <w:p>
+      <w:pPr>
+        <w:pStyle w:val="ListParagraph"/>
+        <w:numPr>
+          <w:ilvl w:val="0"/>
+          <w:numId w:val="21"/>
+        </w:numPr>
+        <w:rPr>
+          <w:rFonts w:ascii="Calibri" w:hAnsi="Calibri"/>
+        </w:rPr>
+      </w:pPr>
+      <w:r>
+        <w:rPr>
+          <w:rFonts w:ascii="Calibri" w:hAnsi="Calibri"/>
+        </w:rPr>
         <w:t>EU High-Level Expert Group on AI: Ethics Guidelines for Trustworthy AI (2019)</w:t>
       </w:r>
       <w:r>
@@ -403,7 +429,7 @@
         </w:rPr>
         <w:t xml:space="preserve"> - </w:t>
       </w:r>
-      <w:hyperlink r:id="rId11" w:history="1">
+      <w:hyperlink r:id="rId12" w:history="1">
         <w:r>
           <w:rPr>
             <w:rStyle w:val="Hyperlink"/>
@@ -415,7 +441,7 @@
       <w:r>
         <w:t xml:space="preserve"> - </w:t>
       </w:r>
-      <w:hyperlink r:id="rId12" w:history="1">
+      <w:hyperlink r:id="rId13" w:history="1">
         <w:r>
           <w:rPr>
             <w:rStyle w:val="Hyperlink"/>
@@ -494,7 +520,7 @@
         </w:rPr>
         <w:t>(</w:t>
       </w:r>
-      <w:hyperlink r:id="rId13" w:history="1">
+      <w:hyperlink r:id="rId14" w:history="1">
         <w:r>
           <w:rPr>
             <w:rStyle w:val="Hyperlink"/>
@@ -540,21 +566,7 @@
         <w:rPr>
           <w:rFonts w:ascii="Calibri" w:hAnsi="Calibri"/>
         </w:rPr>
-        <w:t xml:space="preserve">P. </w:t>
-      </w:r>
-      <w:proofErr w:type="spellStart"/>
-      <w:r>
-        <w:rPr>
-          <w:rFonts w:ascii="Calibri" w:hAnsi="Calibri"/>
-        </w:rPr>
-        <w:t>Burda</w:t>
-      </w:r>
-      <w:proofErr w:type="spellEnd"/>
-      <w:r>
-        <w:rPr>
-          <w:rFonts w:ascii="Calibri" w:hAnsi="Calibri"/>
-        </w:rPr>
-        <w:t xml:space="preserve"> and S. van Otterloo, </w:t>
+        <w:t xml:space="preserve">P. Burda and S. van Otterloo, </w:t>
       </w:r>
       <w:r>
         <w:rPr>
@@ -568,7 +580,7 @@
         </w:rPr>
         <w:t xml:space="preserve">, CRSJ, 2025 - </w:t>
       </w:r>
-      <w:hyperlink r:id="rId14" w:history="1">
+      <w:hyperlink r:id="rId15" w:history="1">
         <w:r>
           <w:rPr>
             <w:rStyle w:val="Hyperlink"/>
@@ -619,7 +631,7 @@
         </w:rPr>
         <w:t xml:space="preserve">- </w:t>
       </w:r>
-      <w:hyperlink r:id="rId15" w:history="1">
+      <w:hyperlink r:id="rId16" w:history="1">
         <w:r>
           <w:rPr>
             <w:rStyle w:val="Hyperlink"/>
@@ -646,7 +658,6 @@
         </w:rPr>
         <w:t xml:space="preserve">Fairness in </w:t>
       </w:r>
-      <w:proofErr w:type="gramStart"/>
       <w:r>
         <w:rPr>
           <w:rFonts w:asciiTheme="majorHAnsi" w:hAnsiTheme="majorHAnsi" w:cstheme="majorHAnsi"/>
@@ -657,16 +668,9 @@
         <w:rPr>
           <w:rFonts w:asciiTheme="majorHAnsi" w:hAnsiTheme="majorHAnsi" w:cstheme="majorHAnsi"/>
         </w:rPr>
-        <w:t xml:space="preserve"> -</w:t>
-      </w:r>
-      <w:proofErr w:type="gramEnd"/>
-      <w:r>
-        <w:rPr>
-          <w:rFonts w:asciiTheme="majorHAnsi" w:hAnsiTheme="majorHAnsi" w:cstheme="majorHAnsi"/>
-        </w:rPr>
-        <w:t xml:space="preserve"> </w:t>
-      </w:r>
-      <w:hyperlink r:id="rId16" w:history="1">
+        <w:t xml:space="preserve"> - </w:t>
+      </w:r>
+      <w:hyperlink r:id="rId17" w:history="1">
         <w:r>
           <w:rPr>
             <w:rStyle w:val="Hyperlink"/>
@@ -2416,28 +2420,20 @@
           <w:rFonts w:ascii="Calibri" w:hAnsi="Calibri"/>
         </w:rPr>
         <w:br/>
-        <w:t>Other involved and consulted experts</w:t>
-      </w:r>
-      <w:proofErr w:type="gramStart"/>
+        <w:t>Other involved and consulted experts:</w:t>
+      </w:r>
+      <w:r>
+        <w:rPr>
+          <w:rFonts w:ascii="Calibri" w:hAnsi="Calibri"/>
+        </w:rPr>
+        <w:t xml:space="preserve"> </w:t>
+      </w:r>
       <w:r>
         <w:rPr>
           <w:rFonts w:ascii="Calibri" w:hAnsi="Calibri"/>
         </w:rPr>
         <w:t>:</w:t>
       </w:r>
-      <w:r>
-        <w:rPr>
-          <w:rFonts w:ascii="Calibri" w:hAnsi="Calibri"/>
-        </w:rPr>
-        <w:t xml:space="preserve"> </w:t>
-      </w:r>
-      <w:r>
-        <w:rPr>
-          <w:rFonts w:ascii="Calibri" w:hAnsi="Calibri"/>
-        </w:rPr>
-        <w:t>:</w:t>
-      </w:r>
-      <w:proofErr w:type="gramEnd"/>
       <w:r>
         <w:rPr>
           <w:rFonts w:ascii="Calibri" w:hAnsi="Calibri"/>
@@ -2678,7 +2674,7 @@
         </w:rPr>
         <w:t xml:space="preserve">Commercial tools such as </w:t>
       </w:r>
-      <w:hyperlink r:id="rId17" w:history="1">
+      <w:hyperlink r:id="rId18" w:history="1">
         <w:r>
           <w:rPr>
             <w:rStyle w:val="Hyperlink"/>
@@ -2693,7 +2689,7 @@
         </w:rPr>
         <w:t xml:space="preserve"> and </w:t>
       </w:r>
-      <w:hyperlink r:id="rId18" w:history="1">
+      <w:hyperlink r:id="rId19" w:history="1">
         <w:r>
           <w:rPr>
             <w:rStyle w:val="Hyperlink"/>
@@ -2764,21 +2760,7 @@
         <w:rPr>
           <w:rFonts w:ascii="Calibri" w:hAnsi="Calibri"/>
         </w:rPr>
-        <w:t xml:space="preserve">The system’s necessity is based on efficiency and consistency goals: faster shortlisting, reduced administrative workload and retaining a good accuracy in terms of hiring suitable candidates. The use of the AI system allows to make the hiring process more efficient by </w:t>
-      </w:r>
-      <w:proofErr w:type="gramStart"/>
-      <w:r>
-        <w:rPr>
-          <w:rFonts w:ascii="Calibri" w:hAnsi="Calibri"/>
-        </w:rPr>
-        <w:t>helping by helping</w:t>
-      </w:r>
-      <w:proofErr w:type="gramEnd"/>
-      <w:r>
-        <w:rPr>
-          <w:rFonts w:ascii="Calibri" w:hAnsi="Calibri"/>
-        </w:rPr>
-        <w:t xml:space="preserve"> HR staff to process a large amount of applications and hire suitable candidates more easily. </w:t>
+        <w:t xml:space="preserve">The system’s necessity is based on efficiency and consistency goals: faster shortlisting, reduced administrative workload and retaining a good accuracy in terms of hiring suitable candidates. The use of the AI system allows to make the hiring process more efficient by helping by helping HR staff to process a large amount of applications and hire suitable candidates more easily. </w:t>
       </w:r>
     </w:p>
     <w:p>
@@ -3094,28 +3076,14 @@
         <w:rPr>
           <w:rFonts w:ascii="Calibri" w:hAnsi="Calibri"/>
         </w:rPr>
-        <w:t xml:space="preserve">Note: the example problem of this FRIA is inspired by the example in the paper </w:t>
-      </w:r>
-      <w:proofErr w:type="gramStart"/>
-      <w:r>
-        <w:rPr>
-          <w:rFonts w:ascii="Calibri" w:hAnsi="Calibri"/>
-        </w:rPr>
-        <w:t>“”Fairness</w:t>
-      </w:r>
-      <w:proofErr w:type="gramEnd"/>
-      <w:r>
-        <w:rPr>
-          <w:rFonts w:ascii="Calibri" w:hAnsi="Calibri"/>
-        </w:rPr>
-        <w:t xml:space="preserve"> definitions explained and illustrated with examples”:  </w:t>
-      </w:r>
-      <w:hyperlink r:id="rId19" w:history="1">
+        <w:t xml:space="preserve">Note: the example problem of this FRIA is inspired by the example in the paper “”Fairness definitions explained and illustrated with examples”:  </w:t>
+      </w:r>
+      <w:hyperlink r:id="rId20" w:history="1">
         <w:r>
           <w:rPr>
             <w:rStyle w:val="Hyperlink"/>
             <w:rFonts w:ascii="Calibri" w:hAnsi="Calibri"/>
-            <w:lang w:val="en-NL"/>
+            <w:lang/>
           </w:rPr>
           <w:t>https://doi.org/10.54822/PASR6281</w:t>
         </w:r>
@@ -3400,25 +3368,25 @@
           <w:iCs/>
         </w:rPr>
         <w:br/>
-        <w:t>Which people are directly affected (</w:t>
-      </w:r>
-      <w:proofErr w:type="gramStart"/>
-      <w:r>
+        <w:t>Which people are directly affected (e.g. applicants, employees)?</w:t>
+      </w:r>
+    </w:p>
+    <w:p>
+      <w:pPr>
+        <w:jc w:val="both"/>
         <w:rPr>
           <w:rFonts w:ascii="Calibri" w:hAnsi="Calibri"/>
           <w:i/>
           <w:iCs/>
         </w:rPr>
-        <w:t>e.g.</w:t>
-      </w:r>
-      <w:proofErr w:type="gramEnd"/>
+      </w:pPr>
       <w:r>
         <w:rPr>
           <w:rFonts w:ascii="Calibri" w:hAnsi="Calibri"/>
           <w:i/>
           <w:iCs/>
         </w:rPr>
-        <w:t xml:space="preserve"> applicants, employees)?</w:t>
+        <w:t>Which groups are particularly at risk (age, gender, location, other)?</w:t>
       </w:r>
     </w:p>
     <w:p>
@@ -3436,43 +3404,7 @@
           <w:i/>
           <w:iCs/>
         </w:rPr>
-        <w:t>Which groups are particularly at risk (age, gender, location, other)?</w:t>
-      </w:r>
-    </w:p>
-    <w:p>
-      <w:pPr>
-        <w:jc w:val="both"/>
-        <w:rPr>
-          <w:rFonts w:ascii="Calibri" w:hAnsi="Calibri"/>
-          <w:i/>
-          <w:iCs/>
-        </w:rPr>
-      </w:pPr>
-      <w:r>
-        <w:rPr>
-          <w:rFonts w:ascii="Calibri" w:hAnsi="Calibri"/>
-          <w:i/>
-          <w:iCs/>
-        </w:rPr>
-        <w:t>Which internal users are affected (</w:t>
-      </w:r>
-      <w:proofErr w:type="gramStart"/>
-      <w:r>
-        <w:rPr>
-          <w:rFonts w:ascii="Calibri" w:hAnsi="Calibri"/>
-          <w:i/>
-          <w:iCs/>
-        </w:rPr>
-        <w:t>e.g.</w:t>
-      </w:r>
-      <w:proofErr w:type="gramEnd"/>
-      <w:r>
-        <w:rPr>
-          <w:rFonts w:ascii="Calibri" w:hAnsi="Calibri"/>
-          <w:i/>
-          <w:iCs/>
-        </w:rPr>
-        <w:t xml:space="preserve"> HR, managers)?</w:t>
+        <w:t>Which internal users are affected (e.g. HR, managers)?</w:t>
       </w:r>
     </w:p>
     <w:p>
@@ -5238,40 +5170,19 @@
         <w:rPr>
           <w:rFonts w:ascii="Calibri" w:hAnsi="Calibri" w:cs="Calibri"/>
         </w:rPr>
-        <w:t xml:space="preserve">Since bias and discrimination is a major risk for algorithmic </w:t>
-      </w:r>
-      <w:proofErr w:type="gramStart"/>
-      <w:r>
-        <w:rPr>
-          <w:rFonts w:ascii="Calibri" w:hAnsi="Calibri" w:cs="Calibri"/>
-        </w:rPr>
-        <w:t xml:space="preserve">hiring </w:t>
-      </w:r>
-      <w:r>
-        <w:rPr>
-          <w:rFonts w:ascii="Calibri" w:hAnsi="Calibri" w:cs="Calibri"/>
-        </w:rPr>
-        <w:t>,</w:t>
-      </w:r>
-      <w:proofErr w:type="gramEnd"/>
-      <w:r>
-        <w:rPr>
-          <w:rFonts w:ascii="Calibri" w:hAnsi="Calibri" w:cs="Calibri"/>
-        </w:rPr>
-        <w:t xml:space="preserve"> Secure Force BV </w:t>
-      </w:r>
-      <w:r>
-        <w:rPr>
-          <w:rFonts w:ascii="Calibri" w:hAnsi="Calibri" w:cs="Calibri"/>
-        </w:rPr>
-        <w:t xml:space="preserve">asked two data scientists to do a thorough analysis of bias and fairness using various fairness metrics. The full analysis is in a separate </w:t>
-      </w:r>
-      <w:proofErr w:type="gramStart"/>
-      <w:r>
-        <w:rPr>
-          <w:rFonts w:ascii="Calibri" w:hAnsi="Calibri" w:cs="Calibri"/>
-        </w:rPr>
-        <w:t xml:space="preserve">paper </w:t>
+        <w:t xml:space="preserve">Since bias and discrimination is a major risk for algorithmic hiring </w:t>
+      </w:r>
+      <w:r>
+        <w:rPr>
+          <w:rFonts w:ascii="Calibri" w:hAnsi="Calibri" w:cs="Calibri"/>
+        </w:rPr>
+        <w:t xml:space="preserve">, Secure Force BV </w:t>
+      </w:r>
+      <w:r>
+        <w:rPr>
+          <w:rFonts w:ascii="Calibri" w:hAnsi="Calibri" w:cs="Calibri"/>
+        </w:rPr>
+        <w:t xml:space="preserve">asked two data scientists to do a thorough analysis of bias and fairness using various fairness metrics. The full analysis is in a separate paper </w:t>
       </w:r>
       <w:r>
         <w:rPr>
@@ -5283,16 +5194,9 @@
         <w:rPr>
           <w:rFonts w:ascii="Calibri" w:hAnsi="Calibri" w:cs="Calibri"/>
         </w:rPr>
-        <w:t>(</w:t>
-      </w:r>
-      <w:proofErr w:type="gramEnd"/>
-      <w:r>
-        <w:rPr>
-          <w:rFonts w:ascii="Calibri" w:hAnsi="Calibri" w:cs="Calibri"/>
-        </w:rPr>
-        <w:t xml:space="preserve"> </w:t>
-      </w:r>
-      <w:hyperlink r:id="rId20" w:history="1">
+        <w:t xml:space="preserve">( </w:t>
+      </w:r>
+      <w:hyperlink r:id="rId21" w:history="1">
         <w:r>
           <w:rPr>
             <w:rStyle w:val="Hyperlink"/>
@@ -5389,63 +5293,41 @@
         <w:rPr>
           <w:rFonts w:asciiTheme="majorHAnsi" w:hAnsiTheme="majorHAnsi" w:cstheme="majorHAnsi"/>
         </w:rPr>
-        <w:t xml:space="preserve">The chosen algorithm shows the least amount of bias and is most fair while still having </w:t>
-      </w:r>
-      <w:proofErr w:type="gramStart"/>
+        <w:t xml:space="preserve">The chosen algorithm shows the least amount of bias and is most fair while still having acceptable </w:t>
+      </w:r>
       <w:r>
         <w:rPr>
           <w:rFonts w:asciiTheme="majorHAnsi" w:hAnsiTheme="majorHAnsi" w:cstheme="majorHAnsi"/>
         </w:rPr>
-        <w:t xml:space="preserve">acceptable </w:t>
+        <w:t xml:space="preserve"> performance</w:t>
       </w:r>
       <w:r>
         <w:rPr>
           <w:rFonts w:asciiTheme="majorHAnsi" w:hAnsiTheme="majorHAnsi" w:cstheme="majorHAnsi"/>
         </w:rPr>
-        <w:t xml:space="preserve"> performance</w:t>
-      </w:r>
-      <w:proofErr w:type="gramEnd"/>
-      <w:r>
+        <w:t xml:space="preserve">. </w:t>
+      </w:r>
+    </w:p>
+    <w:p>
+      <w:pPr>
+        <w:jc w:val="both"/>
+        <w:rPr>
+          <w:rFonts w:ascii="Calibri" w:hAnsi="Calibri" w:cs="Calibri"/>
+        </w:rPr>
+      </w:pPr>
+    </w:p>
+    <w:p>
+      <w:pPr>
+        <w:jc w:val="both"/>
         <w:rPr>
           <w:rFonts w:asciiTheme="majorHAnsi" w:hAnsiTheme="majorHAnsi" w:cstheme="majorHAnsi"/>
         </w:rPr>
-        <w:t xml:space="preserve">. </w:t>
-      </w:r>
-    </w:p>
-    <w:p>
-      <w:pPr>
-        <w:jc w:val="both"/>
-        <w:rPr>
-          <w:rFonts w:ascii="Calibri" w:hAnsi="Calibri" w:cs="Calibri"/>
-        </w:rPr>
-      </w:pPr>
-    </w:p>
-    <w:p>
-      <w:pPr>
-        <w:jc w:val="both"/>
+      </w:pPr>
+      <w:r>
         <w:rPr>
           <w:rFonts w:asciiTheme="majorHAnsi" w:hAnsiTheme="majorHAnsi" w:cstheme="majorHAnsi"/>
         </w:rPr>
-      </w:pPr>
-      <w:r>
-        <w:rPr>
-          <w:rFonts w:asciiTheme="majorHAnsi" w:hAnsiTheme="majorHAnsi" w:cstheme="majorHAnsi"/>
-        </w:rPr>
-        <w:t xml:space="preserve">Note that there </w:t>
-      </w:r>
-      <w:proofErr w:type="gramStart"/>
-      <w:r>
-        <w:rPr>
-          <w:rFonts w:asciiTheme="majorHAnsi" w:hAnsiTheme="majorHAnsi" w:cstheme="majorHAnsi"/>
-        </w:rPr>
-        <w:t>is</w:t>
-      </w:r>
-      <w:proofErr w:type="gramEnd"/>
-      <w:r>
-        <w:rPr>
-          <w:rFonts w:asciiTheme="majorHAnsi" w:hAnsiTheme="majorHAnsi" w:cstheme="majorHAnsi"/>
-        </w:rPr>
-        <w:t xml:space="preserve"> some biases. </w:t>
+        <w:t xml:space="preserve">Note that there is some biases. </w:t>
       </w:r>
       <w:proofErr w:type="spellStart"/>
       <w:r>
@@ -6123,21 +6005,7 @@
         <w:rPr>
           <w:rFonts w:ascii="Calibri" w:hAnsi="Calibri" w:cs="Calibri"/>
         </w:rPr>
-        <w:t xml:space="preserve">the trustworthy AI requirements according to the Ethics Guidelines </w:t>
-      </w:r>
-      <w:proofErr w:type="gramStart"/>
-      <w:r>
-        <w:rPr>
-          <w:rFonts w:ascii="Calibri" w:hAnsi="Calibri" w:cs="Calibri"/>
-        </w:rPr>
-        <w:t>For</w:t>
-      </w:r>
-      <w:proofErr w:type="gramEnd"/>
-      <w:r>
-        <w:rPr>
-          <w:rFonts w:ascii="Calibri" w:hAnsi="Calibri" w:cs="Calibri"/>
-        </w:rPr>
-        <w:t xml:space="preserve"> Trustworthy AI (2019) </w:t>
+        <w:t xml:space="preserve">the trustworthy AI requirements according to the Ethics Guidelines For Trustworthy AI (2019) </w:t>
       </w:r>
       <w:r>
         <w:rPr>
@@ -6741,21 +6609,7 @@
         <w:rPr>
           <w:rFonts w:ascii="Calibri" w:hAnsi="Calibri" w:cs="Calibri"/>
         </w:rPr>
-        <w:t xml:space="preserve">the trustworthy AI requirements according to the Ethics Guidelines </w:t>
-      </w:r>
-      <w:proofErr w:type="gramStart"/>
-      <w:r>
-        <w:rPr>
-          <w:rFonts w:ascii="Calibri" w:hAnsi="Calibri" w:cs="Calibri"/>
-        </w:rPr>
-        <w:t>For</w:t>
-      </w:r>
-      <w:proofErr w:type="gramEnd"/>
-      <w:r>
-        <w:rPr>
-          <w:rFonts w:ascii="Calibri" w:hAnsi="Calibri" w:cs="Calibri"/>
-        </w:rPr>
-        <w:t xml:space="preserve"> Trustworthy AI (2019) </w:t>
+        <w:t xml:space="preserve">the trustworthy AI requirements according to the Ethics Guidelines For Trustworthy AI (2019) </w:t>
       </w:r>
       <w:r>
         <w:rPr>
@@ -6933,21 +6787,7 @@
               <w:rPr>
                 <w:rFonts w:ascii="Calibri" w:hAnsi="Calibri" w:cs="Calibri"/>
               </w:rPr>
-              <w:t>Use a model configuration that excludes age and gender from the production model (</w:t>
-            </w:r>
-            <w:proofErr w:type="gramStart"/>
-            <w:r>
-              <w:rPr>
-                <w:rFonts w:ascii="Calibri" w:hAnsi="Calibri" w:cs="Calibri"/>
-              </w:rPr>
-              <w:t>e.g.</w:t>
-            </w:r>
-            <w:proofErr w:type="gramEnd"/>
-            <w:r>
-              <w:rPr>
-                <w:rFonts w:ascii="Calibri" w:hAnsi="Calibri" w:cs="Calibri"/>
-              </w:rPr>
-              <w:t xml:space="preserve"> A1); perform regular fairness testing on age and gender; set thresholds for acceptable gaps (e.g. &gt;10% triggers action); retrain, adjust or suspend the model if unfair patterns are detected.</w:t>
+              <w:t>Use a model configuration that excludes age and gender from the production model (e.g. A1); perform regular fairness testing on age and gender; set thresholds for acceptable gaps (e.g. &gt;10% triggers action); retrain, adjust or suspend the model if unfair patterns are detected.</w:t>
             </w:r>
           </w:p>
         </w:tc>
@@ -6978,21 +6818,7 @@
               <w:rPr>
                 <w:rFonts w:ascii="Calibri" w:hAnsi="Calibri" w:cs="Calibri"/>
               </w:rPr>
-              <w:t xml:space="preserve"> proxy effects (</w:t>
-            </w:r>
-            <w:proofErr w:type="gramStart"/>
-            <w:r>
-              <w:rPr>
-                <w:rFonts w:ascii="Calibri" w:hAnsi="Calibri" w:cs="Calibri"/>
-              </w:rPr>
-              <w:t>e.g.</w:t>
-            </w:r>
-            <w:proofErr w:type="gramEnd"/>
-            <w:r>
-              <w:rPr>
-                <w:rFonts w:ascii="Calibri" w:hAnsi="Calibri" w:cs="Calibri"/>
-              </w:rPr>
-              <w:t xml:space="preserve"> test scores) and small sample sizes can still create unequal outcomes between groups, even with monitoring; some disparity remains possible between audits.</w:t>
+              <w:t xml:space="preserve"> proxy effects (e.g. test scores) and small sample sizes can still create unequal outcomes between groups, even with monitoring; some disparity remains possible between audits.</w:t>
             </w:r>
           </w:p>
         </w:tc>
@@ -7047,21 +6873,7 @@
               <w:rPr>
                 <w:rFonts w:ascii="Calibri" w:hAnsi="Calibri" w:cs="Calibri"/>
               </w:rPr>
-              <w:t>Perform a GDPR DPIA; apply data minimisation (only test results and necessary contact data in production); pseudonymise logs and limit retention (</w:t>
-            </w:r>
-            <w:proofErr w:type="gramStart"/>
-            <w:r>
-              <w:rPr>
-                <w:rFonts w:ascii="Calibri" w:hAnsi="Calibri" w:cs="Calibri"/>
-              </w:rPr>
-              <w:t>e.g.</w:t>
-            </w:r>
-            <w:proofErr w:type="gramEnd"/>
-            <w:r>
-              <w:rPr>
-                <w:rFonts w:ascii="Calibri" w:hAnsi="Calibri" w:cs="Calibri"/>
-              </w:rPr>
-              <w:t xml:space="preserve"> 6 months); put a Data Processing Agreement (DPA) in place with the supplier and avoid </w:t>
+              <w:t xml:space="preserve">Perform a GDPR DPIA; apply data minimisation (only test results and necessary contact data in production); pseudonymise logs and limit retention (e.g. 6 months); put a Data Processing Agreement (DPA) in place with the supplier and avoid </w:t>
             </w:r>
             <w:r>
               <w:rPr>
@@ -7253,7 +7065,6 @@
               </w:rPr>
               <w:t xml:space="preserve"> </w:t>
             </w:r>
-            <w:proofErr w:type="gramStart"/>
             <w:r>
               <w:rPr>
                 <w:rFonts w:ascii="Calibri" w:hAnsi="Calibri" w:cs="Calibri"/>
@@ -7265,14 +7076,7 @@
               <w:rPr>
                 <w:rFonts w:ascii="Calibri" w:hAnsi="Calibri" w:cs="Calibri"/>
               </w:rPr>
-              <w:t xml:space="preserve"> oversight</w:t>
-            </w:r>
-            <w:proofErr w:type="gramEnd"/>
-            <w:r>
-              <w:rPr>
-                <w:rFonts w:ascii="Calibri" w:hAnsi="Calibri" w:cs="Calibri"/>
-              </w:rPr>
-              <w:t xml:space="preserve"> </w:t>
+              <w:t xml:space="preserve"> oversight </w:t>
             </w:r>
             <w:r>
               <w:rPr>
@@ -7556,21 +7360,12 @@
               </w:rPr>
               <w:t>monitor</w:t>
             </w:r>
-            <w:proofErr w:type="spellStart"/>
             <w:r>
               <w:rPr>
                 <w:rFonts w:ascii="Calibri" w:hAnsi="Calibri" w:cs="Calibri"/>
                 <w:lang w:val="en-US"/>
               </w:rPr>
-              <w:t>ing</w:t>
-            </w:r>
-            <w:proofErr w:type="spellEnd"/>
-            <w:r>
-              <w:rPr>
-                <w:rFonts w:ascii="Calibri" w:hAnsi="Calibri" w:cs="Calibri"/>
-                <w:lang w:val="en-US"/>
-              </w:rPr>
-              <w:t xml:space="preserve"> for</w:t>
+              <w:t>ing for</w:t>
             </w:r>
             <w:r>
               <w:rPr>
@@ -7851,21 +7646,7 @@
         <w:rPr>
           <w:rFonts w:ascii="Calibri" w:hAnsi="Calibri" w:cs="Calibri"/>
         </w:rPr>
-        <w:t xml:space="preserve">the trustworthy AI requirements according to the Ethics Guidelines </w:t>
-      </w:r>
-      <w:proofErr w:type="gramStart"/>
-      <w:r>
-        <w:rPr>
-          <w:rFonts w:ascii="Calibri" w:hAnsi="Calibri" w:cs="Calibri"/>
-        </w:rPr>
-        <w:t>For</w:t>
-      </w:r>
-      <w:proofErr w:type="gramEnd"/>
-      <w:r>
-        <w:rPr>
-          <w:rFonts w:ascii="Calibri" w:hAnsi="Calibri" w:cs="Calibri"/>
-        </w:rPr>
-        <w:t xml:space="preserve"> Trustworthy AI (2019) </w:t>
+        <w:t xml:space="preserve">the trustworthy AI requirements according to the Ethics Guidelines For Trustworthy AI (2019) </w:t>
       </w:r>
       <w:r>
         <w:rPr>
@@ -7947,7 +7728,6 @@
         </w:rPr>
         <w:t xml:space="preserve"> All hiring decisions remain under human control. </w:t>
       </w:r>
-      <w:proofErr w:type="gramStart"/>
       <w:r>
         <w:rPr>
           <w:rFonts w:ascii="Calibri" w:hAnsi="Calibri" w:cs="Calibri"/>
@@ -7958,14 +7738,7 @@
         <w:rPr>
           <w:rFonts w:ascii="Calibri" w:hAnsi="Calibri" w:cs="Calibri"/>
         </w:rPr>
-        <w:t xml:space="preserve"> HR</w:t>
-      </w:r>
-      <w:proofErr w:type="gramEnd"/>
-      <w:r>
-        <w:rPr>
-          <w:rFonts w:ascii="Calibri" w:hAnsi="Calibri" w:cs="Calibri"/>
-        </w:rPr>
-        <w:t xml:space="preserve"> officer review</w:t>
+        <w:t xml:space="preserve"> HR officer review</w:t>
       </w:r>
       <w:r>
         <w:rPr>
@@ -9781,14 +9554,12 @@
               </w:rPr>
               <w:t>Weight only t</w:t>
             </w:r>
-            <w:proofErr w:type="spellStart"/>
             <w:r>
               <w:rPr>
                 <w:rFonts w:ascii="Calibri" w:hAnsi="Calibri" w:cs="Calibri"/>
               </w:rPr>
               <w:t>est</w:t>
             </w:r>
-            <w:proofErr w:type="spellEnd"/>
             <w:r>
               <w:rPr>
                 <w:rFonts w:ascii="Calibri" w:hAnsi="Calibri" w:cs="Calibri"/>
@@ -9857,23 +9628,7 @@
                 <w:rFonts w:ascii="Calibri" w:hAnsi="Calibri" w:cs="Calibri"/>
                 <w:color w:val="EE0000"/>
               </w:rPr>
-              <w:t>[LOGISTIC REGRESSION]</w:t>
-            </w:r>
-            <w:proofErr w:type="gramStart"/>
-            <w:r>
-              <w:rPr>
-                <w:rFonts w:ascii="Calibri" w:hAnsi="Calibri" w:cs="Calibri"/>
-                <w:color w:val="EE0000"/>
-              </w:rPr>
-              <w:t>/[</w:t>
-            </w:r>
-            <w:proofErr w:type="gramEnd"/>
-            <w:r>
-              <w:rPr>
-                <w:rFonts w:ascii="Calibri" w:hAnsi="Calibri" w:cs="Calibri"/>
-                <w:color w:val="EE0000"/>
-              </w:rPr>
-              <w:t>NEURAL NETWORK]</w:t>
+              <w:t>[LOGISTIC REGRESSION]/[NEURAL NETWORK]</w:t>
             </w:r>
             <w:r>
               <w:rPr>
@@ -10014,21 +9769,7 @@
         <w:rPr>
           <w:rFonts w:ascii="Calibri" w:hAnsi="Calibri" w:cs="Calibri"/>
         </w:rPr>
-        <w:t xml:space="preserve">The figures below </w:t>
-      </w:r>
-      <w:proofErr w:type="gramStart"/>
-      <w:r>
-        <w:rPr>
-          <w:rFonts w:ascii="Calibri" w:hAnsi="Calibri" w:cs="Calibri"/>
-        </w:rPr>
-        <w:t>illustrates</w:t>
-      </w:r>
-      <w:proofErr w:type="gramEnd"/>
-      <w:r>
-        <w:rPr>
-          <w:rFonts w:ascii="Calibri" w:hAnsi="Calibri" w:cs="Calibri"/>
-        </w:rPr>
-        <w:t xml:space="preserve"> the hiring outcomes for the assessed configurations (human expert reference and A1 </w:t>
+        <w:t xml:space="preserve">The figures below illustrates the hiring outcomes for the assessed configurations (human expert reference and A1 </w:t>
       </w:r>
       <w:r>
         <w:rPr>
@@ -10074,7 +9815,7 @@
                     <pic:cNvPicPr/>
                   </pic:nvPicPr>
                   <pic:blipFill>
-                    <a:blip r:embed="rId21"/>
+                    <a:blip r:embed="rId22"/>
                     <a:stretch>
                       <a:fillRect/>
                     </a:stretch>
@@ -10211,7 +9952,7 @@
                     <pic:cNvPicPr/>
                   </pic:nvPicPr>
                   <pic:blipFill>
-                    <a:blip r:embed="rId22"/>
+                    <a:blip r:embed="rId23"/>
                     <a:stretch>
                       <a:fillRect/>
                     </a:stretch>
@@ -10258,7 +9999,7 @@
                     <pic:cNvPicPr/>
                   </pic:nvPicPr>
                   <pic:blipFill>
-                    <a:blip r:embed="rId23"/>
+                    <a:blip r:embed="rId24"/>
                     <a:stretch>
                       <a:fillRect/>
                     </a:stretch>
@@ -11338,7 +11079,6 @@
                 <w:lang w:val="en-US"/>
               </w:rPr>
             </w:pPr>
-            <w:proofErr w:type="gramStart"/>
             <w:r>
               <w:rPr>
                 <w:rFonts w:ascii="Segoe UI Symbol" w:hAnsi="Segoe UI Symbol" w:cs="Segoe UI Symbol"/>
@@ -11350,15 +11090,7 @@
                 <w:rFonts w:ascii="Calibri" w:hAnsi="Calibri" w:cs="Calibri"/>
                 <w:lang w:val="en-US"/>
               </w:rPr>
-              <w:t>(</w:t>
-            </w:r>
-            <w:proofErr w:type="gramEnd"/>
-            <w:r>
-              <w:rPr>
-                <w:rFonts w:ascii="Calibri" w:hAnsi="Calibri" w:cs="Calibri"/>
-                <w:lang w:val="en-US"/>
-              </w:rPr>
-              <w:t>large gap)</w:t>
+              <w:t>(large gap)</w:t>
             </w:r>
           </w:p>
         </w:tc>
@@ -12059,21 +11791,7 @@
               <w:rPr>
                 <w:rFonts w:ascii="Calibri" w:hAnsi="Calibri" w:cs="Calibri"/>
               </w:rPr>
-              <w:t xml:space="preserve">slightly </w:t>
-            </w:r>
-            <w:proofErr w:type="gramStart"/>
-            <w:r>
-              <w:rPr>
-                <w:rFonts w:ascii="Calibri" w:hAnsi="Calibri" w:cs="Calibri"/>
-              </w:rPr>
-              <w:t>favour</w:t>
-            </w:r>
-            <w:proofErr w:type="gramEnd"/>
-            <w:r>
-              <w:rPr>
-                <w:rFonts w:ascii="Calibri" w:hAnsi="Calibri" w:cs="Calibri"/>
-              </w:rPr>
-              <w:t xml:space="preserve"> men in selection rate but maintain balanced error rates.</w:t>
+              <w:t>slightly favour men in selection rate but maintain balanced error rates.</w:t>
             </w:r>
           </w:p>
         </w:tc>
@@ -13425,27 +13143,13 @@
         <w:rPr>
           <w:rFonts w:asciiTheme="majorHAnsi" w:hAnsiTheme="majorHAnsi" w:cstheme="majorHAnsi"/>
         </w:rPr>
-        <w:t xml:space="preserve"> is the worst on performance, but the </w:t>
-      </w:r>
-      <w:proofErr w:type="gramStart"/>
+        <w:t xml:space="preserve"> is the worst on performance, but the most </w:t>
+      </w:r>
       <w:r>
         <w:rPr>
           <w:rFonts w:asciiTheme="majorHAnsi" w:hAnsiTheme="majorHAnsi" w:cstheme="majorHAnsi"/>
         </w:rPr>
-        <w:t xml:space="preserve">most </w:t>
-      </w:r>
-      <w:r>
-        <w:rPr>
-          <w:rFonts w:asciiTheme="majorHAnsi" w:hAnsiTheme="majorHAnsi" w:cstheme="majorHAnsi"/>
-        </w:rPr>
-        <w:t>fair</w:t>
-      </w:r>
-      <w:proofErr w:type="gramEnd"/>
-      <w:r>
-        <w:rPr>
-          <w:rFonts w:asciiTheme="majorHAnsi" w:hAnsiTheme="majorHAnsi" w:cstheme="majorHAnsi"/>
-        </w:rPr>
-        <w:t xml:space="preserve"> on groups (by design)</w:t>
+        <w:t>fair on groups (by design)</w:t>
       </w:r>
       <w:r>
         <w:rPr>
@@ -13922,27 +13626,13 @@
         <w:rPr>
           <w:rFonts w:ascii="Calibri" w:hAnsi="Calibri" w:cs="Calibri"/>
         </w:rPr>
-        <w:t xml:space="preserve"> </w:t>
-      </w:r>
-      <w:proofErr w:type="gramStart"/>
-      <w:r>
-        <w:rPr>
-          <w:rFonts w:ascii="Calibri" w:hAnsi="Calibri" w:cs="Calibri"/>
-        </w:rPr>
-        <w:t>F</w:t>
-      </w:r>
-      <w:r>
-        <w:rPr>
-          <w:rFonts w:ascii="Calibri" w:hAnsi="Calibri" w:cs="Calibri"/>
-        </w:rPr>
-        <w:t>or</w:t>
-      </w:r>
-      <w:proofErr w:type="gramEnd"/>
-      <w:r>
-        <w:rPr>
-          <w:rFonts w:ascii="Calibri" w:hAnsi="Calibri" w:cs="Calibri"/>
-        </w:rPr>
-        <w:t xml:space="preserve"> </w:t>
+        <w:t xml:space="preserve"> F</w:t>
+      </w:r>
+      <w:r>
+        <w:rPr>
+          <w:rFonts w:ascii="Calibri" w:hAnsi="Calibri" w:cs="Calibri"/>
+        </w:rPr>
+        <w:t xml:space="preserve">or </w:t>
       </w:r>
       <w:r>
         <w:rPr>
@@ -15011,23 +14701,7 @@
                 <w:rFonts w:asciiTheme="majorHAnsi" w:hAnsiTheme="majorHAnsi" w:cstheme="majorHAnsi"/>
                 <w:szCs w:val="22"/>
               </w:rPr>
-              <w:t xml:space="preserve">corrected before training. Dataset, </w:t>
-            </w:r>
-            <w:proofErr w:type="spellStart"/>
-            <w:r>
-              <w:rPr>
-                <w:rFonts w:asciiTheme="majorHAnsi" w:hAnsiTheme="majorHAnsi" w:cstheme="majorHAnsi"/>
-                <w:szCs w:val="22"/>
-              </w:rPr>
-              <w:t>preprocessing</w:t>
-            </w:r>
-            <w:proofErr w:type="spellEnd"/>
-            <w:r>
-              <w:rPr>
-                <w:rFonts w:asciiTheme="majorHAnsi" w:hAnsiTheme="majorHAnsi" w:cstheme="majorHAnsi"/>
-                <w:szCs w:val="22"/>
-              </w:rPr>
-              <w:t xml:space="preserve"> steps, and model versions are documented. </w:t>
+              <w:t xml:space="preserve">corrected before training. Dataset, preprocessing steps, and model versions are documented. </w:t>
             </w:r>
             <w:r>
               <w:rPr>
@@ -15191,9 +14865,120 @@
                 <w:iCs w:val="0"/>
                 <w:szCs w:val="22"/>
               </w:rPr>
-              <w:t xml:space="preserve">Datasets, data-gathering processes, labelling steps, and algorithms must be documented to enable full traceability of the AI system and its decisions. Traceability enables identification of errors and supports auditability and </w:t>
-            </w:r>
-            <w:proofErr w:type="spellStart"/>
+              <w:t>Datasets, data-gathering processes, labelling steps, and algorithms must be documented to enable full traceability of the AI system and its decisions. Traceability enables identification of errors and supports auditability and explainability.</w:t>
+            </w:r>
+          </w:p>
+        </w:tc>
+        <w:tc>
+          <w:tcPr>
+            <w:tcW w:w="4253" w:type="dxa"/>
+            <w:vAlign w:val="center"/>
+          </w:tcPr>
+          <w:p>
+            <w:pPr>
+              <w:rPr>
+                <w:rFonts w:asciiTheme="majorHAnsi" w:hAnsiTheme="majorHAnsi" w:cstheme="majorHAnsi"/>
+                <w:szCs w:val="22"/>
+              </w:rPr>
+            </w:pPr>
+            <w:r>
+              <w:rPr>
+                <w:rFonts w:asciiTheme="majorHAnsi" w:hAnsiTheme="majorHAnsi" w:cstheme="majorHAnsi"/>
+                <w:szCs w:val="22"/>
+              </w:rPr>
+              <w:t>All datasets, preprocessing steps, model versions, parameters, and training scripts are documented.</w:t>
+            </w:r>
+            <w:r>
+              <w:rPr>
+                <w:rFonts w:asciiTheme="majorHAnsi" w:hAnsiTheme="majorHAnsi" w:cstheme="majorHAnsi"/>
+                <w:szCs w:val="22"/>
+              </w:rPr>
+              <w:t xml:space="preserve"> </w:t>
+            </w:r>
+            <w:r>
+              <w:rPr>
+                <w:rFonts w:asciiTheme="majorHAnsi" w:hAnsiTheme="majorHAnsi" w:cstheme="majorHAnsi"/>
+                <w:szCs w:val="22"/>
+              </w:rPr>
+              <w:t xml:space="preserve"> </w:t>
+            </w:r>
+            <w:r>
+              <w:rPr>
+                <w:rFonts w:asciiTheme="majorHAnsi" w:hAnsiTheme="majorHAnsi" w:cstheme="majorHAnsi"/>
+                <w:color w:val="EE0000"/>
+                <w:szCs w:val="22"/>
+              </w:rPr>
+              <w:t>[NEURAL NETWORK CASE M</w:t>
+            </w:r>
+            <w:r>
+              <w:rPr>
+                <w:rFonts w:asciiTheme="majorHAnsi" w:hAnsiTheme="majorHAnsi" w:cstheme="majorHAnsi"/>
+                <w:color w:val="EE0000"/>
+                <w:szCs w:val="22"/>
+              </w:rPr>
+              <w:t>odel explainability techniques like SHAP and LIME are available for explainability purposes. Decision logs link each recommendation to a model version and input features, supporting audits and error analysis</w:t>
+            </w:r>
+            <w:r>
+              <w:rPr>
+                <w:rFonts w:asciiTheme="majorHAnsi" w:hAnsiTheme="majorHAnsi" w:cstheme="majorHAnsi"/>
+                <w:color w:val="EE0000"/>
+                <w:szCs w:val="22"/>
+              </w:rPr>
+              <w:t>].</w:t>
+            </w:r>
+          </w:p>
+          <w:p>
+            <w:pPr>
+              <w:rPr>
+                <w:rFonts w:asciiTheme="majorHAnsi" w:hAnsiTheme="majorHAnsi" w:cstheme="majorHAnsi"/>
+                <w:szCs w:val="22"/>
+              </w:rPr>
+            </w:pPr>
+            <w:r>
+              <w:rPr>
+                <w:rFonts w:asciiTheme="majorHAnsi" w:hAnsiTheme="majorHAnsi" w:cstheme="majorHAnsi"/>
+                <w:color w:val="EE0000"/>
+                <w:szCs w:val="22"/>
+              </w:rPr>
+              <w:t>[LOGISTIC REGRESSION CASE, Decisions within the logistic regression model are easily traceable given the simple model nature.]</w:t>
+            </w:r>
+          </w:p>
+        </w:tc>
+      </w:tr>
+      <w:tr>
+        <w:tc>
+          <w:tcPr>
+            <w:tcW w:w="4106" w:type="dxa"/>
+            <w:vAlign w:val="center"/>
+          </w:tcPr>
+          <w:p>
+            <w:pPr>
+              <w:rPr>
+                <w:rFonts w:asciiTheme="majorHAnsi" w:hAnsiTheme="majorHAnsi" w:cstheme="majorHAnsi"/>
+                <w:i/>
+                <w:iCs/>
+                <w:szCs w:val="22"/>
+              </w:rPr>
+            </w:pPr>
+            <w:r>
+              <w:rPr>
+                <w:rStyle w:val="Strong"/>
+                <w:rFonts w:asciiTheme="majorHAnsi" w:hAnsiTheme="majorHAnsi" w:cstheme="majorHAnsi"/>
+                <w:i/>
+                <w:iCs/>
+                <w:szCs w:val="22"/>
+              </w:rPr>
+              <w:t>12. Explainability</w:t>
+            </w:r>
+            <w:r>
+              <w:rPr>
+                <w:rFonts w:asciiTheme="majorHAnsi" w:hAnsiTheme="majorHAnsi" w:cstheme="majorHAnsi"/>
+                <w:i/>
+                <w:iCs/>
+                <w:szCs w:val="22"/>
+              </w:rPr>
+              <w:t xml:space="preserve"> </w:t>
+            </w:r>
             <w:r>
               <w:rPr>
                 <w:rStyle w:val="Emphasis"/>
@@ -15202,9 +14987,209 @@
                 <w:iCs w:val="0"/>
                 <w:szCs w:val="22"/>
               </w:rPr>
-              <w:t>explainability</w:t>
-            </w:r>
-            <w:proofErr w:type="spellEnd"/>
+              <w:t>AI processes and decisions must be explainable to humans, with explanations adapted to the stakeholder (e.g., applicant, HR staff, regulator). Trade-offs between accuracy and explainability should be considered.</w:t>
+            </w:r>
+          </w:p>
+        </w:tc>
+        <w:tc>
+          <w:tcPr>
+            <w:tcW w:w="4253" w:type="dxa"/>
+            <w:vAlign w:val="center"/>
+          </w:tcPr>
+          <w:p>
+            <w:pPr>
+              <w:rPr>
+                <w:rFonts w:asciiTheme="majorHAnsi" w:hAnsiTheme="majorHAnsi" w:cstheme="majorHAnsi"/>
+                <w:szCs w:val="22"/>
+              </w:rPr>
+            </w:pPr>
+            <w:r>
+              <w:rPr>
+                <w:rFonts w:asciiTheme="majorHAnsi" w:hAnsiTheme="majorHAnsi" w:cstheme="majorHAnsi"/>
+                <w:szCs w:val="22"/>
+              </w:rPr>
+              <w:t>E</w:t>
+            </w:r>
+            <w:r>
+              <w:rPr>
+                <w:rFonts w:asciiTheme="majorHAnsi" w:hAnsiTheme="majorHAnsi" w:cstheme="majorHAnsi"/>
+                <w:szCs w:val="22"/>
+              </w:rPr>
+              <w:t xml:space="preserve">xplanations available upon applicant request. </w:t>
+            </w:r>
+            <w:r>
+              <w:rPr>
+                <w:rFonts w:asciiTheme="majorHAnsi" w:hAnsiTheme="majorHAnsi" w:cstheme="majorHAnsi"/>
+                <w:color w:val="EE0000"/>
+                <w:szCs w:val="22"/>
+              </w:rPr>
+              <w:t>[NEURAL NETWORK]</w:t>
+            </w:r>
+            <w:r>
+              <w:rPr>
+                <w:rFonts w:asciiTheme="majorHAnsi" w:hAnsiTheme="majorHAnsi" w:cstheme="majorHAnsi"/>
+                <w:szCs w:val="22"/>
+              </w:rPr>
+              <w:t xml:space="preserve"> </w:t>
+            </w:r>
+            <w:r>
+              <w:rPr>
+                <w:rFonts w:asciiTheme="majorHAnsi" w:hAnsiTheme="majorHAnsi" w:cstheme="majorHAnsi"/>
+                <w:szCs w:val="22"/>
+              </w:rPr>
+              <w:t>HR reviewers</w:t>
+            </w:r>
+            <w:r>
+              <w:rPr>
+                <w:rFonts w:asciiTheme="majorHAnsi" w:hAnsiTheme="majorHAnsi" w:cstheme="majorHAnsi"/>
+                <w:szCs w:val="22"/>
+              </w:rPr>
+              <w:t xml:space="preserve"> and analysts can access</w:t>
+            </w:r>
+            <w:r>
+              <w:rPr>
+                <w:rFonts w:asciiTheme="majorHAnsi" w:hAnsiTheme="majorHAnsi" w:cstheme="majorHAnsi"/>
+                <w:szCs w:val="22"/>
+              </w:rPr>
+              <w:t xml:space="preserve"> feature-importance (SHAP) scores</w:t>
+            </w:r>
+            <w:r>
+              <w:rPr>
+                <w:rFonts w:asciiTheme="majorHAnsi" w:hAnsiTheme="majorHAnsi" w:cstheme="majorHAnsi"/>
+                <w:szCs w:val="22"/>
+              </w:rPr>
+              <w:t xml:space="preserve">. </w:t>
+            </w:r>
+            <w:r>
+              <w:rPr>
+                <w:rFonts w:asciiTheme="majorHAnsi" w:hAnsiTheme="majorHAnsi" w:cstheme="majorHAnsi"/>
+                <w:szCs w:val="22"/>
+              </w:rPr>
+              <w:t>Accuracy</w:t>
+            </w:r>
+            <w:r>
+              <w:rPr>
+                <w:rFonts w:asciiTheme="majorHAnsi" w:hAnsiTheme="majorHAnsi" w:cstheme="majorHAnsi"/>
+                <w:szCs w:val="22"/>
+              </w:rPr>
+              <w:t xml:space="preserve"> - </w:t>
+            </w:r>
+            <w:r>
+              <w:rPr>
+                <w:rFonts w:asciiTheme="majorHAnsi" w:hAnsiTheme="majorHAnsi" w:cstheme="majorHAnsi"/>
+                <w:szCs w:val="22"/>
+              </w:rPr>
+              <w:t>explainability trade-offs documente</w:t>
+            </w:r>
+            <w:r>
+              <w:rPr>
+                <w:rFonts w:asciiTheme="majorHAnsi" w:hAnsiTheme="majorHAnsi" w:cstheme="majorHAnsi"/>
+                <w:szCs w:val="22"/>
+              </w:rPr>
+              <w:t>d</w:t>
+            </w:r>
+            <w:r>
+              <w:rPr>
+                <w:rFonts w:asciiTheme="majorHAnsi" w:hAnsiTheme="majorHAnsi" w:cstheme="majorHAnsi"/>
+                <w:szCs w:val="22"/>
+              </w:rPr>
+              <w:t xml:space="preserve">; </w:t>
+            </w:r>
+            <w:r>
+              <w:rPr>
+                <w:rFonts w:asciiTheme="majorHAnsi" w:hAnsiTheme="majorHAnsi" w:cstheme="majorHAnsi"/>
+                <w:color w:val="EE0000"/>
+                <w:szCs w:val="22"/>
+              </w:rPr>
+              <w:t xml:space="preserve">[LOGISTIC </w:t>
+            </w:r>
+            <w:r>
+              <w:rPr>
+                <w:rFonts w:asciiTheme="majorHAnsi" w:hAnsiTheme="majorHAnsi" w:cstheme="majorHAnsi"/>
+                <w:color w:val="EE0000"/>
+                <w:szCs w:val="22"/>
+              </w:rPr>
+              <w:lastRenderedPageBreak/>
+              <w:t>REGRESSION</w:t>
+            </w:r>
+            <w:r>
+              <w:rPr>
+                <w:rFonts w:asciiTheme="majorHAnsi" w:hAnsiTheme="majorHAnsi" w:cstheme="majorHAnsi"/>
+                <w:color w:val="EE0000"/>
+                <w:szCs w:val="22"/>
+              </w:rPr>
+              <w:t>]</w:t>
+            </w:r>
+            <w:r>
+              <w:rPr>
+                <w:rFonts w:asciiTheme="majorHAnsi" w:hAnsiTheme="majorHAnsi" w:cstheme="majorHAnsi"/>
+                <w:color w:val="EE0000"/>
+                <w:szCs w:val="22"/>
+              </w:rPr>
+              <w:t xml:space="preserve"> </w:t>
+            </w:r>
+            <w:r>
+              <w:rPr>
+                <w:rFonts w:asciiTheme="majorHAnsi" w:hAnsiTheme="majorHAnsi" w:cstheme="majorHAnsi"/>
+                <w:color w:val="EE0000"/>
+                <w:szCs w:val="22"/>
+              </w:rPr>
+              <w:t>s</w:t>
+            </w:r>
+            <w:r>
+              <w:rPr>
+                <w:rFonts w:asciiTheme="majorHAnsi" w:hAnsiTheme="majorHAnsi" w:cstheme="majorHAnsi"/>
+                <w:color w:val="000000" w:themeColor="text1"/>
+                <w:szCs w:val="22"/>
+              </w:rPr>
+              <w:t>impler model chosen partly for clarity</w:t>
+            </w:r>
+            <w:r>
+              <w:rPr>
+                <w:rFonts w:asciiTheme="majorHAnsi" w:hAnsiTheme="majorHAnsi" w:cstheme="majorHAnsi"/>
+                <w:color w:val="000000" w:themeColor="text1"/>
+                <w:szCs w:val="22"/>
+              </w:rPr>
+              <w:t xml:space="preserve"> and explainability.</w:t>
+            </w:r>
+          </w:p>
+        </w:tc>
+      </w:tr>
+      <w:tr>
+        <w:tc>
+          <w:tcPr>
+            <w:tcW w:w="4106" w:type="dxa"/>
+            <w:vAlign w:val="center"/>
+          </w:tcPr>
+          <w:p>
+            <w:pPr>
+              <w:rPr>
+                <w:rFonts w:asciiTheme="majorHAnsi" w:hAnsiTheme="majorHAnsi" w:cstheme="majorHAnsi"/>
+                <w:i/>
+                <w:iCs/>
+                <w:szCs w:val="22"/>
+              </w:rPr>
+            </w:pPr>
+            <w:r>
+              <w:rPr>
+                <w:rStyle w:val="Strong"/>
+                <w:rFonts w:asciiTheme="majorHAnsi" w:hAnsiTheme="majorHAnsi" w:cstheme="majorHAnsi"/>
+                <w:i/>
+                <w:iCs/>
+                <w:szCs w:val="22"/>
+              </w:rPr>
+              <w:lastRenderedPageBreak/>
+              <w:t>13. Communication</w:t>
+            </w:r>
+            <w:r>
+              <w:rPr>
+                <w:rFonts w:asciiTheme="majorHAnsi" w:hAnsiTheme="majorHAnsi" w:cstheme="majorHAnsi"/>
+                <w:i/>
+                <w:iCs/>
+                <w:szCs w:val="22"/>
+              </w:rPr>
+              <w:t xml:space="preserve"> </w:t>
+            </w:r>
             <w:r>
               <w:rPr>
                 <w:rStyle w:val="Emphasis"/>
@@ -15213,7 +15198,7 @@
                 <w:iCs w:val="0"/>
                 <w:szCs w:val="22"/>
               </w:rPr>
-              <w:t>.</w:t>
+              <w:t>Users must be informed that they are interacting with an AI system. Systems must be identifiable as AI, not appear human, and provide information on capabilities, limitations, and alternatives for human interaction.</w:t>
             </w:r>
           </w:p>
         </w:tc>
@@ -15234,23 +15219,14 @@
                 <w:rFonts w:asciiTheme="majorHAnsi" w:hAnsiTheme="majorHAnsi" w:cstheme="majorHAnsi"/>
                 <w:szCs w:val="22"/>
               </w:rPr>
-              <w:t xml:space="preserve">All datasets, </w:t>
-            </w:r>
-            <w:proofErr w:type="spellStart"/>
-            <w:r>
-              <w:rPr>
-                <w:rFonts w:asciiTheme="majorHAnsi" w:hAnsiTheme="majorHAnsi" w:cstheme="majorHAnsi"/>
-                <w:szCs w:val="22"/>
-              </w:rPr>
-              <w:t>preprocessing</w:t>
-            </w:r>
-            <w:proofErr w:type="spellEnd"/>
-            <w:r>
-              <w:rPr>
-                <w:rFonts w:asciiTheme="majorHAnsi" w:hAnsiTheme="majorHAnsi" w:cstheme="majorHAnsi"/>
-                <w:szCs w:val="22"/>
-              </w:rPr>
-              <w:t xml:space="preserve"> steps, model versions, parameters, and training scripts are documented.</w:t>
+              <w:t>Applicants are informed that AI supports screening</w:t>
+            </w:r>
+            <w:r>
+              <w:rPr>
+                <w:rFonts w:asciiTheme="majorHAnsi" w:hAnsiTheme="majorHAnsi" w:cstheme="majorHAnsi"/>
+                <w:szCs w:val="22"/>
+              </w:rPr>
+              <w:t xml:space="preserve"> in terms and condition upon applying</w:t>
             </w:r>
             <w:r>
               <w:rPr>
@@ -15262,17 +15238,10 @@
             <w:r>
               <w:rPr>
                 <w:rFonts w:asciiTheme="majorHAnsi" w:hAnsiTheme="majorHAnsi" w:cstheme="majorHAnsi"/>
-                <w:szCs w:val="22"/>
-              </w:rPr>
-              <w:t xml:space="preserve"> </w:t>
-            </w:r>
-            <w:r>
-              <w:rPr>
-                <w:rFonts w:asciiTheme="majorHAnsi" w:hAnsiTheme="majorHAnsi" w:cstheme="majorHAnsi"/>
                 <w:color w:val="EE0000"/>
                 <w:szCs w:val="22"/>
               </w:rPr>
-              <w:t>[NEURAL NETWORK CASE M</w:t>
+              <w:t>[</w:t>
             </w:r>
             <w:r>
               <w:rPr>
@@ -15280,67 +15249,36 @@
                 <w:color w:val="EE0000"/>
                 <w:szCs w:val="22"/>
               </w:rPr>
-              <w:t xml:space="preserve">odel </w:t>
-            </w:r>
-            <w:proofErr w:type="spellStart"/>
+              <w:t xml:space="preserve">Users </w:t>
+            </w:r>
             <w:r>
               <w:rPr>
                 <w:rFonts w:asciiTheme="majorHAnsi" w:hAnsiTheme="majorHAnsi" w:cstheme="majorHAnsi"/>
                 <w:color w:val="EE0000"/>
                 <w:szCs w:val="22"/>
               </w:rPr>
-              <w:t>explainability</w:t>
-            </w:r>
-            <w:proofErr w:type="spellEnd"/>
-            <w:r>
-              <w:rPr>
-                <w:rFonts w:asciiTheme="majorHAnsi" w:hAnsiTheme="majorHAnsi" w:cstheme="majorHAnsi"/>
-                <w:color w:val="EE0000"/>
-                <w:szCs w:val="22"/>
-              </w:rPr>
-              <w:t xml:space="preserve"> techniques like SHAP and LIME are available for </w:t>
-            </w:r>
-            <w:proofErr w:type="spellStart"/>
-            <w:r>
-              <w:rPr>
-                <w:rFonts w:asciiTheme="majorHAnsi" w:hAnsiTheme="majorHAnsi" w:cstheme="majorHAnsi"/>
-                <w:color w:val="EE0000"/>
-                <w:szCs w:val="22"/>
-              </w:rPr>
-              <w:t>explainability</w:t>
-            </w:r>
-            <w:proofErr w:type="spellEnd"/>
-            <w:r>
-              <w:rPr>
-                <w:rFonts w:asciiTheme="majorHAnsi" w:hAnsiTheme="majorHAnsi" w:cstheme="majorHAnsi"/>
-                <w:color w:val="EE0000"/>
-                <w:szCs w:val="22"/>
-              </w:rPr>
-              <w:t xml:space="preserve"> purposes. Decision logs link each recommendation to a model version and input features, supporting audits and error analysis</w:t>
-            </w:r>
-            <w:r>
-              <w:rPr>
-                <w:rFonts w:asciiTheme="majorHAnsi" w:hAnsiTheme="majorHAnsi" w:cstheme="majorHAnsi"/>
-                <w:color w:val="EE0000"/>
-                <w:szCs w:val="22"/>
-              </w:rPr>
-              <w:t>].</w:t>
-            </w:r>
-          </w:p>
-          <w:p>
-            <w:pPr>
-              <w:rPr>
-                <w:rFonts w:asciiTheme="majorHAnsi" w:hAnsiTheme="majorHAnsi" w:cstheme="majorHAnsi"/>
-                <w:szCs w:val="22"/>
-              </w:rPr>
-            </w:pPr>
-            <w:r>
-              <w:rPr>
-                <w:rFonts w:asciiTheme="majorHAnsi" w:hAnsiTheme="majorHAnsi" w:cstheme="majorHAnsi"/>
-                <w:color w:val="EE0000"/>
-                <w:szCs w:val="22"/>
-              </w:rPr>
-              <w:t>[LOGISTIC REGRESSION CASE, Decisions within the logistic regression model are easily traceable given the simple model nature.]</w:t>
+              <w:t>may opt for a full human review]</w:t>
+            </w:r>
+            <w:r>
+              <w:rPr>
+                <w:rFonts w:asciiTheme="majorHAnsi" w:hAnsiTheme="majorHAnsi" w:cstheme="majorHAnsi"/>
+                <w:szCs w:val="22"/>
+              </w:rPr>
+              <w:t>. Internal documentation describes system capabilities and limitations. The system does not mimic human communication</w:t>
+            </w:r>
+            <w:r>
+              <w:rPr>
+                <w:rFonts w:asciiTheme="majorHAnsi" w:hAnsiTheme="majorHAnsi" w:cstheme="majorHAnsi"/>
+                <w:szCs w:val="22"/>
+              </w:rPr>
+              <w:t xml:space="preserve"> (no chatbot-like features)</w:t>
+            </w:r>
+            <w:r>
+              <w:rPr>
+                <w:rFonts w:asciiTheme="majorHAnsi" w:hAnsiTheme="majorHAnsi" w:cstheme="majorHAnsi"/>
+                <w:szCs w:val="22"/>
+              </w:rPr>
+              <w:t>.</w:t>
             </w:r>
           </w:p>
         </w:tc>
@@ -15355,6 +15293,47 @@
             <w:pPr>
               <w:rPr>
                 <w:rFonts w:asciiTheme="majorHAnsi" w:hAnsiTheme="majorHAnsi" w:cstheme="majorHAnsi"/>
+                <w:b/>
+                <w:bCs/>
+                <w:szCs w:val="22"/>
+              </w:rPr>
+            </w:pPr>
+            <w:r>
+              <w:rPr>
+                <w:rFonts w:asciiTheme="majorHAnsi" w:hAnsiTheme="majorHAnsi" w:cstheme="majorHAnsi"/>
+                <w:b/>
+                <w:bCs/>
+                <w:szCs w:val="22"/>
+              </w:rPr>
+              <w:t>Diversity, Non-Discrimination &amp; Fairness</w:t>
+            </w:r>
+          </w:p>
+        </w:tc>
+        <w:tc>
+          <w:tcPr>
+            <w:tcW w:w="4253" w:type="dxa"/>
+            <w:vAlign w:val="center"/>
+          </w:tcPr>
+          <w:p>
+            <w:pPr>
+              <w:rPr>
+                <w:rFonts w:asciiTheme="majorHAnsi" w:hAnsiTheme="majorHAnsi" w:cstheme="majorHAnsi"/>
+                <w:szCs w:val="22"/>
+              </w:rPr>
+            </w:pPr>
+          </w:p>
+        </w:tc>
+      </w:tr>
+      <w:tr>
+        <w:tc>
+          <w:tcPr>
+            <w:tcW w:w="4106" w:type="dxa"/>
+            <w:vAlign w:val="center"/>
+          </w:tcPr>
+          <w:p>
+            <w:pPr>
+              <w:rPr>
+                <w:rFonts w:asciiTheme="majorHAnsi" w:hAnsiTheme="majorHAnsi" w:cstheme="majorHAnsi"/>
                 <w:i/>
                 <w:iCs/>
                 <w:szCs w:val="22"/>
@@ -15368,27 +15347,172 @@
                 <w:iCs/>
                 <w:szCs w:val="22"/>
               </w:rPr>
-              <w:t xml:space="preserve">12. </w:t>
-            </w:r>
-            <w:proofErr w:type="spellStart"/>
-            <w:r>
-              <w:rPr>
-                <w:rStyle w:val="Strong"/>
+              <w:t>14. Avoidance of unfair bias</w:t>
+            </w:r>
+            <w:r>
+              <w:rPr>
                 <w:rFonts w:asciiTheme="majorHAnsi" w:hAnsiTheme="majorHAnsi" w:cstheme="majorHAnsi"/>
                 <w:i/>
                 <w:iCs/>
                 <w:szCs w:val="22"/>
               </w:rPr>
-              <w:t>Explainability</w:t>
-            </w:r>
-            <w:proofErr w:type="spellEnd"/>
-            <w:r>
+              <w:t xml:space="preserve"> </w:t>
+            </w:r>
+            <w:r>
+              <w:rPr>
+                <w:rStyle w:val="Emphasis"/>
+                <w:rFonts w:asciiTheme="majorHAnsi" w:hAnsiTheme="majorHAnsi" w:cstheme="majorHAnsi"/>
+                <w:i w:val="0"/>
+                <w:iCs w:val="0"/>
+                <w:szCs w:val="22"/>
+              </w:rPr>
+              <w:t>Training and operational data may contain historic or structural biases that can lead to direct or indirect discrimination. Bias must be identified and mitigated through data quality checks, transparent development processes, and diverse perspectives in system design.</w:t>
+            </w:r>
+          </w:p>
+        </w:tc>
+        <w:tc>
+          <w:tcPr>
+            <w:tcW w:w="4253" w:type="dxa"/>
+            <w:vAlign w:val="center"/>
+          </w:tcPr>
+          <w:p>
+            <w:pPr>
+              <w:rPr>
+                <w:rFonts w:asciiTheme="majorHAnsi" w:hAnsiTheme="majorHAnsi" w:cstheme="majorHAnsi"/>
+                <w:szCs w:val="22"/>
+              </w:rPr>
+            </w:pPr>
+            <w:r>
+              <w:rPr>
+                <w:rFonts w:asciiTheme="majorHAnsi" w:hAnsiTheme="majorHAnsi" w:cstheme="majorHAnsi"/>
+                <w:szCs w:val="22"/>
+              </w:rPr>
+              <w:t xml:space="preserve">Fairness </w:t>
+            </w:r>
+            <w:r>
+              <w:rPr>
+                <w:rFonts w:asciiTheme="majorHAnsi" w:hAnsiTheme="majorHAnsi" w:cstheme="majorHAnsi"/>
+                <w:szCs w:val="22"/>
+              </w:rPr>
+              <w:t>assessment was performed considering sensitive attributes (</w:t>
+            </w:r>
+            <w:r>
+              <w:rPr>
+                <w:rFonts w:asciiTheme="majorHAnsi" w:hAnsiTheme="majorHAnsi" w:cstheme="majorHAnsi"/>
+                <w:szCs w:val="22"/>
+              </w:rPr>
+              <w:t>age and gender</w:t>
+            </w:r>
+            <w:r>
+              <w:rPr>
+                <w:rFonts w:asciiTheme="majorHAnsi" w:hAnsiTheme="majorHAnsi" w:cstheme="majorHAnsi"/>
+                <w:szCs w:val="22"/>
+              </w:rPr>
+              <w:t>)</w:t>
+            </w:r>
+            <w:r>
+              <w:rPr>
+                <w:rFonts w:asciiTheme="majorHAnsi" w:hAnsiTheme="majorHAnsi" w:cstheme="majorHAnsi"/>
+                <w:szCs w:val="22"/>
+              </w:rPr>
+              <w:t xml:space="preserve"> </w:t>
+            </w:r>
+            <w:r>
+              <w:rPr>
+                <w:rFonts w:asciiTheme="majorHAnsi" w:hAnsiTheme="majorHAnsi" w:cstheme="majorHAnsi"/>
+                <w:szCs w:val="22"/>
+              </w:rPr>
+              <w:t xml:space="preserve">with findings documented in Appendix 1: overall moderate fairness within acceptable performance and data availability constraints </w:t>
+            </w:r>
+            <w:r>
+              <w:rPr>
+                <w:rFonts w:asciiTheme="majorHAnsi" w:hAnsiTheme="majorHAnsi" w:cstheme="majorHAnsi"/>
+                <w:color w:val="EE0000"/>
+                <w:szCs w:val="22"/>
+              </w:rPr>
+              <w:t>[a</w:t>
+            </w:r>
+            <w:r>
+              <w:rPr>
+                <w:rFonts w:asciiTheme="majorHAnsi" w:hAnsiTheme="majorHAnsi" w:cstheme="majorHAnsi"/>
+                <w:color w:val="EE0000"/>
+                <w:szCs w:val="22"/>
+              </w:rPr>
+              <w:t>nd no sensitive-attribute leakage</w:t>
+            </w:r>
+            <w:r>
+              <w:rPr>
+                <w:rFonts w:asciiTheme="majorHAnsi" w:hAnsiTheme="majorHAnsi" w:cstheme="majorHAnsi"/>
+                <w:color w:val="EE0000"/>
+                <w:szCs w:val="22"/>
+              </w:rPr>
+              <w:t>]</w:t>
+            </w:r>
+            <w:r>
+              <w:rPr>
+                <w:rFonts w:asciiTheme="majorHAnsi" w:hAnsiTheme="majorHAnsi" w:cstheme="majorHAnsi"/>
+                <w:color w:val="EE0000"/>
+                <w:szCs w:val="22"/>
+              </w:rPr>
+              <w:t>.</w:t>
+            </w:r>
+            <w:r>
+              <w:rPr>
+                <w:rFonts w:asciiTheme="majorHAnsi" w:hAnsiTheme="majorHAnsi" w:cstheme="majorHAnsi"/>
+                <w:szCs w:val="22"/>
+              </w:rPr>
+              <w:t xml:space="preserve"> </w:t>
+            </w:r>
+            <w:r>
+              <w:rPr>
+                <w:rFonts w:asciiTheme="majorHAnsi" w:hAnsiTheme="majorHAnsi" w:cstheme="majorHAnsi"/>
+                <w:color w:val="EE0000"/>
+                <w:szCs w:val="22"/>
+              </w:rPr>
+              <w:t>Quarterly</w:t>
+            </w:r>
+            <w:r>
+              <w:rPr>
+                <w:rFonts w:asciiTheme="majorHAnsi" w:hAnsiTheme="majorHAnsi" w:cstheme="majorHAnsi"/>
+                <w:szCs w:val="22"/>
+              </w:rPr>
+              <w:t xml:space="preserve"> fairness audits, balanced training data, and HR override reduce risk.</w:t>
+            </w:r>
+          </w:p>
+        </w:tc>
+      </w:tr>
+      <w:tr>
+        <w:tc>
+          <w:tcPr>
+            <w:tcW w:w="4106" w:type="dxa"/>
+            <w:vAlign w:val="center"/>
+          </w:tcPr>
+          <w:p>
+            <w:pPr>
               <w:rPr>
                 <w:rFonts w:asciiTheme="majorHAnsi" w:hAnsiTheme="majorHAnsi" w:cstheme="majorHAnsi"/>
                 <w:i/>
                 <w:iCs/>
                 <w:szCs w:val="22"/>
               </w:rPr>
+            </w:pPr>
+            <w:r>
+              <w:rPr>
+                <w:rStyle w:val="Strong"/>
+                <w:rFonts w:asciiTheme="majorHAnsi" w:hAnsiTheme="majorHAnsi" w:cstheme="majorHAnsi"/>
+                <w:i/>
+                <w:iCs/>
+                <w:szCs w:val="22"/>
+              </w:rPr>
+              <w:t>15. Accessibility and universal design</w:t>
+            </w:r>
+            <w:r>
+              <w:rPr>
+                <w:rFonts w:asciiTheme="majorHAnsi" w:hAnsiTheme="majorHAnsi" w:cstheme="majorHAnsi"/>
+                <w:i/>
+                <w:iCs/>
+                <w:szCs w:val="22"/>
+              </w:rPr>
               <w:t xml:space="preserve"> </w:t>
             </w:r>
             <w:r>
@@ -15399,9 +15523,66 @@
                 <w:iCs w:val="0"/>
                 <w:szCs w:val="22"/>
               </w:rPr>
-              <w:t xml:space="preserve">AI processes and decisions must be explainable to humans, with explanations adapted to the stakeholder (e.g., applicant, HR staff, regulator). Trade-offs between accuracy and </w:t>
-            </w:r>
-            <w:proofErr w:type="spellStart"/>
+              <w:t>AI systems should be user-centric and accessible to all, regardless of age, gender, or ability. Universal design principles should be followed to support equitable access, including for persons with disabilities.</w:t>
+            </w:r>
+          </w:p>
+        </w:tc>
+        <w:tc>
+          <w:tcPr>
+            <w:tcW w:w="4253" w:type="dxa"/>
+            <w:vAlign w:val="center"/>
+          </w:tcPr>
+          <w:p>
+            <w:pPr>
+              <w:rPr>
+                <w:rFonts w:asciiTheme="majorHAnsi" w:hAnsiTheme="majorHAnsi" w:cstheme="majorHAnsi"/>
+                <w:szCs w:val="22"/>
+              </w:rPr>
+            </w:pPr>
+            <w:r>
+              <w:rPr>
+                <w:rFonts w:asciiTheme="majorHAnsi" w:hAnsiTheme="majorHAnsi" w:cstheme="majorHAnsi"/>
+                <w:szCs w:val="22"/>
+              </w:rPr>
+              <w:t>Applicant notifications and HR tools designed for accessibility; communication available in clear language; alternative manual processes available for candidates requiring accommodations.</w:t>
+            </w:r>
+          </w:p>
+        </w:tc>
+      </w:tr>
+      <w:tr>
+        <w:tc>
+          <w:tcPr>
+            <w:tcW w:w="4106" w:type="dxa"/>
+            <w:vAlign w:val="center"/>
+          </w:tcPr>
+          <w:p>
+            <w:pPr>
+              <w:rPr>
+                <w:rFonts w:asciiTheme="majorHAnsi" w:hAnsiTheme="majorHAnsi" w:cstheme="majorHAnsi"/>
+                <w:i/>
+                <w:iCs/>
+                <w:szCs w:val="22"/>
+              </w:rPr>
+            </w:pPr>
+            <w:r>
+              <w:rPr>
+                <w:rStyle w:val="Strong"/>
+                <w:rFonts w:asciiTheme="majorHAnsi" w:hAnsiTheme="majorHAnsi" w:cstheme="majorHAnsi"/>
+                <w:i/>
+                <w:iCs/>
+                <w:szCs w:val="22"/>
+              </w:rPr>
+              <w:t>16. Stakeholder participation</w:t>
+            </w:r>
+            <w:r>
+              <w:rPr>
+                <w:rFonts w:asciiTheme="majorHAnsi" w:hAnsiTheme="majorHAnsi" w:cstheme="majorHAnsi"/>
+                <w:i/>
+                <w:iCs/>
+                <w:szCs w:val="22"/>
+              </w:rPr>
+              <w:t xml:space="preserve"> </w:t>
+            </w:r>
             <w:r>
               <w:rPr>
                 <w:rStyle w:val="Emphasis"/>
@@ -15410,9 +15591,180 @@
                 <w:iCs w:val="0"/>
                 <w:szCs w:val="22"/>
               </w:rPr>
-              <w:t>explainability</w:t>
+              <w:t>Stakeholders who may be affected should be consulted throughout the AI system’s lifecycle, and feedback should be regularly collected after deployment.</w:t>
+            </w:r>
+          </w:p>
+        </w:tc>
+        <w:tc>
+          <w:tcPr>
+            <w:tcW w:w="4253" w:type="dxa"/>
+            <w:vAlign w:val="center"/>
+          </w:tcPr>
+          <w:p>
+            <w:pPr>
+              <w:rPr>
+                <w:rFonts w:asciiTheme="majorHAnsi" w:hAnsiTheme="majorHAnsi" w:cstheme="majorHAnsi"/>
+                <w:szCs w:val="22"/>
+              </w:rPr>
+            </w:pPr>
+            <w:r>
+              <w:rPr>
+                <w:rFonts w:asciiTheme="majorHAnsi" w:hAnsiTheme="majorHAnsi" w:cstheme="majorHAnsi"/>
+                <w:color w:val="EE0000"/>
+                <w:szCs w:val="22"/>
+              </w:rPr>
+              <w:t xml:space="preserve">Survey-based </w:t>
+            </w:r>
+            <w:r>
+              <w:rPr>
+                <w:rFonts w:asciiTheme="majorHAnsi" w:hAnsiTheme="majorHAnsi" w:cstheme="majorHAnsi"/>
+                <w:color w:val="EE0000"/>
+                <w:szCs w:val="22"/>
+              </w:rPr>
+              <w:t xml:space="preserve">Value Based Design </w:t>
+            </w:r>
+            <w:r>
+              <w:rPr>
+                <w:rFonts w:asciiTheme="majorHAnsi" w:hAnsiTheme="majorHAnsi" w:cstheme="majorHAnsi"/>
+                <w:color w:val="EE0000"/>
+                <w:szCs w:val="22"/>
+              </w:rPr>
+              <w:t xml:space="preserve">(VBD) </w:t>
+            </w:r>
+            <w:r>
+              <w:rPr>
+                <w:rFonts w:asciiTheme="majorHAnsi" w:hAnsiTheme="majorHAnsi" w:cstheme="majorHAnsi"/>
+                <w:color w:val="EE0000"/>
+                <w:szCs w:val="22"/>
+              </w:rPr>
+              <w:t xml:space="preserve">was performed to </w:t>
+            </w:r>
+            <w:proofErr w:type="spellStart"/>
+            <w:r>
+              <w:rPr>
+                <w:rFonts w:asciiTheme="majorHAnsi" w:hAnsiTheme="majorHAnsi" w:cstheme="majorHAnsi"/>
+                <w:color w:val="EE0000"/>
+                <w:szCs w:val="22"/>
+              </w:rPr>
+              <w:t>elicitate</w:t>
             </w:r>
             <w:proofErr w:type="spellEnd"/>
+            <w:r>
+              <w:rPr>
+                <w:rFonts w:asciiTheme="majorHAnsi" w:hAnsiTheme="majorHAnsi" w:cstheme="majorHAnsi"/>
+                <w:color w:val="EE0000"/>
+                <w:szCs w:val="22"/>
+              </w:rPr>
+              <w:t xml:space="preserve"> stakeholders’ requirements prior to deployment.</w:t>
+            </w:r>
+            <w:r>
+              <w:rPr>
+                <w:rFonts w:asciiTheme="majorHAnsi" w:hAnsiTheme="majorHAnsi" w:cstheme="majorHAnsi"/>
+                <w:szCs w:val="22"/>
+              </w:rPr>
+              <w:t xml:space="preserve"> </w:t>
+            </w:r>
+            <w:r>
+              <w:rPr>
+                <w:rFonts w:asciiTheme="majorHAnsi" w:hAnsiTheme="majorHAnsi" w:cstheme="majorHAnsi"/>
+                <w:szCs w:val="22"/>
+              </w:rPr>
+              <w:t xml:space="preserve">HR staff, </w:t>
+            </w:r>
+            <w:r>
+              <w:rPr>
+                <w:rFonts w:asciiTheme="majorHAnsi" w:hAnsiTheme="majorHAnsi" w:cstheme="majorHAnsi"/>
+                <w:color w:val="EE0000"/>
+                <w:szCs w:val="22"/>
+              </w:rPr>
+              <w:t>works council</w:t>
+            </w:r>
+            <w:r>
+              <w:rPr>
+                <w:rFonts w:asciiTheme="majorHAnsi" w:hAnsiTheme="majorHAnsi" w:cstheme="majorHAnsi"/>
+                <w:szCs w:val="22"/>
+              </w:rPr>
+              <w:t>, and DPO consulted during deployment. Annual review includes feedback from HR users and management. Applicants can provide feedback or request human review.</w:t>
+            </w:r>
+          </w:p>
+        </w:tc>
+      </w:tr>
+      <w:tr>
+        <w:tc>
+          <w:tcPr>
+            <w:tcW w:w="4106" w:type="dxa"/>
+            <w:vAlign w:val="center"/>
+          </w:tcPr>
+          <w:p>
+            <w:pPr>
+              <w:rPr>
+                <w:rFonts w:asciiTheme="majorHAnsi" w:hAnsiTheme="majorHAnsi" w:cstheme="majorHAnsi"/>
+                <w:b/>
+                <w:bCs/>
+                <w:szCs w:val="22"/>
+              </w:rPr>
+            </w:pPr>
+            <w:r>
+              <w:rPr>
+                <w:rFonts w:asciiTheme="majorHAnsi" w:hAnsiTheme="majorHAnsi" w:cstheme="majorHAnsi"/>
+                <w:b/>
+                <w:bCs/>
+                <w:szCs w:val="22"/>
+              </w:rPr>
+              <w:t>Societal &amp; Environmental Well-being</w:t>
+            </w:r>
+          </w:p>
+        </w:tc>
+        <w:tc>
+          <w:tcPr>
+            <w:tcW w:w="4253" w:type="dxa"/>
+            <w:vAlign w:val="center"/>
+          </w:tcPr>
+          <w:p>
+            <w:pPr>
+              <w:rPr>
+                <w:rFonts w:asciiTheme="majorHAnsi" w:hAnsiTheme="majorHAnsi" w:cstheme="majorHAnsi"/>
+                <w:szCs w:val="22"/>
+              </w:rPr>
+            </w:pPr>
+          </w:p>
+        </w:tc>
+      </w:tr>
+      <w:tr>
+        <w:tc>
+          <w:tcPr>
+            <w:tcW w:w="4106" w:type="dxa"/>
+            <w:vAlign w:val="center"/>
+          </w:tcPr>
+          <w:p>
+            <w:pPr>
+              <w:rPr>
+                <w:rFonts w:asciiTheme="majorHAnsi" w:hAnsiTheme="majorHAnsi" w:cstheme="majorHAnsi"/>
+                <w:i/>
+                <w:iCs/>
+                <w:szCs w:val="22"/>
+              </w:rPr>
+            </w:pPr>
+            <w:r>
+              <w:rPr>
+                <w:rStyle w:val="Strong"/>
+                <w:rFonts w:asciiTheme="majorHAnsi" w:hAnsiTheme="majorHAnsi" w:cstheme="majorHAnsi"/>
+                <w:i/>
+                <w:iCs/>
+                <w:szCs w:val="22"/>
+              </w:rPr>
+              <w:t>17. Sustainable and environmentally friendly AI</w:t>
+            </w:r>
+            <w:r>
+              <w:rPr>
+                <w:rFonts w:asciiTheme="majorHAnsi" w:hAnsiTheme="majorHAnsi" w:cstheme="majorHAnsi"/>
+                <w:i/>
+                <w:iCs/>
+                <w:szCs w:val="22"/>
+              </w:rPr>
+              <w:t xml:space="preserve"> </w:t>
+            </w:r>
+            <w:proofErr w:type="spellStart"/>
             <w:r>
               <w:rPr>
                 <w:rStyle w:val="Emphasis"/>
@@ -15421,7 +15773,18 @@
                 <w:iCs w:val="0"/>
                 <w:szCs w:val="22"/>
               </w:rPr>
-              <w:t xml:space="preserve"> should be considered.</w:t>
+              <w:t>AI</w:t>
+            </w:r>
+            <w:proofErr w:type="spellEnd"/>
+            <w:r>
+              <w:rPr>
+                <w:rStyle w:val="Emphasis"/>
+                <w:rFonts w:asciiTheme="majorHAnsi" w:hAnsiTheme="majorHAnsi" w:cstheme="majorHAnsi"/>
+                <w:i w:val="0"/>
+                <w:iCs w:val="0"/>
+                <w:szCs w:val="22"/>
+              </w:rPr>
+              <w:t xml:space="preserve"> systems should minimise environmental impact by limiting energy use during development and deployment, assessing the supply chain, and choosing less harmful options wherever possible.</w:t>
             </w:r>
           </w:p>
         </w:tc>
@@ -15440,28 +15803,47 @@
             <w:r>
               <w:rPr>
                 <w:rFonts w:asciiTheme="majorHAnsi" w:hAnsiTheme="majorHAnsi" w:cstheme="majorHAnsi"/>
-                <w:szCs w:val="22"/>
-              </w:rPr>
-              <w:t>E</w:t>
-            </w:r>
-            <w:r>
-              <w:rPr>
-                <w:rFonts w:asciiTheme="majorHAnsi" w:hAnsiTheme="majorHAnsi" w:cstheme="majorHAnsi"/>
-                <w:szCs w:val="22"/>
-              </w:rPr>
-              <w:t xml:space="preserve">xplanations available upon applicant request. </w:t>
-            </w:r>
-            <w:r>
-              <w:rPr>
-                <w:rFonts w:asciiTheme="majorHAnsi" w:hAnsiTheme="majorHAnsi" w:cstheme="majorHAnsi"/>
                 <w:color w:val="EE0000"/>
                 <w:szCs w:val="22"/>
               </w:rPr>
-              <w:t>[NEURAL NETWORK]</w:t>
-            </w:r>
-            <w:r>
-              <w:rPr>
-                <w:rFonts w:asciiTheme="majorHAnsi" w:hAnsiTheme="majorHAnsi" w:cstheme="majorHAnsi"/>
+              <w:t>[LOGISTIC REGREGSSION</w:t>
+            </w:r>
+            <w:r>
+              <w:rPr>
+                <w:rFonts w:asciiTheme="majorHAnsi" w:hAnsiTheme="majorHAnsi" w:cstheme="majorHAnsi"/>
+                <w:color w:val="EE0000"/>
+                <w:szCs w:val="22"/>
+              </w:rPr>
+              <w:t xml:space="preserve">, </w:t>
+            </w:r>
+            <w:r>
+              <w:rPr>
+                <w:rFonts w:asciiTheme="majorHAnsi" w:hAnsiTheme="majorHAnsi" w:cstheme="majorHAnsi"/>
+                <w:color w:val="EE0000"/>
+                <w:szCs w:val="22"/>
+              </w:rPr>
+              <w:t>the employed AI model do</w:t>
+            </w:r>
+            <w:r>
+              <w:rPr>
+                <w:rFonts w:asciiTheme="majorHAnsi" w:hAnsiTheme="majorHAnsi" w:cstheme="majorHAnsi"/>
+                <w:color w:val="EE0000"/>
+                <w:szCs w:val="22"/>
+              </w:rPr>
+              <w:t>es</w:t>
+            </w:r>
+            <w:r>
+              <w:rPr>
+                <w:rFonts w:asciiTheme="majorHAnsi" w:hAnsiTheme="majorHAnsi" w:cstheme="majorHAnsi"/>
+                <w:color w:val="EE0000"/>
+                <w:szCs w:val="22"/>
+              </w:rPr>
+              <w:t xml:space="preserve"> not rely on large datasets (‘big data’) nor complex system architectures (such as LLMs) and therefore do not compute-intensive in training nor usage.</w:t>
+            </w:r>
+            <w:r>
+              <w:rPr>
+                <w:rFonts w:asciiTheme="majorHAnsi" w:hAnsiTheme="majorHAnsi" w:cstheme="majorHAnsi"/>
+                <w:color w:val="EE0000"/>
                 <w:szCs w:val="22"/>
               </w:rPr>
               <w:t xml:space="preserve"> </w:t>
@@ -15469,104 +15851,14 @@
             <w:r>
               <w:rPr>
                 <w:rFonts w:asciiTheme="majorHAnsi" w:hAnsiTheme="majorHAnsi" w:cstheme="majorHAnsi"/>
-                <w:szCs w:val="22"/>
-              </w:rPr>
-              <w:t>HR reviewers</w:t>
-            </w:r>
-            <w:r>
-              <w:rPr>
-                <w:rFonts w:asciiTheme="majorHAnsi" w:hAnsiTheme="majorHAnsi" w:cstheme="majorHAnsi"/>
-                <w:szCs w:val="22"/>
-              </w:rPr>
-              <w:t xml:space="preserve"> and analysts can access</w:t>
-            </w:r>
-            <w:r>
-              <w:rPr>
-                <w:rFonts w:asciiTheme="majorHAnsi" w:hAnsiTheme="majorHAnsi" w:cstheme="majorHAnsi"/>
-                <w:szCs w:val="22"/>
-              </w:rPr>
-              <w:t xml:space="preserve"> feature-importance (SHAP) scores</w:t>
-            </w:r>
-            <w:r>
-              <w:rPr>
-                <w:rFonts w:asciiTheme="majorHAnsi" w:hAnsiTheme="majorHAnsi" w:cstheme="majorHAnsi"/>
-                <w:szCs w:val="22"/>
-              </w:rPr>
-              <w:t xml:space="preserve">. </w:t>
-            </w:r>
-            <w:r>
-              <w:rPr>
-                <w:rFonts w:asciiTheme="majorHAnsi" w:hAnsiTheme="majorHAnsi" w:cstheme="majorHAnsi"/>
-                <w:szCs w:val="22"/>
-              </w:rPr>
-              <w:t>Accuracy</w:t>
-            </w:r>
-            <w:r>
-              <w:rPr>
-                <w:rFonts w:asciiTheme="majorHAnsi" w:hAnsiTheme="majorHAnsi" w:cstheme="majorHAnsi"/>
-                <w:szCs w:val="22"/>
-              </w:rPr>
-              <w:t xml:space="preserve"> - </w:t>
-            </w:r>
-            <w:proofErr w:type="spellStart"/>
-            <w:r>
-              <w:rPr>
-                <w:rFonts w:asciiTheme="majorHAnsi" w:hAnsiTheme="majorHAnsi" w:cstheme="majorHAnsi"/>
-                <w:szCs w:val="22"/>
-              </w:rPr>
-              <w:t>explainability</w:t>
-            </w:r>
-            <w:proofErr w:type="spellEnd"/>
-            <w:r>
-              <w:rPr>
-                <w:rFonts w:asciiTheme="majorHAnsi" w:hAnsiTheme="majorHAnsi" w:cstheme="majorHAnsi"/>
-                <w:szCs w:val="22"/>
-              </w:rPr>
-              <w:t xml:space="preserve"> trade-offs documente</w:t>
-            </w:r>
-            <w:r>
-              <w:rPr>
-                <w:rFonts w:asciiTheme="majorHAnsi" w:hAnsiTheme="majorHAnsi" w:cstheme="majorHAnsi"/>
-                <w:szCs w:val="22"/>
-              </w:rPr>
-              <w:t>d</w:t>
-            </w:r>
-            <w:r>
-              <w:rPr>
-                <w:rFonts w:asciiTheme="majorHAnsi" w:hAnsiTheme="majorHAnsi" w:cstheme="majorHAnsi"/>
-                <w:szCs w:val="22"/>
-              </w:rPr>
-              <w:t xml:space="preserve">; </w:t>
-            </w:r>
-            <w:r>
-              <w:rPr>
-                <w:rFonts w:asciiTheme="majorHAnsi" w:hAnsiTheme="majorHAnsi" w:cstheme="majorHAnsi"/>
                 <w:color w:val="EE0000"/>
                 <w:szCs w:val="22"/>
               </w:rPr>
-              <w:t xml:space="preserve">[LOGISTIC </w:t>
-            </w:r>
-            <w:r>
-              <w:rPr>
-                <w:rFonts w:asciiTheme="majorHAnsi" w:hAnsiTheme="majorHAnsi" w:cstheme="majorHAnsi"/>
-                <w:color w:val="EE0000"/>
-                <w:szCs w:val="22"/>
-              </w:rPr>
-              <w:lastRenderedPageBreak/>
-              <w:t>REGRESSION</w:t>
-            </w:r>
-            <w:r>
-              <w:rPr>
-                <w:rFonts w:asciiTheme="majorHAnsi" w:hAnsiTheme="majorHAnsi" w:cstheme="majorHAnsi"/>
-                <w:color w:val="EE0000"/>
-                <w:szCs w:val="22"/>
-              </w:rPr>
               <w:t>]</w:t>
             </w:r>
             <w:r>
               <w:rPr>
                 <w:rFonts w:asciiTheme="majorHAnsi" w:hAnsiTheme="majorHAnsi" w:cstheme="majorHAnsi"/>
-                <w:color w:val="EE0000"/>
                 <w:szCs w:val="22"/>
               </w:rPr>
               <w:t xml:space="preserve"> </w:t>
@@ -15574,44 +15866,9 @@
             <w:r>
               <w:rPr>
                 <w:rFonts w:asciiTheme="majorHAnsi" w:hAnsiTheme="majorHAnsi" w:cstheme="majorHAnsi"/>
-                <w:color w:val="EE0000"/>
-                <w:szCs w:val="22"/>
-              </w:rPr>
-              <w:t>s</w:t>
-            </w:r>
-            <w:r>
-              <w:rPr>
-                <w:rFonts w:asciiTheme="majorHAnsi" w:hAnsiTheme="majorHAnsi" w:cstheme="majorHAnsi"/>
-                <w:color w:val="000000" w:themeColor="text1"/>
-                <w:szCs w:val="22"/>
-              </w:rPr>
-              <w:t>impler model chosen partly for clarity</w:t>
-            </w:r>
-            <w:r>
-              <w:rPr>
-                <w:rFonts w:asciiTheme="majorHAnsi" w:hAnsiTheme="majorHAnsi" w:cstheme="majorHAnsi"/>
-                <w:color w:val="000000" w:themeColor="text1"/>
-                <w:szCs w:val="22"/>
-              </w:rPr>
-              <w:t xml:space="preserve"> and </w:t>
-            </w:r>
-            <w:proofErr w:type="spellStart"/>
-            <w:r>
-              <w:rPr>
-                <w:rFonts w:asciiTheme="majorHAnsi" w:hAnsiTheme="majorHAnsi" w:cstheme="majorHAnsi"/>
-                <w:color w:val="000000" w:themeColor="text1"/>
-                <w:szCs w:val="22"/>
-              </w:rPr>
-              <w:t>explainability</w:t>
-            </w:r>
-            <w:proofErr w:type="spellEnd"/>
-            <w:r>
-              <w:rPr>
-                <w:rFonts w:asciiTheme="majorHAnsi" w:hAnsiTheme="majorHAnsi" w:cstheme="majorHAnsi"/>
-                <w:color w:val="000000" w:themeColor="text1"/>
-                <w:szCs w:val="22"/>
-              </w:rPr>
-              <w:t>.</w:t>
+                <w:szCs w:val="22"/>
+              </w:rPr>
+              <w:t>Model is lightweight and trained quarterly on shared infrastructure. Energy use is minimal. No external supply-chain dependencies beyond standard compute resources.</w:t>
             </w:r>
           </w:p>
         </w:tc>
@@ -15639,8 +15896,7 @@
                 <w:iCs/>
                 <w:szCs w:val="22"/>
               </w:rPr>
-              <w:lastRenderedPageBreak/>
-              <w:t>13. Communication</w:t>
+              <w:t>18. Social impact</w:t>
             </w:r>
             <w:r>
               <w:rPr>
@@ -15659,7 +15915,7 @@
                 <w:iCs w:val="0"/>
                 <w:szCs w:val="22"/>
               </w:rPr>
-              <w:t>Users must be informed that they are interacting with an AI system. Systems must be identifiable as AI, not appear human, and provide information on capabilities, limitations, and alternatives for human interaction.</w:t>
+              <w:t>AI systems may affect social relationships, wellbeing, or perceptions of social agency; such impacts should be monitored and considered.</w:t>
             </w:r>
           </w:p>
         </w:tc>
@@ -15680,14 +15936,21 @@
                 <w:rFonts w:asciiTheme="majorHAnsi" w:hAnsiTheme="majorHAnsi" w:cstheme="majorHAnsi"/>
                 <w:szCs w:val="22"/>
               </w:rPr>
-              <w:t>Applicants are informed that AI supports screening</w:t>
-            </w:r>
-            <w:r>
-              <w:rPr>
-                <w:rFonts w:asciiTheme="majorHAnsi" w:hAnsiTheme="majorHAnsi" w:cstheme="majorHAnsi"/>
-                <w:szCs w:val="22"/>
-              </w:rPr>
-              <w:t xml:space="preserve"> in terms and condition upon applying</w:t>
+              <w:t xml:space="preserve">Limited social impact: system only supports internal hiring decisions. </w:t>
+            </w:r>
+            <w:r>
+              <w:rPr>
+                <w:rFonts w:asciiTheme="majorHAnsi" w:hAnsiTheme="majorHAnsi" w:cstheme="majorHAnsi"/>
+                <w:szCs w:val="22"/>
+              </w:rPr>
+              <w:t>Fairness assessment</w:t>
+            </w:r>
+            <w:r>
+              <w:rPr>
+                <w:rFonts w:asciiTheme="majorHAnsi" w:hAnsiTheme="majorHAnsi" w:cstheme="majorHAnsi"/>
+                <w:szCs w:val="22"/>
+              </w:rPr>
+              <w:t xml:space="preserve"> ensures it does not reduce workforce diversity or disadvantage particular groups. No behavioural or social interaction functions.</w:t>
             </w:r>
             <w:r>
               <w:rPr>
@@ -15702,7 +15965,7 @@
                 <w:color w:val="EE0000"/>
                 <w:szCs w:val="22"/>
               </w:rPr>
-              <w:t>[</w:t>
+              <w:t xml:space="preserve">VBD ensures that </w:t>
             </w:r>
             <w:r>
               <w:rPr>
@@ -15710,36 +15973,8 @@
                 <w:color w:val="EE0000"/>
                 <w:szCs w:val="22"/>
               </w:rPr>
-              <w:t xml:space="preserve">Users </w:t>
-            </w:r>
-            <w:r>
-              <w:rPr>
-                <w:rFonts w:asciiTheme="majorHAnsi" w:hAnsiTheme="majorHAnsi" w:cstheme="majorHAnsi"/>
-                <w:color w:val="EE0000"/>
-                <w:szCs w:val="22"/>
-              </w:rPr>
-              <w:t>may opt for a full human review]</w:t>
-            </w:r>
-            <w:r>
-              <w:rPr>
-                <w:rFonts w:asciiTheme="majorHAnsi" w:hAnsiTheme="majorHAnsi" w:cstheme="majorHAnsi"/>
-                <w:szCs w:val="22"/>
-              </w:rPr>
-              <w:t>. Internal documentation describes system capabilities and limitations. The system does not mimic human communication</w:t>
-            </w:r>
-            <w:r>
-              <w:rPr>
-                <w:rFonts w:asciiTheme="majorHAnsi" w:hAnsiTheme="majorHAnsi" w:cstheme="majorHAnsi"/>
-                <w:szCs w:val="22"/>
-              </w:rPr>
-              <w:t xml:space="preserve"> (no chatbot-like features)</w:t>
-            </w:r>
-            <w:r>
-              <w:rPr>
-                <w:rFonts w:asciiTheme="majorHAnsi" w:hAnsiTheme="majorHAnsi" w:cstheme="majorHAnsi"/>
-                <w:szCs w:val="22"/>
-              </w:rPr>
-              <w:t>.</w:t>
+              <w:lastRenderedPageBreak/>
+              <w:t>stakeholders’ concerns are explored and considered.</w:t>
             </w:r>
           </w:p>
         </w:tc>
@@ -15754,19 +15989,40 @@
             <w:pPr>
               <w:rPr>
                 <w:rFonts w:asciiTheme="majorHAnsi" w:hAnsiTheme="majorHAnsi" w:cstheme="majorHAnsi"/>
-                <w:b/>
-                <w:bCs/>
-                <w:szCs w:val="22"/>
-              </w:rPr>
-            </w:pPr>
-            <w:r>
-              <w:rPr>
-                <w:rFonts w:asciiTheme="majorHAnsi" w:hAnsiTheme="majorHAnsi" w:cstheme="majorHAnsi"/>
-                <w:b/>
-                <w:bCs/>
-                <w:szCs w:val="22"/>
-              </w:rPr>
-              <w:t>Diversity, Non-Discrimination &amp; Fairness</w:t>
+                <w:i/>
+                <w:iCs/>
+                <w:szCs w:val="22"/>
+              </w:rPr>
+            </w:pPr>
+            <w:r>
+              <w:rPr>
+                <w:rStyle w:val="Strong"/>
+                <w:rFonts w:asciiTheme="majorHAnsi" w:hAnsiTheme="majorHAnsi" w:cstheme="majorHAnsi"/>
+                <w:i/>
+                <w:iCs/>
+                <w:szCs w:val="22"/>
+              </w:rPr>
+              <w:lastRenderedPageBreak/>
+              <w:t>19. Society and democracy</w:t>
+            </w:r>
+            <w:r>
+              <w:rPr>
+                <w:rFonts w:asciiTheme="majorHAnsi" w:hAnsiTheme="majorHAnsi" w:cstheme="majorHAnsi"/>
+                <w:i/>
+                <w:iCs/>
+                <w:szCs w:val="22"/>
+              </w:rPr>
+              <w:t xml:space="preserve"> </w:t>
+            </w:r>
+            <w:r>
+              <w:rPr>
+                <w:rStyle w:val="Emphasis"/>
+                <w:rFonts w:asciiTheme="majorHAnsi" w:hAnsiTheme="majorHAnsi" w:cstheme="majorHAnsi"/>
+                <w:i w:val="0"/>
+                <w:iCs w:val="0"/>
+                <w:szCs w:val="22"/>
+              </w:rPr>
+              <w:t>Beyond individual impacts, AI’s broader societal effects must be assessed, especially regarding institutions, democratic processes, and public trust.</w:t>
             </w:r>
           </w:p>
         </w:tc>
@@ -15782,6 +16038,13 @@
                 <w:szCs w:val="22"/>
               </w:rPr>
             </w:pPr>
+            <w:r>
+              <w:rPr>
+                <w:rFonts w:asciiTheme="majorHAnsi" w:hAnsiTheme="majorHAnsi" w:cstheme="majorHAnsi"/>
+                <w:szCs w:val="22"/>
+              </w:rPr>
+              <w:t>Very low societal or democratic impact: system is used internally by a private employer for candidate screening and has no influence on political processes or public institutions.</w:t>
+            </w:r>
           </w:p>
         </w:tc>
       </w:tr>
@@ -15804,19 +16067,58 @@
               <w:rPr>
                 <w:rStyle w:val="Strong"/>
                 <w:rFonts w:asciiTheme="majorHAnsi" w:hAnsiTheme="majorHAnsi" w:cstheme="majorHAnsi"/>
+              </w:rPr>
+              <w:t>Accountability</w:t>
+            </w:r>
+          </w:p>
+        </w:tc>
+        <w:tc>
+          <w:tcPr>
+            <w:tcW w:w="4253" w:type="dxa"/>
+            <w:vAlign w:val="center"/>
+          </w:tcPr>
+          <w:p>
+            <w:pPr>
+              <w:rPr>
+                <w:rFonts w:asciiTheme="majorHAnsi" w:hAnsiTheme="majorHAnsi" w:cstheme="majorHAnsi"/>
+                <w:szCs w:val="22"/>
+              </w:rPr>
+            </w:pPr>
+          </w:p>
+        </w:tc>
+      </w:tr>
+      <w:tr>
+        <w:tc>
+          <w:tcPr>
+            <w:tcW w:w="4106" w:type="dxa"/>
+            <w:vAlign w:val="center"/>
+          </w:tcPr>
+          <w:p>
+            <w:pPr>
+              <w:rPr>
+                <w:rFonts w:asciiTheme="majorHAnsi" w:hAnsiTheme="majorHAnsi" w:cstheme="majorHAnsi"/>
                 <w:i/>
                 <w:iCs/>
                 <w:szCs w:val="22"/>
               </w:rPr>
-              <w:t>14. Avoidance of unfair bias</w:t>
-            </w:r>
-            <w:r>
-              <w:rPr>
+            </w:pPr>
+            <w:r>
+              <w:rPr>
+                <w:rStyle w:val="Strong"/>
                 <w:rFonts w:asciiTheme="majorHAnsi" w:hAnsiTheme="majorHAnsi" w:cstheme="majorHAnsi"/>
                 <w:i/>
                 <w:iCs/>
                 <w:szCs w:val="22"/>
               </w:rPr>
+              <w:t>20. Auditability</w:t>
+            </w:r>
+            <w:r>
+              <w:rPr>
+                <w:rFonts w:asciiTheme="majorHAnsi" w:hAnsiTheme="majorHAnsi" w:cstheme="majorHAnsi"/>
+                <w:i/>
+                <w:iCs/>
+                <w:szCs w:val="22"/>
+              </w:rPr>
               <w:t xml:space="preserve"> </w:t>
             </w:r>
             <w:r>
@@ -15827,7 +16129,7 @@
                 <w:iCs w:val="0"/>
                 <w:szCs w:val="22"/>
               </w:rPr>
-              <w:t>Training and operational data may contain historic or structural biases that can lead to direct or indirect discrimination. Bias must be identified and mitigated through data quality checks, transparent development processes, and diverse perspectives in system design.</w:t>
+              <w:t>AI systems must enable assessment of algorithms, data, and design processes. Independent auditing should be possible, especially where fundamental rights are affected.</w:t>
             </w:r>
           </w:p>
         </w:tc>
@@ -15848,42 +16150,21 @@
                 <w:rFonts w:asciiTheme="majorHAnsi" w:hAnsiTheme="majorHAnsi" w:cstheme="majorHAnsi"/>
                 <w:szCs w:val="22"/>
               </w:rPr>
-              <w:t xml:space="preserve">Fairness </w:t>
-            </w:r>
-            <w:r>
-              <w:rPr>
-                <w:rFonts w:asciiTheme="majorHAnsi" w:hAnsiTheme="majorHAnsi" w:cstheme="majorHAnsi"/>
-                <w:szCs w:val="22"/>
-              </w:rPr>
-              <w:t>assessment was performed considering sensitive attributes (</w:t>
-            </w:r>
-            <w:r>
-              <w:rPr>
-                <w:rFonts w:asciiTheme="majorHAnsi" w:hAnsiTheme="majorHAnsi" w:cstheme="majorHAnsi"/>
-                <w:szCs w:val="22"/>
-              </w:rPr>
-              <w:t>age and gender</w:t>
-            </w:r>
-            <w:r>
-              <w:rPr>
-                <w:rFonts w:asciiTheme="majorHAnsi" w:hAnsiTheme="majorHAnsi" w:cstheme="majorHAnsi"/>
-                <w:szCs w:val="22"/>
-              </w:rPr>
-              <w:t>)</w:t>
-            </w:r>
-            <w:r>
-              <w:rPr>
-                <w:rFonts w:asciiTheme="majorHAnsi" w:hAnsiTheme="majorHAnsi" w:cstheme="majorHAnsi"/>
-                <w:szCs w:val="22"/>
-              </w:rPr>
-              <w:t xml:space="preserve"> </w:t>
-            </w:r>
-            <w:r>
-              <w:rPr>
-                <w:rFonts w:asciiTheme="majorHAnsi" w:hAnsiTheme="majorHAnsi" w:cstheme="majorHAnsi"/>
-                <w:szCs w:val="22"/>
-              </w:rPr>
-              <w:t xml:space="preserve">with findings documented in Appendix 1: overall moderate fairness within acceptable performance and data availability constraints </w:t>
+              <w:t>All datasets, model versions, preprocessing code, and fairness metrics</w:t>
+            </w:r>
+            <w:r>
+              <w:rPr>
+                <w:rFonts w:asciiTheme="majorHAnsi" w:hAnsiTheme="majorHAnsi" w:cstheme="majorHAnsi"/>
+                <w:szCs w:val="22"/>
+              </w:rPr>
+              <w:t xml:space="preserve"> (see Appendix 1)</w:t>
+            </w:r>
+            <w:r>
+              <w:rPr>
+                <w:rFonts w:asciiTheme="majorHAnsi" w:hAnsiTheme="majorHAnsi" w:cstheme="majorHAnsi"/>
+                <w:szCs w:val="22"/>
+              </w:rPr>
+              <w:t xml:space="preserve"> are documented and accessible for audit. </w:t>
             </w:r>
             <w:r>
               <w:rPr>
@@ -15891,53 +16172,14 @@
                 <w:color w:val="EE0000"/>
                 <w:szCs w:val="22"/>
               </w:rPr>
-              <w:t>[a</w:t>
-            </w:r>
-            <w:r>
-              <w:rPr>
-                <w:rFonts w:asciiTheme="majorHAnsi" w:hAnsiTheme="majorHAnsi" w:cstheme="majorHAnsi"/>
-                <w:color w:val="EE0000"/>
-                <w:szCs w:val="22"/>
-              </w:rPr>
-              <w:t>nd no sensitive-attribute leakage</w:t>
-            </w:r>
-            <w:r>
-              <w:rPr>
-                <w:rFonts w:asciiTheme="majorHAnsi" w:hAnsiTheme="majorHAnsi" w:cstheme="majorHAnsi"/>
-                <w:color w:val="EE0000"/>
-                <w:szCs w:val="22"/>
-              </w:rPr>
-              <w:t>]</w:t>
-            </w:r>
-            <w:r>
-              <w:rPr>
-                <w:rFonts w:asciiTheme="majorHAnsi" w:hAnsiTheme="majorHAnsi" w:cstheme="majorHAnsi"/>
-                <w:color w:val="EE0000"/>
-                <w:szCs w:val="22"/>
-              </w:rPr>
-              <w:t>.</w:t>
-            </w:r>
-            <w:r>
-              <w:rPr>
-                <w:rFonts w:asciiTheme="majorHAnsi" w:hAnsiTheme="majorHAnsi" w:cstheme="majorHAnsi"/>
-                <w:szCs w:val="22"/>
-              </w:rPr>
-              <w:t xml:space="preserve"> </w:t>
-            </w:r>
-            <w:r>
-              <w:rPr>
-                <w:rFonts w:asciiTheme="majorHAnsi" w:hAnsiTheme="majorHAnsi" w:cstheme="majorHAnsi"/>
-                <w:color w:val="EE0000"/>
-                <w:szCs w:val="22"/>
-              </w:rPr>
-              <w:t>Quarterly</w:t>
-            </w:r>
-            <w:r>
-              <w:rPr>
-                <w:rFonts w:asciiTheme="majorHAnsi" w:hAnsiTheme="majorHAnsi" w:cstheme="majorHAnsi"/>
-                <w:szCs w:val="22"/>
-              </w:rPr>
-              <w:t xml:space="preserve"> fairness audits, balanced training data, and HR override reduce risk.</w:t>
+              <w:t>Internal audits performed yearly</w:t>
+            </w:r>
+            <w:r>
+              <w:rPr>
+                <w:rFonts w:asciiTheme="majorHAnsi" w:hAnsiTheme="majorHAnsi" w:cstheme="majorHAnsi"/>
+                <w:szCs w:val="22"/>
+              </w:rPr>
+              <w:t>; system can be independently audited by regulators (AP) if required.</w:t>
             </w:r>
           </w:p>
         </w:tc>
@@ -15965,7 +16207,7 @@
                 <w:iCs/>
                 <w:szCs w:val="22"/>
               </w:rPr>
-              <w:t>15. Accessibility and universal design</w:t>
+              <w:t>21. Minimisation and reporting of negative impacts</w:t>
             </w:r>
             <w:r>
               <w:rPr>
@@ -15984,7 +16226,7 @@
                 <w:iCs w:val="0"/>
                 <w:szCs w:val="22"/>
               </w:rPr>
-              <w:t>AI systems should be user-centric and accessible to all, regardless of age, gender, or ability. Universal design principles should be followed to support equitable access, including for persons with disabilities.</w:t>
+              <w:t>Systems must allow negative impacts to be identified, documented, minimised, and reported. Whistle-blower protections and impact assessments help prevent harm.</w:t>
             </w:r>
           </w:p>
         </w:tc>
@@ -16005,23 +16247,43 @@
                 <w:rFonts w:asciiTheme="majorHAnsi" w:hAnsiTheme="majorHAnsi" w:cstheme="majorHAnsi"/>
                 <w:szCs w:val="22"/>
               </w:rPr>
-              <w:t xml:space="preserve">Applicant notifications and HR tools designed for accessibility; communication available in clear language; alternative manual processes available for </w:t>
-            </w:r>
-            <w:proofErr w:type="gramStart"/>
-            <w:r>
-              <w:rPr>
-                <w:rFonts w:asciiTheme="majorHAnsi" w:hAnsiTheme="majorHAnsi" w:cstheme="majorHAnsi"/>
-                <w:szCs w:val="22"/>
-              </w:rPr>
-              <w:t>candidates</w:t>
-            </w:r>
-            <w:proofErr w:type="gramEnd"/>
-            <w:r>
-              <w:rPr>
-                <w:rFonts w:asciiTheme="majorHAnsi" w:hAnsiTheme="majorHAnsi" w:cstheme="majorHAnsi"/>
-                <w:szCs w:val="22"/>
-              </w:rPr>
-              <w:t xml:space="preserve"> requiring accommodations.</w:t>
+              <w:t xml:space="preserve">Bias incidents or anomalies are documented and escalated to the DPO. Quarterly fairness testing in place. </w:t>
+            </w:r>
+            <w:r>
+              <w:rPr>
+                <w:rFonts w:asciiTheme="majorHAnsi" w:hAnsiTheme="majorHAnsi" w:cstheme="majorHAnsi"/>
+                <w:color w:val="EE0000"/>
+                <w:szCs w:val="22"/>
+              </w:rPr>
+              <w:t xml:space="preserve">Whistleblowing channels exist through HR and DPO. </w:t>
+            </w:r>
+            <w:r>
+              <w:rPr>
+                <w:rFonts w:asciiTheme="majorHAnsi" w:hAnsiTheme="majorHAnsi" w:cstheme="majorHAnsi"/>
+                <w:szCs w:val="22"/>
+              </w:rPr>
+              <w:t>Fundamental rights</w:t>
+            </w:r>
+            <w:r>
+              <w:rPr>
+                <w:rFonts w:asciiTheme="majorHAnsi" w:hAnsiTheme="majorHAnsi" w:cstheme="majorHAnsi"/>
+                <w:szCs w:val="22"/>
+              </w:rPr>
+              <w:t xml:space="preserve"> </w:t>
+            </w:r>
+            <w:r>
+              <w:rPr>
+                <w:rFonts w:asciiTheme="majorHAnsi" w:hAnsiTheme="majorHAnsi" w:cstheme="majorHAnsi"/>
+                <w:szCs w:val="22"/>
+              </w:rPr>
+              <w:t xml:space="preserve">assessment </w:t>
+            </w:r>
+            <w:r>
+              <w:rPr>
+                <w:rFonts w:asciiTheme="majorHAnsi" w:hAnsiTheme="majorHAnsi" w:cstheme="majorHAnsi"/>
+                <w:szCs w:val="22"/>
+              </w:rPr>
+              <w:t>updated when risks change.</w:t>
             </w:r>
           </w:p>
         </w:tc>
@@ -16049,7 +16311,7 @@
                 <w:iCs/>
                 <w:szCs w:val="22"/>
               </w:rPr>
-              <w:t>16. Stakeholder participation</w:t>
+              <w:t>22. Trade-offs</w:t>
             </w:r>
             <w:r>
               <w:rPr>
@@ -16068,7 +16330,7 @@
                 <w:iCs w:val="0"/>
                 <w:szCs w:val="22"/>
               </w:rPr>
-              <w:t>Stakeholders who may be affected should be consulted throughout the AI system’s lifecycle, and feedback should be regularly collected after deployment.</w:t>
+              <w:t>Conflicts between requirements (e.g., accuracy vs. fairness) must be identified, evaluated, justified, documented, and revisited. Unacceptable trade-offs mean the system should not be deployed.</w:t>
             </w:r>
           </w:p>
         </w:tc>
@@ -16087,10 +16349,80 @@
             <w:r>
               <w:rPr>
                 <w:rFonts w:asciiTheme="majorHAnsi" w:hAnsiTheme="majorHAnsi" w:cstheme="majorHAnsi"/>
+                <w:szCs w:val="22"/>
+              </w:rPr>
+              <w:t>Accuracy</w:t>
+            </w:r>
+            <w:r>
+              <w:rPr>
+                <w:rFonts w:asciiTheme="majorHAnsi" w:hAnsiTheme="majorHAnsi" w:cstheme="majorHAnsi"/>
+                <w:szCs w:val="22"/>
+              </w:rPr>
+              <w:t xml:space="preserve"> - </w:t>
+            </w:r>
+            <w:r>
+              <w:rPr>
+                <w:rFonts w:asciiTheme="majorHAnsi" w:hAnsiTheme="majorHAnsi" w:cstheme="majorHAnsi"/>
+                <w:szCs w:val="22"/>
+              </w:rPr>
+              <w:t>fairness trade-off documented</w:t>
+            </w:r>
+            <w:r>
+              <w:rPr>
+                <w:rFonts w:asciiTheme="majorHAnsi" w:hAnsiTheme="majorHAnsi" w:cstheme="majorHAnsi"/>
+                <w:szCs w:val="22"/>
+              </w:rPr>
+              <w:t xml:space="preserve"> in Appendix 1</w:t>
+            </w:r>
+            <w:r>
+              <w:rPr>
+                <w:rFonts w:asciiTheme="majorHAnsi" w:hAnsiTheme="majorHAnsi" w:cstheme="majorHAnsi"/>
+                <w:szCs w:val="22"/>
+              </w:rPr>
+              <w:t xml:space="preserve">: </w:t>
+            </w:r>
+            <w:r>
+              <w:rPr>
+                <w:rFonts w:asciiTheme="majorHAnsi" w:hAnsiTheme="majorHAnsi" w:cstheme="majorHAnsi"/>
+                <w:szCs w:val="22"/>
+              </w:rPr>
+              <w:t>test show a trade-off</w:t>
+            </w:r>
+            <w:r>
+              <w:rPr>
+                <w:rFonts w:asciiTheme="majorHAnsi" w:hAnsiTheme="majorHAnsi" w:cstheme="majorHAnsi"/>
+                <w:szCs w:val="22"/>
+              </w:rPr>
+              <w:t xml:space="preserve"> </w:t>
+            </w:r>
+            <w:r>
+              <w:rPr>
+                <w:rFonts w:asciiTheme="majorHAnsi" w:hAnsiTheme="majorHAnsi" w:cstheme="majorHAnsi"/>
+                <w:szCs w:val="22"/>
+              </w:rPr>
+              <w:t xml:space="preserve">where discrimination avoidance leads to </w:t>
+            </w:r>
+            <w:r>
+              <w:rPr>
+                <w:rFonts w:asciiTheme="majorHAnsi" w:hAnsiTheme="majorHAnsi" w:cstheme="majorHAnsi"/>
+                <w:szCs w:val="22"/>
+              </w:rPr>
+              <w:t xml:space="preserve">slightly lower accuracy. All trade-offs reviewed </w:t>
+            </w:r>
+            <w:r>
+              <w:rPr>
+                <w:rFonts w:asciiTheme="majorHAnsi" w:hAnsiTheme="majorHAnsi" w:cstheme="majorHAnsi"/>
                 <w:color w:val="EE0000"/>
                 <w:szCs w:val="22"/>
               </w:rPr>
-              <w:t xml:space="preserve">Survey-based </w:t>
+              <w:t xml:space="preserve">annually </w:t>
+            </w:r>
+            <w:r>
+              <w:rPr>
+                <w:rFonts w:asciiTheme="majorHAnsi" w:hAnsiTheme="majorHAnsi" w:cstheme="majorHAnsi"/>
+                <w:szCs w:val="22"/>
+              </w:rPr>
+              <w:t xml:space="preserve">and documented in the </w:t>
             </w:r>
             <w:r>
               <w:rPr>
@@ -16098,70 +16430,14 @@
                 <w:color w:val="EE0000"/>
                 <w:szCs w:val="22"/>
               </w:rPr>
-              <w:t xml:space="preserve">Value Based Design </w:t>
-            </w:r>
-            <w:r>
-              <w:rPr>
-                <w:rFonts w:asciiTheme="majorHAnsi" w:hAnsiTheme="majorHAnsi" w:cstheme="majorHAnsi"/>
-                <w:color w:val="EE0000"/>
-                <w:szCs w:val="22"/>
-              </w:rPr>
-              <w:t xml:space="preserve">(VBD) </w:t>
-            </w:r>
-            <w:r>
-              <w:rPr>
-                <w:rFonts w:asciiTheme="majorHAnsi" w:hAnsiTheme="majorHAnsi" w:cstheme="majorHAnsi"/>
-                <w:color w:val="EE0000"/>
-                <w:szCs w:val="22"/>
-              </w:rPr>
-              <w:t xml:space="preserve">was performed to </w:t>
-            </w:r>
-            <w:proofErr w:type="spellStart"/>
-            <w:r>
-              <w:rPr>
-                <w:rFonts w:asciiTheme="majorHAnsi" w:hAnsiTheme="majorHAnsi" w:cstheme="majorHAnsi"/>
-                <w:color w:val="EE0000"/>
-                <w:szCs w:val="22"/>
-              </w:rPr>
-              <w:t>elicitate</w:t>
-            </w:r>
-            <w:proofErr w:type="spellEnd"/>
-            <w:r>
-              <w:rPr>
-                <w:rFonts w:asciiTheme="majorHAnsi" w:hAnsiTheme="majorHAnsi" w:cstheme="majorHAnsi"/>
-                <w:color w:val="EE0000"/>
-                <w:szCs w:val="22"/>
-              </w:rPr>
-              <w:t xml:space="preserve"> stakeholders’ requirements prior to deployment.</w:t>
-            </w:r>
-            <w:r>
-              <w:rPr>
-                <w:rFonts w:asciiTheme="majorHAnsi" w:hAnsiTheme="majorHAnsi" w:cstheme="majorHAnsi"/>
-                <w:szCs w:val="22"/>
-              </w:rPr>
-              <w:t xml:space="preserve"> </w:t>
-            </w:r>
-            <w:r>
-              <w:rPr>
-                <w:rFonts w:asciiTheme="majorHAnsi" w:hAnsiTheme="majorHAnsi" w:cstheme="majorHAnsi"/>
-                <w:szCs w:val="22"/>
-              </w:rPr>
-              <w:t xml:space="preserve">HR staff, </w:t>
-            </w:r>
-            <w:r>
-              <w:rPr>
-                <w:rFonts w:asciiTheme="majorHAnsi" w:hAnsiTheme="majorHAnsi" w:cstheme="majorHAnsi"/>
-                <w:color w:val="EE0000"/>
-                <w:szCs w:val="22"/>
-              </w:rPr>
-              <w:t>works council</w:t>
-            </w:r>
-            <w:r>
-              <w:rPr>
-                <w:rFonts w:asciiTheme="majorHAnsi" w:hAnsiTheme="majorHAnsi" w:cstheme="majorHAnsi"/>
-                <w:szCs w:val="22"/>
-              </w:rPr>
-              <w:t>, and DPO consulted during deployment. Annual review includes feedback from HR users and management. Applicants can provide feedback or request human review.</w:t>
+              <w:t>AI governance register</w:t>
+            </w:r>
+            <w:r>
+              <w:rPr>
+                <w:rFonts w:asciiTheme="majorHAnsi" w:hAnsiTheme="majorHAnsi" w:cstheme="majorHAnsi"/>
+                <w:szCs w:val="22"/>
+              </w:rPr>
+              <w:t>.</w:t>
             </w:r>
           </w:p>
         </w:tc>
@@ -16176,19 +16452,39 @@
             <w:pPr>
               <w:rPr>
                 <w:rFonts w:asciiTheme="majorHAnsi" w:hAnsiTheme="majorHAnsi" w:cstheme="majorHAnsi"/>
-                <w:b/>
-                <w:bCs/>
-                <w:szCs w:val="22"/>
-              </w:rPr>
-            </w:pPr>
-            <w:r>
-              <w:rPr>
-                <w:rFonts w:asciiTheme="majorHAnsi" w:hAnsiTheme="majorHAnsi" w:cstheme="majorHAnsi"/>
-                <w:b/>
-                <w:bCs/>
-                <w:szCs w:val="22"/>
-              </w:rPr>
-              <w:t>Societal &amp; Environmental Well-being</w:t>
+                <w:i/>
+                <w:iCs/>
+                <w:szCs w:val="22"/>
+              </w:rPr>
+            </w:pPr>
+            <w:r>
+              <w:rPr>
+                <w:rStyle w:val="Strong"/>
+                <w:rFonts w:asciiTheme="majorHAnsi" w:hAnsiTheme="majorHAnsi" w:cstheme="majorHAnsi"/>
+                <w:i/>
+                <w:iCs/>
+                <w:szCs w:val="22"/>
+              </w:rPr>
+              <w:t>23. Redress</w:t>
+            </w:r>
+            <w:r>
+              <w:rPr>
+                <w:rFonts w:asciiTheme="majorHAnsi" w:hAnsiTheme="majorHAnsi" w:cstheme="majorHAnsi"/>
+                <w:i/>
+                <w:iCs/>
+                <w:szCs w:val="22"/>
+              </w:rPr>
+              <w:t xml:space="preserve"> </w:t>
+            </w:r>
+            <w:r>
+              <w:rPr>
+                <w:rStyle w:val="Emphasis"/>
+                <w:rFonts w:asciiTheme="majorHAnsi" w:hAnsiTheme="majorHAnsi" w:cstheme="majorHAnsi"/>
+                <w:i w:val="0"/>
+                <w:iCs w:val="0"/>
+                <w:szCs w:val="22"/>
+              </w:rPr>
+              <w:t>Accessible mechanisms must exist for individuals to obtain redress when unjust harm occurs, with particular attention to vulnerable groups.</w:t>
             </w:r>
           </w:p>
         </w:tc>
@@ -16204,805 +16500,6 @@
                 <w:szCs w:val="22"/>
               </w:rPr>
             </w:pPr>
-          </w:p>
-        </w:tc>
-      </w:tr>
-      <w:tr>
-        <w:tc>
-          <w:tcPr>
-            <w:tcW w:w="4106" w:type="dxa"/>
-            <w:vAlign w:val="center"/>
-          </w:tcPr>
-          <w:p>
-            <w:pPr>
-              <w:rPr>
-                <w:rFonts w:asciiTheme="majorHAnsi" w:hAnsiTheme="majorHAnsi" w:cstheme="majorHAnsi"/>
-                <w:i/>
-                <w:iCs/>
-                <w:szCs w:val="22"/>
-              </w:rPr>
-            </w:pPr>
-            <w:r>
-              <w:rPr>
-                <w:rStyle w:val="Strong"/>
-                <w:rFonts w:asciiTheme="majorHAnsi" w:hAnsiTheme="majorHAnsi" w:cstheme="majorHAnsi"/>
-                <w:i/>
-                <w:iCs/>
-                <w:szCs w:val="22"/>
-              </w:rPr>
-              <w:t>17. Sustainable and environmentally friendly AI</w:t>
-            </w:r>
-            <w:r>
-              <w:rPr>
-                <w:rFonts w:asciiTheme="majorHAnsi" w:hAnsiTheme="majorHAnsi" w:cstheme="majorHAnsi"/>
-                <w:i/>
-                <w:iCs/>
-                <w:szCs w:val="22"/>
-              </w:rPr>
-              <w:t xml:space="preserve"> </w:t>
-            </w:r>
-            <w:proofErr w:type="spellStart"/>
-            <w:r>
-              <w:rPr>
-                <w:rStyle w:val="Emphasis"/>
-                <w:rFonts w:asciiTheme="majorHAnsi" w:hAnsiTheme="majorHAnsi" w:cstheme="majorHAnsi"/>
-                <w:i w:val="0"/>
-                <w:iCs w:val="0"/>
-                <w:szCs w:val="22"/>
-              </w:rPr>
-              <w:t>AI</w:t>
-            </w:r>
-            <w:proofErr w:type="spellEnd"/>
-            <w:r>
-              <w:rPr>
-                <w:rStyle w:val="Emphasis"/>
-                <w:rFonts w:asciiTheme="majorHAnsi" w:hAnsiTheme="majorHAnsi" w:cstheme="majorHAnsi"/>
-                <w:i w:val="0"/>
-                <w:iCs w:val="0"/>
-                <w:szCs w:val="22"/>
-              </w:rPr>
-              <w:t xml:space="preserve"> systems should minimise environmental impact by limiting energy use during development and deployment, assessing the supply chain, and choosing less harmful options wherever possible.</w:t>
-            </w:r>
-          </w:p>
-        </w:tc>
-        <w:tc>
-          <w:tcPr>
-            <w:tcW w:w="4253" w:type="dxa"/>
-            <w:vAlign w:val="center"/>
-          </w:tcPr>
-          <w:p>
-            <w:pPr>
-              <w:rPr>
-                <w:rFonts w:asciiTheme="majorHAnsi" w:hAnsiTheme="majorHAnsi" w:cstheme="majorHAnsi"/>
-                <w:szCs w:val="22"/>
-              </w:rPr>
-            </w:pPr>
-            <w:r>
-              <w:rPr>
-                <w:rFonts w:asciiTheme="majorHAnsi" w:hAnsiTheme="majorHAnsi" w:cstheme="majorHAnsi"/>
-                <w:color w:val="EE0000"/>
-                <w:szCs w:val="22"/>
-              </w:rPr>
-              <w:t>[LOGISTIC REGREGSSION</w:t>
-            </w:r>
-            <w:r>
-              <w:rPr>
-                <w:rFonts w:asciiTheme="majorHAnsi" w:hAnsiTheme="majorHAnsi" w:cstheme="majorHAnsi"/>
-                <w:color w:val="EE0000"/>
-                <w:szCs w:val="22"/>
-              </w:rPr>
-              <w:t xml:space="preserve">, </w:t>
-            </w:r>
-            <w:r>
-              <w:rPr>
-                <w:rFonts w:asciiTheme="majorHAnsi" w:hAnsiTheme="majorHAnsi" w:cstheme="majorHAnsi"/>
-                <w:color w:val="EE0000"/>
-                <w:szCs w:val="22"/>
-              </w:rPr>
-              <w:t>the employed AI model do</w:t>
-            </w:r>
-            <w:r>
-              <w:rPr>
-                <w:rFonts w:asciiTheme="majorHAnsi" w:hAnsiTheme="majorHAnsi" w:cstheme="majorHAnsi"/>
-                <w:color w:val="EE0000"/>
-                <w:szCs w:val="22"/>
-              </w:rPr>
-              <w:t>es</w:t>
-            </w:r>
-            <w:r>
-              <w:rPr>
-                <w:rFonts w:asciiTheme="majorHAnsi" w:hAnsiTheme="majorHAnsi" w:cstheme="majorHAnsi"/>
-                <w:color w:val="EE0000"/>
-                <w:szCs w:val="22"/>
-              </w:rPr>
-              <w:t xml:space="preserve"> not rely on large datasets (‘big data’) nor complex system architectures (such as LLMs) and therefore do not compute-intensive in training nor usage</w:t>
-            </w:r>
-            <w:proofErr w:type="gramStart"/>
-            <w:r>
-              <w:rPr>
-                <w:rFonts w:asciiTheme="majorHAnsi" w:hAnsiTheme="majorHAnsi" w:cstheme="majorHAnsi"/>
-                <w:color w:val="EE0000"/>
-                <w:szCs w:val="22"/>
-              </w:rPr>
-              <w:t>.</w:t>
-            </w:r>
-            <w:r>
-              <w:rPr>
-                <w:rFonts w:asciiTheme="majorHAnsi" w:hAnsiTheme="majorHAnsi" w:cstheme="majorHAnsi"/>
-                <w:color w:val="EE0000"/>
-                <w:szCs w:val="22"/>
-              </w:rPr>
-              <w:t xml:space="preserve"> </w:t>
-            </w:r>
-            <w:r>
-              <w:rPr>
-                <w:rFonts w:asciiTheme="majorHAnsi" w:hAnsiTheme="majorHAnsi" w:cstheme="majorHAnsi"/>
-                <w:color w:val="EE0000"/>
-                <w:szCs w:val="22"/>
-              </w:rPr>
-              <w:t>]</w:t>
-            </w:r>
-            <w:proofErr w:type="gramEnd"/>
-            <w:r>
-              <w:rPr>
-                <w:rFonts w:asciiTheme="majorHAnsi" w:hAnsiTheme="majorHAnsi" w:cstheme="majorHAnsi"/>
-                <w:szCs w:val="22"/>
-              </w:rPr>
-              <w:t xml:space="preserve"> </w:t>
-            </w:r>
-            <w:r>
-              <w:rPr>
-                <w:rFonts w:asciiTheme="majorHAnsi" w:hAnsiTheme="majorHAnsi" w:cstheme="majorHAnsi"/>
-                <w:szCs w:val="22"/>
-              </w:rPr>
-              <w:t>Model is lightweight and trained quarterly on shared infrastructure. Energy use is minimal. No external supply-chain dependencies beyond standard compute resources.</w:t>
-            </w:r>
-          </w:p>
-        </w:tc>
-      </w:tr>
-      <w:tr>
-        <w:tc>
-          <w:tcPr>
-            <w:tcW w:w="4106" w:type="dxa"/>
-            <w:vAlign w:val="center"/>
-          </w:tcPr>
-          <w:p>
-            <w:pPr>
-              <w:rPr>
-                <w:rFonts w:asciiTheme="majorHAnsi" w:hAnsiTheme="majorHAnsi" w:cstheme="majorHAnsi"/>
-                <w:i/>
-                <w:iCs/>
-                <w:szCs w:val="22"/>
-              </w:rPr>
-            </w:pPr>
-            <w:r>
-              <w:rPr>
-                <w:rStyle w:val="Strong"/>
-                <w:rFonts w:asciiTheme="majorHAnsi" w:hAnsiTheme="majorHAnsi" w:cstheme="majorHAnsi"/>
-                <w:i/>
-                <w:iCs/>
-                <w:szCs w:val="22"/>
-              </w:rPr>
-              <w:t>18. Social impact</w:t>
-            </w:r>
-            <w:r>
-              <w:rPr>
-                <w:rFonts w:asciiTheme="majorHAnsi" w:hAnsiTheme="majorHAnsi" w:cstheme="majorHAnsi"/>
-                <w:i/>
-                <w:iCs/>
-                <w:szCs w:val="22"/>
-              </w:rPr>
-              <w:t xml:space="preserve"> </w:t>
-            </w:r>
-            <w:r>
-              <w:rPr>
-                <w:rStyle w:val="Emphasis"/>
-                <w:rFonts w:asciiTheme="majorHAnsi" w:hAnsiTheme="majorHAnsi" w:cstheme="majorHAnsi"/>
-                <w:i w:val="0"/>
-                <w:iCs w:val="0"/>
-                <w:szCs w:val="22"/>
-              </w:rPr>
-              <w:t>AI systems may affect social relationships, wellbeing, or perceptions of social agency; such impacts should be monitored and considered.</w:t>
-            </w:r>
-          </w:p>
-        </w:tc>
-        <w:tc>
-          <w:tcPr>
-            <w:tcW w:w="4253" w:type="dxa"/>
-            <w:vAlign w:val="center"/>
-          </w:tcPr>
-          <w:p>
-            <w:pPr>
-              <w:rPr>
-                <w:rFonts w:asciiTheme="majorHAnsi" w:hAnsiTheme="majorHAnsi" w:cstheme="majorHAnsi"/>
-                <w:szCs w:val="22"/>
-              </w:rPr>
-            </w:pPr>
-            <w:r>
-              <w:rPr>
-                <w:rFonts w:asciiTheme="majorHAnsi" w:hAnsiTheme="majorHAnsi" w:cstheme="majorHAnsi"/>
-                <w:szCs w:val="22"/>
-              </w:rPr>
-              <w:t xml:space="preserve">Limited social impact: system only supports internal hiring decisions. </w:t>
-            </w:r>
-            <w:r>
-              <w:rPr>
-                <w:rFonts w:asciiTheme="majorHAnsi" w:hAnsiTheme="majorHAnsi" w:cstheme="majorHAnsi"/>
-                <w:szCs w:val="22"/>
-              </w:rPr>
-              <w:t>Fairness assessment</w:t>
-            </w:r>
-            <w:r>
-              <w:rPr>
-                <w:rFonts w:asciiTheme="majorHAnsi" w:hAnsiTheme="majorHAnsi" w:cstheme="majorHAnsi"/>
-                <w:szCs w:val="22"/>
-              </w:rPr>
-              <w:t xml:space="preserve"> ensures it does not reduce workforce diversity or disadvantage particular groups. No behavioural or social interaction functions.</w:t>
-            </w:r>
-            <w:r>
-              <w:rPr>
-                <w:rFonts w:asciiTheme="majorHAnsi" w:hAnsiTheme="majorHAnsi" w:cstheme="majorHAnsi"/>
-                <w:szCs w:val="22"/>
-              </w:rPr>
-              <w:t xml:space="preserve"> </w:t>
-            </w:r>
-            <w:r>
-              <w:rPr>
-                <w:rFonts w:asciiTheme="majorHAnsi" w:hAnsiTheme="majorHAnsi" w:cstheme="majorHAnsi"/>
-                <w:color w:val="EE0000"/>
-                <w:szCs w:val="22"/>
-              </w:rPr>
-              <w:t xml:space="preserve">VBD ensures that </w:t>
-            </w:r>
-            <w:r>
-              <w:rPr>
-                <w:rFonts w:asciiTheme="majorHAnsi" w:hAnsiTheme="majorHAnsi" w:cstheme="majorHAnsi"/>
-                <w:color w:val="EE0000"/>
-                <w:szCs w:val="22"/>
-              </w:rPr>
-              <w:lastRenderedPageBreak/>
-              <w:t>stakeholders’ concerns are explored and considered.</w:t>
-            </w:r>
-          </w:p>
-        </w:tc>
-      </w:tr>
-      <w:tr>
-        <w:tc>
-          <w:tcPr>
-            <w:tcW w:w="4106" w:type="dxa"/>
-            <w:vAlign w:val="center"/>
-          </w:tcPr>
-          <w:p>
-            <w:pPr>
-              <w:rPr>
-                <w:rFonts w:asciiTheme="majorHAnsi" w:hAnsiTheme="majorHAnsi" w:cstheme="majorHAnsi"/>
-                <w:i/>
-                <w:iCs/>
-                <w:szCs w:val="22"/>
-              </w:rPr>
-            </w:pPr>
-            <w:r>
-              <w:rPr>
-                <w:rStyle w:val="Strong"/>
-                <w:rFonts w:asciiTheme="majorHAnsi" w:hAnsiTheme="majorHAnsi" w:cstheme="majorHAnsi"/>
-                <w:i/>
-                <w:iCs/>
-                <w:szCs w:val="22"/>
-              </w:rPr>
-              <w:lastRenderedPageBreak/>
-              <w:t>19. Society and democracy</w:t>
-            </w:r>
-            <w:r>
-              <w:rPr>
-                <w:rFonts w:asciiTheme="majorHAnsi" w:hAnsiTheme="majorHAnsi" w:cstheme="majorHAnsi"/>
-                <w:i/>
-                <w:iCs/>
-                <w:szCs w:val="22"/>
-              </w:rPr>
-              <w:t xml:space="preserve"> </w:t>
-            </w:r>
-            <w:r>
-              <w:rPr>
-                <w:rStyle w:val="Emphasis"/>
-                <w:rFonts w:asciiTheme="majorHAnsi" w:hAnsiTheme="majorHAnsi" w:cstheme="majorHAnsi"/>
-                <w:i w:val="0"/>
-                <w:iCs w:val="0"/>
-                <w:szCs w:val="22"/>
-              </w:rPr>
-              <w:t>Beyond individual impacts, AI’s broader societal effects must be assessed, especially regarding institutions, democratic processes, and public trust.</w:t>
-            </w:r>
-          </w:p>
-        </w:tc>
-        <w:tc>
-          <w:tcPr>
-            <w:tcW w:w="4253" w:type="dxa"/>
-            <w:vAlign w:val="center"/>
-          </w:tcPr>
-          <w:p>
-            <w:pPr>
-              <w:rPr>
-                <w:rFonts w:asciiTheme="majorHAnsi" w:hAnsiTheme="majorHAnsi" w:cstheme="majorHAnsi"/>
-                <w:szCs w:val="22"/>
-              </w:rPr>
-            </w:pPr>
-            <w:r>
-              <w:rPr>
-                <w:rFonts w:asciiTheme="majorHAnsi" w:hAnsiTheme="majorHAnsi" w:cstheme="majorHAnsi"/>
-                <w:szCs w:val="22"/>
-              </w:rPr>
-              <w:t>Very low societal or democratic impact: system is used internally by a private employer for candidate screening and has no influence on political processes or public institutions.</w:t>
-            </w:r>
-          </w:p>
-        </w:tc>
-      </w:tr>
-      <w:tr>
-        <w:tc>
-          <w:tcPr>
-            <w:tcW w:w="4106" w:type="dxa"/>
-            <w:vAlign w:val="center"/>
-          </w:tcPr>
-          <w:p>
-            <w:pPr>
-              <w:rPr>
-                <w:rFonts w:asciiTheme="majorHAnsi" w:hAnsiTheme="majorHAnsi" w:cstheme="majorHAnsi"/>
-                <w:i/>
-                <w:iCs/>
-                <w:szCs w:val="22"/>
-              </w:rPr>
-            </w:pPr>
-            <w:r>
-              <w:rPr>
-                <w:rStyle w:val="Strong"/>
-                <w:rFonts w:asciiTheme="majorHAnsi" w:hAnsiTheme="majorHAnsi" w:cstheme="majorHAnsi"/>
-              </w:rPr>
-              <w:t>Accountability</w:t>
-            </w:r>
-          </w:p>
-        </w:tc>
-        <w:tc>
-          <w:tcPr>
-            <w:tcW w:w="4253" w:type="dxa"/>
-            <w:vAlign w:val="center"/>
-          </w:tcPr>
-          <w:p>
-            <w:pPr>
-              <w:rPr>
-                <w:rFonts w:asciiTheme="majorHAnsi" w:hAnsiTheme="majorHAnsi" w:cstheme="majorHAnsi"/>
-                <w:szCs w:val="22"/>
-              </w:rPr>
-            </w:pPr>
-          </w:p>
-        </w:tc>
-      </w:tr>
-      <w:tr>
-        <w:tc>
-          <w:tcPr>
-            <w:tcW w:w="4106" w:type="dxa"/>
-            <w:vAlign w:val="center"/>
-          </w:tcPr>
-          <w:p>
-            <w:pPr>
-              <w:rPr>
-                <w:rFonts w:asciiTheme="majorHAnsi" w:hAnsiTheme="majorHAnsi" w:cstheme="majorHAnsi"/>
-                <w:i/>
-                <w:iCs/>
-                <w:szCs w:val="22"/>
-              </w:rPr>
-            </w:pPr>
-            <w:r>
-              <w:rPr>
-                <w:rStyle w:val="Strong"/>
-                <w:rFonts w:asciiTheme="majorHAnsi" w:hAnsiTheme="majorHAnsi" w:cstheme="majorHAnsi"/>
-                <w:i/>
-                <w:iCs/>
-                <w:szCs w:val="22"/>
-              </w:rPr>
-              <w:t>20. Auditability</w:t>
-            </w:r>
-            <w:r>
-              <w:rPr>
-                <w:rFonts w:asciiTheme="majorHAnsi" w:hAnsiTheme="majorHAnsi" w:cstheme="majorHAnsi"/>
-                <w:i/>
-                <w:iCs/>
-                <w:szCs w:val="22"/>
-              </w:rPr>
-              <w:t xml:space="preserve"> </w:t>
-            </w:r>
-            <w:r>
-              <w:rPr>
-                <w:rStyle w:val="Emphasis"/>
-                <w:rFonts w:asciiTheme="majorHAnsi" w:hAnsiTheme="majorHAnsi" w:cstheme="majorHAnsi"/>
-                <w:i w:val="0"/>
-                <w:iCs w:val="0"/>
-                <w:szCs w:val="22"/>
-              </w:rPr>
-              <w:t>AI systems must enable assessment of algorithms, data, and design processes. Independent auditing should be possible, especially where fundamental rights are affected.</w:t>
-            </w:r>
-          </w:p>
-        </w:tc>
-        <w:tc>
-          <w:tcPr>
-            <w:tcW w:w="4253" w:type="dxa"/>
-            <w:vAlign w:val="center"/>
-          </w:tcPr>
-          <w:p>
-            <w:pPr>
-              <w:rPr>
-                <w:rFonts w:asciiTheme="majorHAnsi" w:hAnsiTheme="majorHAnsi" w:cstheme="majorHAnsi"/>
-                <w:szCs w:val="22"/>
-              </w:rPr>
-            </w:pPr>
-            <w:r>
-              <w:rPr>
-                <w:rFonts w:asciiTheme="majorHAnsi" w:hAnsiTheme="majorHAnsi" w:cstheme="majorHAnsi"/>
-                <w:szCs w:val="22"/>
-              </w:rPr>
-              <w:t xml:space="preserve">All datasets, model versions, </w:t>
-            </w:r>
-            <w:proofErr w:type="spellStart"/>
-            <w:r>
-              <w:rPr>
-                <w:rFonts w:asciiTheme="majorHAnsi" w:hAnsiTheme="majorHAnsi" w:cstheme="majorHAnsi"/>
-                <w:szCs w:val="22"/>
-              </w:rPr>
-              <w:t>preprocessing</w:t>
-            </w:r>
-            <w:proofErr w:type="spellEnd"/>
-            <w:r>
-              <w:rPr>
-                <w:rFonts w:asciiTheme="majorHAnsi" w:hAnsiTheme="majorHAnsi" w:cstheme="majorHAnsi"/>
-                <w:szCs w:val="22"/>
-              </w:rPr>
-              <w:t xml:space="preserve"> code, and fairness metrics</w:t>
-            </w:r>
-            <w:r>
-              <w:rPr>
-                <w:rFonts w:asciiTheme="majorHAnsi" w:hAnsiTheme="majorHAnsi" w:cstheme="majorHAnsi"/>
-                <w:szCs w:val="22"/>
-              </w:rPr>
-              <w:t xml:space="preserve"> (see Appendix 1)</w:t>
-            </w:r>
-            <w:r>
-              <w:rPr>
-                <w:rFonts w:asciiTheme="majorHAnsi" w:hAnsiTheme="majorHAnsi" w:cstheme="majorHAnsi"/>
-                <w:szCs w:val="22"/>
-              </w:rPr>
-              <w:t xml:space="preserve"> are documented and accessible for audit. </w:t>
-            </w:r>
-            <w:r>
-              <w:rPr>
-                <w:rFonts w:asciiTheme="majorHAnsi" w:hAnsiTheme="majorHAnsi" w:cstheme="majorHAnsi"/>
-                <w:color w:val="EE0000"/>
-                <w:szCs w:val="22"/>
-              </w:rPr>
-              <w:t>Internal audits performed yearly</w:t>
-            </w:r>
-            <w:r>
-              <w:rPr>
-                <w:rFonts w:asciiTheme="majorHAnsi" w:hAnsiTheme="majorHAnsi" w:cstheme="majorHAnsi"/>
-                <w:szCs w:val="22"/>
-              </w:rPr>
-              <w:t>; system can be independently audited by regulators (AP) if required.</w:t>
-            </w:r>
-          </w:p>
-        </w:tc>
-      </w:tr>
-      <w:tr>
-        <w:tc>
-          <w:tcPr>
-            <w:tcW w:w="4106" w:type="dxa"/>
-            <w:vAlign w:val="center"/>
-          </w:tcPr>
-          <w:p>
-            <w:pPr>
-              <w:rPr>
-                <w:rFonts w:asciiTheme="majorHAnsi" w:hAnsiTheme="majorHAnsi" w:cstheme="majorHAnsi"/>
-                <w:i/>
-                <w:iCs/>
-                <w:szCs w:val="22"/>
-              </w:rPr>
-            </w:pPr>
-            <w:r>
-              <w:rPr>
-                <w:rStyle w:val="Strong"/>
-                <w:rFonts w:asciiTheme="majorHAnsi" w:hAnsiTheme="majorHAnsi" w:cstheme="majorHAnsi"/>
-                <w:i/>
-                <w:iCs/>
-                <w:szCs w:val="22"/>
-              </w:rPr>
-              <w:t>21. Minimisation and reporting of negative impacts</w:t>
-            </w:r>
-            <w:r>
-              <w:rPr>
-                <w:rFonts w:asciiTheme="majorHAnsi" w:hAnsiTheme="majorHAnsi" w:cstheme="majorHAnsi"/>
-                <w:i/>
-                <w:iCs/>
-                <w:szCs w:val="22"/>
-              </w:rPr>
-              <w:t xml:space="preserve"> </w:t>
-            </w:r>
-            <w:r>
-              <w:rPr>
-                <w:rStyle w:val="Emphasis"/>
-                <w:rFonts w:asciiTheme="majorHAnsi" w:hAnsiTheme="majorHAnsi" w:cstheme="majorHAnsi"/>
-                <w:i w:val="0"/>
-                <w:iCs w:val="0"/>
-                <w:szCs w:val="22"/>
-              </w:rPr>
-              <w:t>Systems must allow negative impacts to be identified, documented, minimised, and reported. Whistle-blower protections and impact assessments help prevent harm.</w:t>
-            </w:r>
-          </w:p>
-        </w:tc>
-        <w:tc>
-          <w:tcPr>
-            <w:tcW w:w="4253" w:type="dxa"/>
-            <w:vAlign w:val="center"/>
-          </w:tcPr>
-          <w:p>
-            <w:pPr>
-              <w:rPr>
-                <w:rFonts w:asciiTheme="majorHAnsi" w:hAnsiTheme="majorHAnsi" w:cstheme="majorHAnsi"/>
-                <w:szCs w:val="22"/>
-              </w:rPr>
-            </w:pPr>
-            <w:r>
-              <w:rPr>
-                <w:rFonts w:asciiTheme="majorHAnsi" w:hAnsiTheme="majorHAnsi" w:cstheme="majorHAnsi"/>
-                <w:szCs w:val="22"/>
-              </w:rPr>
-              <w:t xml:space="preserve">Bias incidents or anomalies are documented and escalated to the DPO. Quarterly fairness testing in place. </w:t>
-            </w:r>
-            <w:r>
-              <w:rPr>
-                <w:rFonts w:asciiTheme="majorHAnsi" w:hAnsiTheme="majorHAnsi" w:cstheme="majorHAnsi"/>
-                <w:color w:val="EE0000"/>
-                <w:szCs w:val="22"/>
-              </w:rPr>
-              <w:t xml:space="preserve">Whistleblowing channels exist through HR and DPO. </w:t>
-            </w:r>
-            <w:r>
-              <w:rPr>
-                <w:rFonts w:asciiTheme="majorHAnsi" w:hAnsiTheme="majorHAnsi" w:cstheme="majorHAnsi"/>
-                <w:szCs w:val="22"/>
-              </w:rPr>
-              <w:t>Fundamental rights</w:t>
-            </w:r>
-            <w:r>
-              <w:rPr>
-                <w:rFonts w:asciiTheme="majorHAnsi" w:hAnsiTheme="majorHAnsi" w:cstheme="majorHAnsi"/>
-                <w:szCs w:val="22"/>
-              </w:rPr>
-              <w:t xml:space="preserve"> </w:t>
-            </w:r>
-            <w:r>
-              <w:rPr>
-                <w:rFonts w:asciiTheme="majorHAnsi" w:hAnsiTheme="majorHAnsi" w:cstheme="majorHAnsi"/>
-                <w:szCs w:val="22"/>
-              </w:rPr>
-              <w:t xml:space="preserve">assessment </w:t>
-            </w:r>
-            <w:r>
-              <w:rPr>
-                <w:rFonts w:asciiTheme="majorHAnsi" w:hAnsiTheme="majorHAnsi" w:cstheme="majorHAnsi"/>
-                <w:szCs w:val="22"/>
-              </w:rPr>
-              <w:t>updated when risks change.</w:t>
-            </w:r>
-          </w:p>
-        </w:tc>
-      </w:tr>
-      <w:tr>
-        <w:tc>
-          <w:tcPr>
-            <w:tcW w:w="4106" w:type="dxa"/>
-            <w:vAlign w:val="center"/>
-          </w:tcPr>
-          <w:p>
-            <w:pPr>
-              <w:rPr>
-                <w:rFonts w:asciiTheme="majorHAnsi" w:hAnsiTheme="majorHAnsi" w:cstheme="majorHAnsi"/>
-                <w:i/>
-                <w:iCs/>
-                <w:szCs w:val="22"/>
-              </w:rPr>
-            </w:pPr>
-            <w:r>
-              <w:rPr>
-                <w:rStyle w:val="Strong"/>
-                <w:rFonts w:asciiTheme="majorHAnsi" w:hAnsiTheme="majorHAnsi" w:cstheme="majorHAnsi"/>
-                <w:i/>
-                <w:iCs/>
-                <w:szCs w:val="22"/>
-              </w:rPr>
-              <w:t>22. Trade-offs</w:t>
-            </w:r>
-            <w:r>
-              <w:rPr>
-                <w:rFonts w:asciiTheme="majorHAnsi" w:hAnsiTheme="majorHAnsi" w:cstheme="majorHAnsi"/>
-                <w:i/>
-                <w:iCs/>
-                <w:szCs w:val="22"/>
-              </w:rPr>
-              <w:t xml:space="preserve"> </w:t>
-            </w:r>
-            <w:r>
-              <w:rPr>
-                <w:rStyle w:val="Emphasis"/>
-                <w:rFonts w:asciiTheme="majorHAnsi" w:hAnsiTheme="majorHAnsi" w:cstheme="majorHAnsi"/>
-                <w:i w:val="0"/>
-                <w:iCs w:val="0"/>
-                <w:szCs w:val="22"/>
-              </w:rPr>
-              <w:t>Conflicts between requirements (e.g., accuracy vs. fairness) must be identified, evaluated, justified, documented, and revisited. Unacceptable trade-offs mean the system should not be deployed.</w:t>
-            </w:r>
-          </w:p>
-        </w:tc>
-        <w:tc>
-          <w:tcPr>
-            <w:tcW w:w="4253" w:type="dxa"/>
-            <w:vAlign w:val="center"/>
-          </w:tcPr>
-          <w:p>
-            <w:pPr>
-              <w:rPr>
-                <w:rFonts w:asciiTheme="majorHAnsi" w:hAnsiTheme="majorHAnsi" w:cstheme="majorHAnsi"/>
-                <w:szCs w:val="22"/>
-              </w:rPr>
-            </w:pPr>
-            <w:r>
-              <w:rPr>
-                <w:rFonts w:asciiTheme="majorHAnsi" w:hAnsiTheme="majorHAnsi" w:cstheme="majorHAnsi"/>
-                <w:szCs w:val="22"/>
-              </w:rPr>
-              <w:t>Accuracy</w:t>
-            </w:r>
-            <w:r>
-              <w:rPr>
-                <w:rFonts w:asciiTheme="majorHAnsi" w:hAnsiTheme="majorHAnsi" w:cstheme="majorHAnsi"/>
-                <w:szCs w:val="22"/>
-              </w:rPr>
-              <w:t xml:space="preserve"> - </w:t>
-            </w:r>
-            <w:r>
-              <w:rPr>
-                <w:rFonts w:asciiTheme="majorHAnsi" w:hAnsiTheme="majorHAnsi" w:cstheme="majorHAnsi"/>
-                <w:szCs w:val="22"/>
-              </w:rPr>
-              <w:t>fairness trade-off documented</w:t>
-            </w:r>
-            <w:r>
-              <w:rPr>
-                <w:rFonts w:asciiTheme="majorHAnsi" w:hAnsiTheme="majorHAnsi" w:cstheme="majorHAnsi"/>
-                <w:szCs w:val="22"/>
-              </w:rPr>
-              <w:t xml:space="preserve"> in Appendix 1</w:t>
-            </w:r>
-            <w:r>
-              <w:rPr>
-                <w:rFonts w:asciiTheme="majorHAnsi" w:hAnsiTheme="majorHAnsi" w:cstheme="majorHAnsi"/>
-                <w:szCs w:val="22"/>
-              </w:rPr>
-              <w:t xml:space="preserve">: </w:t>
-            </w:r>
-            <w:r>
-              <w:rPr>
-                <w:rFonts w:asciiTheme="majorHAnsi" w:hAnsiTheme="majorHAnsi" w:cstheme="majorHAnsi"/>
-                <w:szCs w:val="22"/>
-              </w:rPr>
-              <w:t>test show a trade-off</w:t>
-            </w:r>
-            <w:r>
-              <w:rPr>
-                <w:rFonts w:asciiTheme="majorHAnsi" w:hAnsiTheme="majorHAnsi" w:cstheme="majorHAnsi"/>
-                <w:szCs w:val="22"/>
-              </w:rPr>
-              <w:t xml:space="preserve"> </w:t>
-            </w:r>
-            <w:r>
-              <w:rPr>
-                <w:rFonts w:asciiTheme="majorHAnsi" w:hAnsiTheme="majorHAnsi" w:cstheme="majorHAnsi"/>
-                <w:szCs w:val="22"/>
-              </w:rPr>
-              <w:t xml:space="preserve">where discrimination avoidance leads to </w:t>
-            </w:r>
-            <w:r>
-              <w:rPr>
-                <w:rFonts w:asciiTheme="majorHAnsi" w:hAnsiTheme="majorHAnsi" w:cstheme="majorHAnsi"/>
-                <w:szCs w:val="22"/>
-              </w:rPr>
-              <w:t xml:space="preserve">slightly lower accuracy. All trade-offs reviewed </w:t>
-            </w:r>
-            <w:r>
-              <w:rPr>
-                <w:rFonts w:asciiTheme="majorHAnsi" w:hAnsiTheme="majorHAnsi" w:cstheme="majorHAnsi"/>
-                <w:color w:val="EE0000"/>
-                <w:szCs w:val="22"/>
-              </w:rPr>
-              <w:t xml:space="preserve">annually </w:t>
-            </w:r>
-            <w:r>
-              <w:rPr>
-                <w:rFonts w:asciiTheme="majorHAnsi" w:hAnsiTheme="majorHAnsi" w:cstheme="majorHAnsi"/>
-                <w:szCs w:val="22"/>
-              </w:rPr>
-              <w:t xml:space="preserve">and documented in the </w:t>
-            </w:r>
-            <w:r>
-              <w:rPr>
-                <w:rFonts w:asciiTheme="majorHAnsi" w:hAnsiTheme="majorHAnsi" w:cstheme="majorHAnsi"/>
-                <w:color w:val="EE0000"/>
-                <w:szCs w:val="22"/>
-              </w:rPr>
-              <w:t>AI governance register</w:t>
-            </w:r>
-            <w:r>
-              <w:rPr>
-                <w:rFonts w:asciiTheme="majorHAnsi" w:hAnsiTheme="majorHAnsi" w:cstheme="majorHAnsi"/>
-                <w:szCs w:val="22"/>
-              </w:rPr>
-              <w:t>.</w:t>
-            </w:r>
-          </w:p>
-        </w:tc>
-      </w:tr>
-      <w:tr>
-        <w:tc>
-          <w:tcPr>
-            <w:tcW w:w="4106" w:type="dxa"/>
-            <w:vAlign w:val="center"/>
-          </w:tcPr>
-          <w:p>
-            <w:pPr>
-              <w:rPr>
-                <w:rFonts w:asciiTheme="majorHAnsi" w:hAnsiTheme="majorHAnsi" w:cstheme="majorHAnsi"/>
-                <w:i/>
-                <w:iCs/>
-                <w:szCs w:val="22"/>
-              </w:rPr>
-            </w:pPr>
-            <w:r>
-              <w:rPr>
-                <w:rStyle w:val="Strong"/>
-                <w:rFonts w:asciiTheme="majorHAnsi" w:hAnsiTheme="majorHAnsi" w:cstheme="majorHAnsi"/>
-                <w:i/>
-                <w:iCs/>
-                <w:szCs w:val="22"/>
-              </w:rPr>
-              <w:t>23. Redress</w:t>
-            </w:r>
-            <w:r>
-              <w:rPr>
-                <w:rFonts w:asciiTheme="majorHAnsi" w:hAnsiTheme="majorHAnsi" w:cstheme="majorHAnsi"/>
-                <w:i/>
-                <w:iCs/>
-                <w:szCs w:val="22"/>
-              </w:rPr>
-              <w:t xml:space="preserve"> </w:t>
-            </w:r>
-            <w:r>
-              <w:rPr>
-                <w:rStyle w:val="Emphasis"/>
-                <w:rFonts w:asciiTheme="majorHAnsi" w:hAnsiTheme="majorHAnsi" w:cstheme="majorHAnsi"/>
-                <w:i w:val="0"/>
-                <w:iCs w:val="0"/>
-                <w:szCs w:val="22"/>
-              </w:rPr>
-              <w:t>Accessible mechanisms must exist for individuals to obtain redress when unjust harm occurs, with particular attention to vulnerable groups.</w:t>
-            </w:r>
-          </w:p>
-        </w:tc>
-        <w:tc>
-          <w:tcPr>
-            <w:tcW w:w="4253" w:type="dxa"/>
-            <w:vAlign w:val="center"/>
-          </w:tcPr>
-          <w:p>
-            <w:pPr>
-              <w:rPr>
-                <w:rFonts w:asciiTheme="majorHAnsi" w:hAnsiTheme="majorHAnsi" w:cstheme="majorHAnsi"/>
-                <w:szCs w:val="22"/>
-              </w:rPr>
-            </w:pPr>
             <w:r>
               <w:rPr>
                 <w:rFonts w:asciiTheme="majorHAnsi" w:hAnsiTheme="majorHAnsi" w:cstheme="majorHAnsi"/>
@@ -17062,9 +16559,9 @@
       </w:pPr>
     </w:p>
     <w:sectPr>
-      <w:headerReference w:type="default" r:id="rId24"/>
-      <w:footerReference w:type="even" r:id="rId25"/>
-      <w:footerReference w:type="default" r:id="rId26"/>
+      <w:headerReference w:type="default" r:id="rId25"/>
+      <w:footerReference w:type="even" r:id="rId26"/>
+      <w:footerReference w:type="default" r:id="rId27"/>
       <w:pgSz w:w="11900" w:h="16840"/>
       <w:pgMar w:top="1440" w:right="1800" w:bottom="1440" w:left="1800" w:header="708" w:footer="708" w:gutter="0"/>
       <w:cols w:space="708"/>
@@ -17075,7 +16572,7 @@
 </file>
 
 <file path=word/endnotes.xml><?xml version="1.0" encoding="utf-8"?>
-<w:endnotes xmlns:wpc="http://schemas.microsoft.com/office/word/2010/wordprocessingCanvas" xmlns:cx="http://schemas.microsoft.com/office/drawing/2014/chartex" xmlns:cx1="http://schemas.microsoft.com/office/drawing/2015/9/8/chartex" xmlns:cx2="http://schemas.microsoft.com/office/drawing/2015/10/21/chartex" xmlns:cx3="http://schemas.microsoft.com/office/drawing/2016/5/9/chartex" xmlns:cx4="http://schemas.microsoft.com/office/drawing/2016/5/10/chartex" xmlns:cx5="http://schemas.microsoft.com/office/drawing/2016/5/11/chartex" xmlns:cx6="http://schemas.microsoft.com/office/drawing/2016/5/12/chartex" xmlns:cx7="http://schemas.microsoft.com/office/drawing/2016/5/13/chartex" xmlns:cx8="http://schemas.microsoft.com/office/drawing/2016/5/14/chartex" xmlns:mc="http://schemas.openxmlformats.org/markup-compatibility/2006" xmlns:aink="http://schemas.microsoft.com/office/drawing/2016/ink" xmlns:am3d="http://schemas.microsoft.com/office/drawing/2017/model3d" xmlns:o="urn:schemas-microsoft-com:office:office" xmlns:oel="http://schemas.microsoft.com/office/2019/extlst" xmlns:r="http://schemas.openxmlformats.org/officeDocument/2006/relationships" xmlns:m="http://schemas.openxmlformats.org/officeDocument/2006/math" xmlns:v="urn:schemas-microsoft-com:vml" xmlns:wp14="http://schemas.microsoft.com/office/word/2010/wordprocessingDrawing" xmlns:wp="http://schemas.openxmlformats.org/drawingml/2006/wordprocessingDrawing" xmlns:w10="urn:schemas-microsoft-com:office:word" xmlns:w="http://schemas.openxmlformats.org/wordprocessingml/2006/main" xmlns:w14="http://schemas.microsoft.com/office/word/2010/wordml" xmlns:w15="http://schemas.microsoft.com/office/word/2012/wordml" xmlns:w16cex="http://schemas.microsoft.com/office/word/2018/wordml/cex" xmlns:w16cid="http://schemas.microsoft.com/office/word/2016/wordml/cid" xmlns:w16="http://schemas.microsoft.com/office/word/2018/wordml" xmlns:w16sdtdh="http://schemas.microsoft.com/office/word/2020/wordml/sdtdatahash" xmlns:w16se="http://schemas.microsoft.com/office/word/2015/wordml/symex" xmlns:wpg="http://schemas.microsoft.com/office/word/2010/wordprocessingGroup" xmlns:wpi="http://schemas.microsoft.com/office/word/2010/wordprocessingInk" xmlns:wne="http://schemas.microsoft.com/office/word/2006/wordml" xmlns:wps="http://schemas.microsoft.com/office/word/2010/wordprocessingShape" mc:Ignorable="w14 w15 w16se w16cid w16 w16cex w16sdtdh wp14">
+<w:endnotes xmlns:wpc="http://schemas.microsoft.com/office/word/2010/wordprocessingCanvas" xmlns:cx="http://schemas.microsoft.com/office/drawing/2014/chartex" xmlns:cx1="http://schemas.microsoft.com/office/drawing/2015/9/8/chartex" xmlns:cx2="http://schemas.microsoft.com/office/drawing/2015/10/21/chartex" xmlns:cx3="http://schemas.microsoft.com/office/drawing/2016/5/9/chartex" xmlns:cx4="http://schemas.microsoft.com/office/drawing/2016/5/10/chartex" xmlns:cx5="http://schemas.microsoft.com/office/drawing/2016/5/11/chartex" xmlns:cx6="http://schemas.microsoft.com/office/drawing/2016/5/12/chartex" xmlns:cx7="http://schemas.microsoft.com/office/drawing/2016/5/13/chartex" xmlns:cx8="http://schemas.microsoft.com/office/drawing/2016/5/14/chartex" xmlns:mc="http://schemas.openxmlformats.org/markup-compatibility/2006" xmlns:aink="http://schemas.microsoft.com/office/drawing/2016/ink" xmlns:am3d="http://schemas.microsoft.com/office/drawing/2017/model3d" xmlns:o="urn:schemas-microsoft-com:office:office" xmlns:oel="http://schemas.microsoft.com/office/2019/extlst" xmlns:r="http://schemas.openxmlformats.org/officeDocument/2006/relationships" xmlns:m="http://schemas.openxmlformats.org/officeDocument/2006/math" xmlns:v="urn:schemas-microsoft-com:vml" xmlns:wp14="http://schemas.microsoft.com/office/word/2010/wordprocessingDrawing" xmlns:wp="http://schemas.openxmlformats.org/drawingml/2006/wordprocessingDrawing" xmlns:w10="urn:schemas-microsoft-com:office:word" xmlns:w="http://schemas.openxmlformats.org/wordprocessingml/2006/main" xmlns:w14="http://schemas.microsoft.com/office/word/2010/wordml" xmlns:w15="http://schemas.microsoft.com/office/word/2012/wordml" xmlns:w16cex="http://schemas.microsoft.com/office/word/2018/wordml/cex" xmlns:w16cid="http://schemas.microsoft.com/office/word/2016/wordml/cid" xmlns:w16="http://schemas.microsoft.com/office/word/2018/wordml" xmlns:w16du="http://schemas.microsoft.com/office/word/2023/wordml/word16du" xmlns:w16sdtdh="http://schemas.microsoft.com/office/word/2020/wordml/sdtdatahash" xmlns:w16sdtfl="http://schemas.microsoft.com/office/word/2024/wordml/sdtformatlock" xmlns:w16se="http://schemas.microsoft.com/office/word/2015/wordml/symex" xmlns:wpg="http://schemas.microsoft.com/office/word/2010/wordprocessingGroup" xmlns:wpi="http://schemas.microsoft.com/office/word/2010/wordprocessingInk" xmlns:wne="http://schemas.microsoft.com/office/word/2006/wordml" xmlns:wps="http://schemas.microsoft.com/office/word/2010/wordprocessingShape" mc:Ignorable="w14 w15 w16se w16cid w16 w16cex w16sdtdh w16sdtfl w16du wp14">
   <w:endnote w:type="separator" w:id="-1">
     <w:p>
       <w:r>
@@ -17094,7 +16591,7 @@
 </file>
 
 <file path=word/footer1.xml><?xml version="1.0" encoding="utf-8"?>
-<w:ftr xmlns:wpc="http://schemas.microsoft.com/office/word/2010/wordprocessingCanvas" xmlns:cx="http://schemas.microsoft.com/office/drawing/2014/chartex" xmlns:cx1="http://schemas.microsoft.com/office/drawing/2015/9/8/chartex" xmlns:cx2="http://schemas.microsoft.com/office/drawing/2015/10/21/chartex" xmlns:cx3="http://schemas.microsoft.com/office/drawing/2016/5/9/chartex" xmlns:cx4="http://schemas.microsoft.com/office/drawing/2016/5/10/chartex" xmlns:cx5="http://schemas.microsoft.com/office/drawing/2016/5/11/chartex" xmlns:cx6="http://schemas.microsoft.com/office/drawing/2016/5/12/chartex" xmlns:cx7="http://schemas.microsoft.com/office/drawing/2016/5/13/chartex" xmlns:cx8="http://schemas.microsoft.com/office/drawing/2016/5/14/chartex" xmlns:mc="http://schemas.openxmlformats.org/markup-compatibility/2006" xmlns:aink="http://schemas.microsoft.com/office/drawing/2016/ink" xmlns:am3d="http://schemas.microsoft.com/office/drawing/2017/model3d" xmlns:o="urn:schemas-microsoft-com:office:office" xmlns:oel="http://schemas.microsoft.com/office/2019/extlst" xmlns:r="http://schemas.openxmlformats.org/officeDocument/2006/relationships" xmlns:m="http://schemas.openxmlformats.org/officeDocument/2006/math" xmlns:v="urn:schemas-microsoft-com:vml" xmlns:wp14="http://schemas.microsoft.com/office/word/2010/wordprocessingDrawing" xmlns:wp="http://schemas.openxmlformats.org/drawingml/2006/wordprocessingDrawing" xmlns:w10="urn:schemas-microsoft-com:office:word" xmlns:w="http://schemas.openxmlformats.org/wordprocessingml/2006/main" xmlns:w14="http://schemas.microsoft.com/office/word/2010/wordml" xmlns:w15="http://schemas.microsoft.com/office/word/2012/wordml" xmlns:w16cex="http://schemas.microsoft.com/office/word/2018/wordml/cex" xmlns:w16cid="http://schemas.microsoft.com/office/word/2016/wordml/cid" xmlns:w16="http://schemas.microsoft.com/office/word/2018/wordml" xmlns:w16sdtdh="http://schemas.microsoft.com/office/word/2020/wordml/sdtdatahash" xmlns:w16se="http://schemas.microsoft.com/office/word/2015/wordml/symex" xmlns:wpg="http://schemas.microsoft.com/office/word/2010/wordprocessingGroup" xmlns:wpi="http://schemas.microsoft.com/office/word/2010/wordprocessingInk" xmlns:wne="http://schemas.microsoft.com/office/word/2006/wordml" xmlns:wps="http://schemas.microsoft.com/office/word/2010/wordprocessingShape" mc:Ignorable="w14 w15 w16se w16cid w16 w16cex w16sdtdh wp14">
+<w:ftr xmlns:wpc="http://schemas.microsoft.com/office/word/2010/wordprocessingCanvas" xmlns:cx="http://schemas.microsoft.com/office/drawing/2014/chartex" xmlns:cx1="http://schemas.microsoft.com/office/drawing/2015/9/8/chartex" xmlns:cx2="http://schemas.microsoft.com/office/drawing/2015/10/21/chartex" xmlns:cx3="http://schemas.microsoft.com/office/drawing/2016/5/9/chartex" xmlns:cx4="http://schemas.microsoft.com/office/drawing/2016/5/10/chartex" xmlns:cx5="http://schemas.microsoft.com/office/drawing/2016/5/11/chartex" xmlns:cx6="http://schemas.microsoft.com/office/drawing/2016/5/12/chartex" xmlns:cx7="http://schemas.microsoft.com/office/drawing/2016/5/13/chartex" xmlns:cx8="http://schemas.microsoft.com/office/drawing/2016/5/14/chartex" xmlns:mc="http://schemas.openxmlformats.org/markup-compatibility/2006" xmlns:aink="http://schemas.microsoft.com/office/drawing/2016/ink" xmlns:am3d="http://schemas.microsoft.com/office/drawing/2017/model3d" xmlns:o="urn:schemas-microsoft-com:office:office" xmlns:oel="http://schemas.microsoft.com/office/2019/extlst" xmlns:r="http://schemas.openxmlformats.org/officeDocument/2006/relationships" xmlns:m="http://schemas.openxmlformats.org/officeDocument/2006/math" xmlns:v="urn:schemas-microsoft-com:vml" xmlns:wp14="http://schemas.microsoft.com/office/word/2010/wordprocessingDrawing" xmlns:wp="http://schemas.openxmlformats.org/drawingml/2006/wordprocessingDrawing" xmlns:w10="urn:schemas-microsoft-com:office:word" xmlns:w="http://schemas.openxmlformats.org/wordprocessingml/2006/main" xmlns:w14="http://schemas.microsoft.com/office/word/2010/wordml" xmlns:w15="http://schemas.microsoft.com/office/word/2012/wordml" xmlns:w16cex="http://schemas.microsoft.com/office/word/2018/wordml/cex" xmlns:w16cid="http://schemas.microsoft.com/office/word/2016/wordml/cid" xmlns:w16="http://schemas.microsoft.com/office/word/2018/wordml" xmlns:w16du="http://schemas.microsoft.com/office/word/2023/wordml/word16du" xmlns:w16sdtdh="http://schemas.microsoft.com/office/word/2020/wordml/sdtdatahash" xmlns:w16sdtfl="http://schemas.microsoft.com/office/word/2024/wordml/sdtformatlock" xmlns:w16se="http://schemas.microsoft.com/office/word/2015/wordml/symex" xmlns:wpg="http://schemas.microsoft.com/office/word/2010/wordprocessingGroup" xmlns:wpi="http://schemas.microsoft.com/office/word/2010/wordprocessingInk" xmlns:wne="http://schemas.microsoft.com/office/word/2006/wordml" xmlns:wps="http://schemas.microsoft.com/office/word/2010/wordprocessingShape" mc:Ignorable="w14 w15 w16se w16cid w16 w16cex w16sdtdh w16sdtfl w16du wp14">
   <w:p>
     <w:pPr>
       <w:pStyle w:val="Footer"/>
@@ -17131,7 +16628,7 @@
 </file>
 
 <file path=word/footer2.xml><?xml version="1.0" encoding="utf-8"?>
-<w:ftr xmlns:wpc="http://schemas.microsoft.com/office/word/2010/wordprocessingCanvas" xmlns:cx="http://schemas.microsoft.com/office/drawing/2014/chartex" xmlns:cx1="http://schemas.microsoft.com/office/drawing/2015/9/8/chartex" xmlns:cx2="http://schemas.microsoft.com/office/drawing/2015/10/21/chartex" xmlns:cx3="http://schemas.microsoft.com/office/drawing/2016/5/9/chartex" xmlns:cx4="http://schemas.microsoft.com/office/drawing/2016/5/10/chartex" xmlns:cx5="http://schemas.microsoft.com/office/drawing/2016/5/11/chartex" xmlns:cx6="http://schemas.microsoft.com/office/drawing/2016/5/12/chartex" xmlns:cx7="http://schemas.microsoft.com/office/drawing/2016/5/13/chartex" xmlns:cx8="http://schemas.microsoft.com/office/drawing/2016/5/14/chartex" xmlns:mc="http://schemas.openxmlformats.org/markup-compatibility/2006" xmlns:aink="http://schemas.microsoft.com/office/drawing/2016/ink" xmlns:am3d="http://schemas.microsoft.com/office/drawing/2017/model3d" xmlns:o="urn:schemas-microsoft-com:office:office" xmlns:oel="http://schemas.microsoft.com/office/2019/extlst" xmlns:r="http://schemas.openxmlformats.org/officeDocument/2006/relationships" xmlns:m="http://schemas.openxmlformats.org/officeDocument/2006/math" xmlns:v="urn:schemas-microsoft-com:vml" xmlns:wp14="http://schemas.microsoft.com/office/word/2010/wordprocessingDrawing" xmlns:wp="http://schemas.openxmlformats.org/drawingml/2006/wordprocessingDrawing" xmlns:w10="urn:schemas-microsoft-com:office:word" xmlns:w="http://schemas.openxmlformats.org/wordprocessingml/2006/main" xmlns:w14="http://schemas.microsoft.com/office/word/2010/wordml" xmlns:w15="http://schemas.microsoft.com/office/word/2012/wordml" xmlns:w16cex="http://schemas.microsoft.com/office/word/2018/wordml/cex" xmlns:w16cid="http://schemas.microsoft.com/office/word/2016/wordml/cid" xmlns:w16="http://schemas.microsoft.com/office/word/2018/wordml" xmlns:w16sdtdh="http://schemas.microsoft.com/office/word/2020/wordml/sdtdatahash" xmlns:w16se="http://schemas.microsoft.com/office/word/2015/wordml/symex" xmlns:wpg="http://schemas.microsoft.com/office/word/2010/wordprocessingGroup" xmlns:wpi="http://schemas.microsoft.com/office/word/2010/wordprocessingInk" xmlns:wne="http://schemas.microsoft.com/office/word/2006/wordml" xmlns:wps="http://schemas.microsoft.com/office/word/2010/wordprocessingShape" mc:Ignorable="w14 w15 w16se w16cid w16 w16cex w16sdtdh wp14">
+<w:ftr xmlns:wpc="http://schemas.microsoft.com/office/word/2010/wordprocessingCanvas" xmlns:cx="http://schemas.microsoft.com/office/drawing/2014/chartex" xmlns:cx1="http://schemas.microsoft.com/office/drawing/2015/9/8/chartex" xmlns:cx2="http://schemas.microsoft.com/office/drawing/2015/10/21/chartex" xmlns:cx3="http://schemas.microsoft.com/office/drawing/2016/5/9/chartex" xmlns:cx4="http://schemas.microsoft.com/office/drawing/2016/5/10/chartex" xmlns:cx5="http://schemas.microsoft.com/office/drawing/2016/5/11/chartex" xmlns:cx6="http://schemas.microsoft.com/office/drawing/2016/5/12/chartex" xmlns:cx7="http://schemas.microsoft.com/office/drawing/2016/5/13/chartex" xmlns:cx8="http://schemas.microsoft.com/office/drawing/2016/5/14/chartex" xmlns:mc="http://schemas.openxmlformats.org/markup-compatibility/2006" xmlns:aink="http://schemas.microsoft.com/office/drawing/2016/ink" xmlns:am3d="http://schemas.microsoft.com/office/drawing/2017/model3d" xmlns:o="urn:schemas-microsoft-com:office:office" xmlns:oel="http://schemas.microsoft.com/office/2019/extlst" xmlns:r="http://schemas.openxmlformats.org/officeDocument/2006/relationships" xmlns:m="http://schemas.openxmlformats.org/officeDocument/2006/math" xmlns:v="urn:schemas-microsoft-com:vml" xmlns:wp14="http://schemas.microsoft.com/office/word/2010/wordprocessingDrawing" xmlns:wp="http://schemas.openxmlformats.org/drawingml/2006/wordprocessingDrawing" xmlns:w10="urn:schemas-microsoft-com:office:word" xmlns:w="http://schemas.openxmlformats.org/wordprocessingml/2006/main" xmlns:w14="http://schemas.microsoft.com/office/word/2010/wordml" xmlns:w15="http://schemas.microsoft.com/office/word/2012/wordml" xmlns:w16cex="http://schemas.microsoft.com/office/word/2018/wordml/cex" xmlns:w16cid="http://schemas.microsoft.com/office/word/2016/wordml/cid" xmlns:w16="http://schemas.microsoft.com/office/word/2018/wordml" xmlns:w16du="http://schemas.microsoft.com/office/word/2023/wordml/word16du" xmlns:w16sdtdh="http://schemas.microsoft.com/office/word/2020/wordml/sdtdatahash" xmlns:w16sdtfl="http://schemas.microsoft.com/office/word/2024/wordml/sdtformatlock" xmlns:w16se="http://schemas.microsoft.com/office/word/2015/wordml/symex" xmlns:wpg="http://schemas.microsoft.com/office/word/2010/wordprocessingGroup" xmlns:wpi="http://schemas.microsoft.com/office/word/2010/wordprocessingInk" xmlns:wne="http://schemas.microsoft.com/office/word/2006/wordml" xmlns:wps="http://schemas.microsoft.com/office/word/2010/wordprocessingShape" mc:Ignorable="w14 w15 w16se w16cid w16 w16cex w16sdtdh w16sdtfl w16du wp14">
   <w:p>
     <w:pPr>
       <w:pStyle w:val="Footer"/>
@@ -17180,7 +16677,7 @@
 </file>
 
 <file path=word/footnotes.xml><?xml version="1.0" encoding="utf-8"?>
-<w:footnotes xmlns:wpc="http://schemas.microsoft.com/office/word/2010/wordprocessingCanvas" xmlns:cx="http://schemas.microsoft.com/office/drawing/2014/chartex" xmlns:cx1="http://schemas.microsoft.com/office/drawing/2015/9/8/chartex" xmlns:cx2="http://schemas.microsoft.com/office/drawing/2015/10/21/chartex" xmlns:cx3="http://schemas.microsoft.com/office/drawing/2016/5/9/chartex" xmlns:cx4="http://schemas.microsoft.com/office/drawing/2016/5/10/chartex" xmlns:cx5="http://schemas.microsoft.com/office/drawing/2016/5/11/chartex" xmlns:cx6="http://schemas.microsoft.com/office/drawing/2016/5/12/chartex" xmlns:cx7="http://schemas.microsoft.com/office/drawing/2016/5/13/chartex" xmlns:cx8="http://schemas.microsoft.com/office/drawing/2016/5/14/chartex" xmlns:mc="http://schemas.openxmlformats.org/markup-compatibility/2006" xmlns:aink="http://schemas.microsoft.com/office/drawing/2016/ink" xmlns:am3d="http://schemas.microsoft.com/office/drawing/2017/model3d" xmlns:o="urn:schemas-microsoft-com:office:office" xmlns:oel="http://schemas.microsoft.com/office/2019/extlst" xmlns:r="http://schemas.openxmlformats.org/officeDocument/2006/relationships" xmlns:m="http://schemas.openxmlformats.org/officeDocument/2006/math" xmlns:v="urn:schemas-microsoft-com:vml" xmlns:wp14="http://schemas.microsoft.com/office/word/2010/wordprocessingDrawing" xmlns:wp="http://schemas.openxmlformats.org/drawingml/2006/wordprocessingDrawing" xmlns:w10="urn:schemas-microsoft-com:office:word" xmlns:w="http://schemas.openxmlformats.org/wordprocessingml/2006/main" xmlns:w14="http://schemas.microsoft.com/office/word/2010/wordml" xmlns:w15="http://schemas.microsoft.com/office/word/2012/wordml" xmlns:w16cex="http://schemas.microsoft.com/office/word/2018/wordml/cex" xmlns:w16cid="http://schemas.microsoft.com/office/word/2016/wordml/cid" xmlns:w16="http://schemas.microsoft.com/office/word/2018/wordml" xmlns:w16sdtdh="http://schemas.microsoft.com/office/word/2020/wordml/sdtdatahash" xmlns:w16se="http://schemas.microsoft.com/office/word/2015/wordml/symex" xmlns:wpg="http://schemas.microsoft.com/office/word/2010/wordprocessingGroup" xmlns:wpi="http://schemas.microsoft.com/office/word/2010/wordprocessingInk" xmlns:wne="http://schemas.microsoft.com/office/word/2006/wordml" xmlns:wps="http://schemas.microsoft.com/office/word/2010/wordprocessingShape" mc:Ignorable="w14 w15 w16se w16cid w16 w16cex w16sdtdh wp14">
+<w:footnotes xmlns:wpc="http://schemas.microsoft.com/office/word/2010/wordprocessingCanvas" xmlns:cx="http://schemas.microsoft.com/office/drawing/2014/chartex" xmlns:cx1="http://schemas.microsoft.com/office/drawing/2015/9/8/chartex" xmlns:cx2="http://schemas.microsoft.com/office/drawing/2015/10/21/chartex" xmlns:cx3="http://schemas.microsoft.com/office/drawing/2016/5/9/chartex" xmlns:cx4="http://schemas.microsoft.com/office/drawing/2016/5/10/chartex" xmlns:cx5="http://schemas.microsoft.com/office/drawing/2016/5/11/chartex" xmlns:cx6="http://schemas.microsoft.com/office/drawing/2016/5/12/chartex" xmlns:cx7="http://schemas.microsoft.com/office/drawing/2016/5/13/chartex" xmlns:cx8="http://schemas.microsoft.com/office/drawing/2016/5/14/chartex" xmlns:mc="http://schemas.openxmlformats.org/markup-compatibility/2006" xmlns:aink="http://schemas.microsoft.com/office/drawing/2016/ink" xmlns:am3d="http://schemas.microsoft.com/office/drawing/2017/model3d" xmlns:o="urn:schemas-microsoft-com:office:office" xmlns:oel="http://schemas.microsoft.com/office/2019/extlst" xmlns:r="http://schemas.openxmlformats.org/officeDocument/2006/relationships" xmlns:m="http://schemas.openxmlformats.org/officeDocument/2006/math" xmlns:v="urn:schemas-microsoft-com:vml" xmlns:wp14="http://schemas.microsoft.com/office/word/2010/wordprocessingDrawing" xmlns:wp="http://schemas.openxmlformats.org/drawingml/2006/wordprocessingDrawing" xmlns:w10="urn:schemas-microsoft-com:office:word" xmlns:w="http://schemas.openxmlformats.org/wordprocessingml/2006/main" xmlns:w14="http://schemas.microsoft.com/office/word/2010/wordml" xmlns:w15="http://schemas.microsoft.com/office/word/2012/wordml" xmlns:w16cex="http://schemas.microsoft.com/office/word/2018/wordml/cex" xmlns:w16cid="http://schemas.microsoft.com/office/word/2016/wordml/cid" xmlns:w16="http://schemas.microsoft.com/office/word/2018/wordml" xmlns:w16du="http://schemas.microsoft.com/office/word/2023/wordml/word16du" xmlns:w16sdtdh="http://schemas.microsoft.com/office/word/2020/wordml/sdtdatahash" xmlns:w16sdtfl="http://schemas.microsoft.com/office/word/2024/wordml/sdtformatlock" xmlns:w16se="http://schemas.microsoft.com/office/word/2015/wordml/symex" xmlns:wpg="http://schemas.microsoft.com/office/word/2010/wordprocessingGroup" xmlns:wpi="http://schemas.microsoft.com/office/word/2010/wordprocessingInk" xmlns:wne="http://schemas.microsoft.com/office/word/2006/wordml" xmlns:wps="http://schemas.microsoft.com/office/word/2010/wordprocessingShape" mc:Ignorable="w14 w15 w16se w16cid w16 w16cex w16sdtdh w16sdtfl w16du wp14">
   <w:footnote w:type="separator" w:id="-1">
     <w:p>
       <w:r>
@@ -17199,7 +16696,7 @@
 </file>
 
 <file path=word/header1.xml><?xml version="1.0" encoding="utf-8"?>
-<w:hdr xmlns:wpc="http://schemas.microsoft.com/office/word/2010/wordprocessingCanvas" xmlns:cx="http://schemas.microsoft.com/office/drawing/2014/chartex" xmlns:cx1="http://schemas.microsoft.com/office/drawing/2015/9/8/chartex" xmlns:cx2="http://schemas.microsoft.com/office/drawing/2015/10/21/chartex" xmlns:cx3="http://schemas.microsoft.com/office/drawing/2016/5/9/chartex" xmlns:cx4="http://schemas.microsoft.com/office/drawing/2016/5/10/chartex" xmlns:cx5="http://schemas.microsoft.com/office/drawing/2016/5/11/chartex" xmlns:cx6="http://schemas.microsoft.com/office/drawing/2016/5/12/chartex" xmlns:cx7="http://schemas.microsoft.com/office/drawing/2016/5/13/chartex" xmlns:cx8="http://schemas.microsoft.com/office/drawing/2016/5/14/chartex" xmlns:mc="http://schemas.openxmlformats.org/markup-compatibility/2006" xmlns:aink="http://schemas.microsoft.com/office/drawing/2016/ink" xmlns:am3d="http://schemas.microsoft.com/office/drawing/2017/model3d" xmlns:o="urn:schemas-microsoft-com:office:office" xmlns:oel="http://schemas.microsoft.com/office/2019/extlst" xmlns:r="http://schemas.openxmlformats.org/officeDocument/2006/relationships" xmlns:m="http://schemas.openxmlformats.org/officeDocument/2006/math" xmlns:v="urn:schemas-microsoft-com:vml" xmlns:wp14="http://schemas.microsoft.com/office/word/2010/wordprocessingDrawing" xmlns:wp="http://schemas.openxmlformats.org/drawingml/2006/wordprocessingDrawing" xmlns:w10="urn:schemas-microsoft-com:office:word" xmlns:w="http://schemas.openxmlformats.org/wordprocessingml/2006/main" xmlns:w14="http://schemas.microsoft.com/office/word/2010/wordml" xmlns:w15="http://schemas.microsoft.com/office/word/2012/wordml" xmlns:w16cex="http://schemas.microsoft.com/office/word/2018/wordml/cex" xmlns:w16cid="http://schemas.microsoft.com/office/word/2016/wordml/cid" xmlns:w16="http://schemas.microsoft.com/office/word/2018/wordml" xmlns:w16sdtdh="http://schemas.microsoft.com/office/word/2020/wordml/sdtdatahash" xmlns:w16se="http://schemas.microsoft.com/office/word/2015/wordml/symex" xmlns:wpg="http://schemas.microsoft.com/office/word/2010/wordprocessingGroup" xmlns:wpi="http://schemas.microsoft.com/office/word/2010/wordprocessingInk" xmlns:wne="http://schemas.microsoft.com/office/word/2006/wordml" xmlns:wps="http://schemas.microsoft.com/office/word/2010/wordprocessingShape" mc:Ignorable="w14 w15 w16se w16cid w16 w16cex w16sdtdh wp14">
+<w:hdr xmlns:wpc="http://schemas.microsoft.com/office/word/2010/wordprocessingCanvas" xmlns:cx="http://schemas.microsoft.com/office/drawing/2014/chartex" xmlns:cx1="http://schemas.microsoft.com/office/drawing/2015/9/8/chartex" xmlns:cx2="http://schemas.microsoft.com/office/drawing/2015/10/21/chartex" xmlns:cx3="http://schemas.microsoft.com/office/drawing/2016/5/9/chartex" xmlns:cx4="http://schemas.microsoft.com/office/drawing/2016/5/10/chartex" xmlns:cx5="http://schemas.microsoft.com/office/drawing/2016/5/11/chartex" xmlns:cx6="http://schemas.microsoft.com/office/drawing/2016/5/12/chartex" xmlns:cx7="http://schemas.microsoft.com/office/drawing/2016/5/13/chartex" xmlns:cx8="http://schemas.microsoft.com/office/drawing/2016/5/14/chartex" xmlns:mc="http://schemas.openxmlformats.org/markup-compatibility/2006" xmlns:aink="http://schemas.microsoft.com/office/drawing/2016/ink" xmlns:am3d="http://schemas.microsoft.com/office/drawing/2017/model3d" xmlns:o="urn:schemas-microsoft-com:office:office" xmlns:oel="http://schemas.microsoft.com/office/2019/extlst" xmlns:r="http://schemas.openxmlformats.org/officeDocument/2006/relationships" xmlns:m="http://schemas.openxmlformats.org/officeDocument/2006/math" xmlns:v="urn:schemas-microsoft-com:vml" xmlns:wp14="http://schemas.microsoft.com/office/word/2010/wordprocessingDrawing" xmlns:wp="http://schemas.openxmlformats.org/drawingml/2006/wordprocessingDrawing" xmlns:w10="urn:schemas-microsoft-com:office:word" xmlns:w="http://schemas.openxmlformats.org/wordprocessingml/2006/main" xmlns:w14="http://schemas.microsoft.com/office/word/2010/wordml" xmlns:w15="http://schemas.microsoft.com/office/word/2012/wordml" xmlns:w16cex="http://schemas.microsoft.com/office/word/2018/wordml/cex" xmlns:w16cid="http://schemas.microsoft.com/office/word/2016/wordml/cid" xmlns:w16="http://schemas.microsoft.com/office/word/2018/wordml" xmlns:w16du="http://schemas.microsoft.com/office/word/2023/wordml/word16du" xmlns:w16sdtdh="http://schemas.microsoft.com/office/word/2020/wordml/sdtdatahash" xmlns:w16sdtfl="http://schemas.microsoft.com/office/word/2024/wordml/sdtformatlock" xmlns:w16se="http://schemas.microsoft.com/office/word/2015/wordml/symex" xmlns:wpg="http://schemas.microsoft.com/office/word/2010/wordprocessingGroup" xmlns:wpi="http://schemas.microsoft.com/office/word/2010/wordprocessingInk" xmlns:wne="http://schemas.microsoft.com/office/word/2006/wordml" xmlns:wps="http://schemas.microsoft.com/office/word/2010/wordprocessingShape" mc:Ignorable="w14 w15 w16se w16cid w16 w16cex w16sdtdh w16sdtfl w16du wp14">
   <w:p>
     <w:pPr>
       <w:pStyle w:val="Header"/>
@@ -17271,7 +16768,7 @@
 </file>
 
 <file path=word/numbering.xml><?xml version="1.0" encoding="utf-8"?>
-<w:numbering xmlns:wpc="http://schemas.microsoft.com/office/word/2010/wordprocessingCanvas" xmlns:cx="http://schemas.microsoft.com/office/drawing/2014/chartex" xmlns:cx1="http://schemas.microsoft.com/office/drawing/2015/9/8/chartex" xmlns:cx2="http://schemas.microsoft.com/office/drawing/2015/10/21/chartex" xmlns:cx3="http://schemas.microsoft.com/office/drawing/2016/5/9/chartex" xmlns:cx4="http://schemas.microsoft.com/office/drawing/2016/5/10/chartex" xmlns:cx5="http://schemas.microsoft.com/office/drawing/2016/5/11/chartex" xmlns:cx6="http://schemas.microsoft.com/office/drawing/2016/5/12/chartex" xmlns:cx7="http://schemas.microsoft.com/office/drawing/2016/5/13/chartex" xmlns:cx8="http://schemas.microsoft.com/office/drawing/2016/5/14/chartex" xmlns:mc="http://schemas.openxmlformats.org/markup-compatibility/2006" xmlns:aink="http://schemas.microsoft.com/office/drawing/2016/ink" xmlns:am3d="http://schemas.microsoft.com/office/drawing/2017/model3d" xmlns:o="urn:schemas-microsoft-com:office:office" xmlns:oel="http://schemas.microsoft.com/office/2019/extlst" xmlns:r="http://schemas.openxmlformats.org/officeDocument/2006/relationships" xmlns:m="http://schemas.openxmlformats.org/officeDocument/2006/math" xmlns:v="urn:schemas-microsoft-com:vml" xmlns:wp14="http://schemas.microsoft.com/office/word/2010/wordprocessingDrawing" xmlns:wp="http://schemas.openxmlformats.org/drawingml/2006/wordprocessingDrawing" xmlns:w10="urn:schemas-microsoft-com:office:word" xmlns:w="http://schemas.openxmlformats.org/wordprocessingml/2006/main" xmlns:w14="http://schemas.microsoft.com/office/word/2010/wordml" xmlns:w15="http://schemas.microsoft.com/office/word/2012/wordml" xmlns:w16cex="http://schemas.microsoft.com/office/word/2018/wordml/cex" xmlns:w16cid="http://schemas.microsoft.com/office/word/2016/wordml/cid" xmlns:w16="http://schemas.microsoft.com/office/word/2018/wordml" xmlns:w16sdtdh="http://schemas.microsoft.com/office/word/2020/wordml/sdtdatahash" xmlns:w16se="http://schemas.microsoft.com/office/word/2015/wordml/symex" xmlns:wpg="http://schemas.microsoft.com/office/word/2010/wordprocessingGroup" xmlns:wpi="http://schemas.microsoft.com/office/word/2010/wordprocessingInk" xmlns:wne="http://schemas.microsoft.com/office/word/2006/wordml" xmlns:wps="http://schemas.microsoft.com/office/word/2010/wordprocessingShape" mc:Ignorable="w14 w15 w16se w16cid w16 w16cex w16sdtdh wp14">
+<w:numbering xmlns:wpc="http://schemas.microsoft.com/office/word/2010/wordprocessingCanvas" xmlns:cx="http://schemas.microsoft.com/office/drawing/2014/chartex" xmlns:cx1="http://schemas.microsoft.com/office/drawing/2015/9/8/chartex" xmlns:cx2="http://schemas.microsoft.com/office/drawing/2015/10/21/chartex" xmlns:cx3="http://schemas.microsoft.com/office/drawing/2016/5/9/chartex" xmlns:cx4="http://schemas.microsoft.com/office/drawing/2016/5/10/chartex" xmlns:cx5="http://schemas.microsoft.com/office/drawing/2016/5/11/chartex" xmlns:cx6="http://schemas.microsoft.com/office/drawing/2016/5/12/chartex" xmlns:cx7="http://schemas.microsoft.com/office/drawing/2016/5/13/chartex" xmlns:cx8="http://schemas.microsoft.com/office/drawing/2016/5/14/chartex" xmlns:mc="http://schemas.openxmlformats.org/markup-compatibility/2006" xmlns:aink="http://schemas.microsoft.com/office/drawing/2016/ink" xmlns:am3d="http://schemas.microsoft.com/office/drawing/2017/model3d" xmlns:o="urn:schemas-microsoft-com:office:office" xmlns:oel="http://schemas.microsoft.com/office/2019/extlst" xmlns:r="http://schemas.openxmlformats.org/officeDocument/2006/relationships" xmlns:m="http://schemas.openxmlformats.org/officeDocument/2006/math" xmlns:v="urn:schemas-microsoft-com:vml" xmlns:wp14="http://schemas.microsoft.com/office/word/2010/wordprocessingDrawing" xmlns:wp="http://schemas.openxmlformats.org/drawingml/2006/wordprocessingDrawing" xmlns:w10="urn:schemas-microsoft-com:office:word" xmlns:w="http://schemas.openxmlformats.org/wordprocessingml/2006/main" xmlns:w14="http://schemas.microsoft.com/office/word/2010/wordml" xmlns:w15="http://schemas.microsoft.com/office/word/2012/wordml" xmlns:w16cex="http://schemas.microsoft.com/office/word/2018/wordml/cex" xmlns:w16cid="http://schemas.microsoft.com/office/word/2016/wordml/cid" xmlns:w16="http://schemas.microsoft.com/office/word/2018/wordml" xmlns:w16du="http://schemas.microsoft.com/office/word/2023/wordml/word16du" xmlns:w16sdtdh="http://schemas.microsoft.com/office/word/2020/wordml/sdtdatahash" xmlns:w16sdtfl="http://schemas.microsoft.com/office/word/2024/wordml/sdtformatlock" xmlns:w16se="http://schemas.microsoft.com/office/word/2015/wordml/symex" xmlns:wpg="http://schemas.microsoft.com/office/word/2010/wordprocessingGroup" xmlns:wpi="http://schemas.microsoft.com/office/word/2010/wordprocessingInk" xmlns:wne="http://schemas.microsoft.com/office/word/2006/wordml" xmlns:wps="http://schemas.microsoft.com/office/word/2010/wordprocessingShape" mc:Ignorable="w14 w15 w16se w16cid w16 w16cex w16sdtdh w16sdtfl w16du wp14">
   <w:abstractNum w:abstractNumId="0" w15:restartNumberingAfterBreak="0">
     <w:nsid w:val="00000001"/>
     <w:multiLevelType w:val="hybridMultilevel"/>
@@ -20884,7 +20381,7 @@
 </file>
 
 <file path=word/styles.xml><?xml version="1.0" encoding="utf-8"?>
-<w:styles xmlns:mc="http://schemas.openxmlformats.org/markup-compatibility/2006" xmlns:r="http://schemas.openxmlformats.org/officeDocument/2006/relationships" xmlns:w="http://schemas.openxmlformats.org/wordprocessingml/2006/main" xmlns:w14="http://schemas.microsoft.com/office/word/2010/wordml" xmlns:w15="http://schemas.microsoft.com/office/word/2012/wordml" xmlns:w16cex="http://schemas.microsoft.com/office/word/2018/wordml/cex" xmlns:w16cid="http://schemas.microsoft.com/office/word/2016/wordml/cid" xmlns:w16="http://schemas.microsoft.com/office/word/2018/wordml" xmlns:w16sdtdh="http://schemas.microsoft.com/office/word/2020/wordml/sdtdatahash" xmlns:w16se="http://schemas.microsoft.com/office/word/2015/wordml/symex" mc:Ignorable="w14 w15 w16se w16cid w16 w16cex w16sdtdh">
+<w:styles xmlns:mc="http://schemas.openxmlformats.org/markup-compatibility/2006" xmlns:r="http://schemas.openxmlformats.org/officeDocument/2006/relationships" xmlns:w="http://schemas.openxmlformats.org/wordprocessingml/2006/main" xmlns:w14="http://schemas.microsoft.com/office/word/2010/wordml" xmlns:w15="http://schemas.microsoft.com/office/word/2012/wordml" xmlns:w16cex="http://schemas.microsoft.com/office/word/2018/wordml/cex" xmlns:w16cid="http://schemas.microsoft.com/office/word/2016/wordml/cid" xmlns:w16="http://schemas.microsoft.com/office/word/2018/wordml" xmlns:w16du="http://schemas.microsoft.com/office/word/2023/wordml/word16du" xmlns:w16sdtdh="http://schemas.microsoft.com/office/word/2020/wordml/sdtdatahash" xmlns:w16sdtfl="http://schemas.microsoft.com/office/word/2024/wordml/sdtformatlock" xmlns:w16se="http://schemas.microsoft.com/office/word/2015/wordml/symex" mc:Ignorable="w14 w15 w16se w16cid w16 w16cex w16sdtdh w16sdtfl w16du">
   <w:docDefaults>
     <w:rPrDefault>
       <w:rPr>

</xml_diff>